<commit_message>
Titel added to df
</commit_message>
<xml_diff>
--- a/Stage Meise logbook.docx
+++ b/Stage Meise logbook.docx
@@ -133,16 +133,8 @@
               <w:rPr>
                 <w:lang w:val="en-BE"/>
               </w:rPr>
-              <w:t>30/06/</w:t>
+              <w:t>30/06/26  08:00</w:t>
             </w:r>
-            <w:proofErr w:type="gramStart"/>
-            <w:r>
-              <w:rPr>
-                <w:lang w:val="en-BE"/>
-              </w:rPr>
-              <w:t>26  08:00</w:t>
-            </w:r>
-            <w:proofErr w:type="gramEnd"/>
           </w:p>
         </w:tc>
         <w:tc>
@@ -503,7 +495,6 @@
           <w14:ligatures w14:val="none"/>
         </w:rPr>
       </w:pPr>
-      <w:proofErr w:type="gramStart"/>
       <w:r>
         <w:rPr>
           <w:rFonts w:ascii="Consolas" w:eastAsia="Times New Roman" w:hAnsi="Consolas" w:cs="Times New Roman"/>
@@ -514,20 +505,7 @@
           <w:lang w:eastAsia="nl-NL"/>
           <w14:ligatures w14:val="none"/>
         </w:rPr>
-        <w:t>handle</w:t>
-      </w:r>
-      <w:proofErr w:type="gramEnd"/>
-      <w:r>
-        <w:rPr>
-          <w:rFonts w:ascii="Consolas" w:eastAsia="Times New Roman" w:hAnsi="Consolas" w:cs="Times New Roman"/>
-          <w:color w:val="A5D6FF"/>
-          <w:kern w:val="0"/>
-          <w:sz w:val="21"/>
-          <w:szCs w:val="21"/>
-          <w:lang w:eastAsia="nl-NL"/>
-          <w14:ligatures w14:val="none"/>
-        </w:rPr>
-        <w:t xml:space="preserve"> = </w:t>
+        <w:t xml:space="preserve">handle = </w:t>
       </w:r>
       <w:proofErr w:type="spellStart"/>
       <w:r>
@@ -588,7 +566,6 @@
         <w:t xml:space="preserve">    </w:t>
       </w:r>
       <w:proofErr w:type="spellStart"/>
-      <w:proofErr w:type="gramStart"/>
       <w:r>
         <w:rPr>
           <w:rFonts w:ascii="Consolas" w:eastAsia="Times New Roman" w:hAnsi="Consolas" w:cs="Times New Roman"/>
@@ -602,7 +579,6 @@
         <w:t>db</w:t>
       </w:r>
       <w:proofErr w:type="spellEnd"/>
-      <w:proofErr w:type="gramEnd"/>
       <w:r>
         <w:rPr>
           <w:rFonts w:ascii="Consolas" w:eastAsia="Times New Roman" w:hAnsi="Consolas" w:cs="Times New Roman"/>
@@ -645,33 +621,7 @@
           <w:lang w:eastAsia="nl-NL"/>
           <w14:ligatures w14:val="none"/>
         </w:rPr>
-        <w:t xml:space="preserve">    </w:t>
-      </w:r>
-      <w:proofErr w:type="gramStart"/>
-      <w:r>
-        <w:rPr>
-          <w:rFonts w:ascii="Consolas" w:eastAsia="Times New Roman" w:hAnsi="Consolas" w:cs="Times New Roman"/>
-          <w:color w:val="A5D6FF"/>
-          <w:kern w:val="0"/>
-          <w:sz w:val="21"/>
-          <w:szCs w:val="21"/>
-          <w:lang w:eastAsia="nl-NL"/>
-          <w14:ligatures w14:val="none"/>
-        </w:rPr>
-        <w:t>term</w:t>
-      </w:r>
-      <w:proofErr w:type="gramEnd"/>
-      <w:r>
-        <w:rPr>
-          <w:rFonts w:ascii="Consolas" w:eastAsia="Times New Roman" w:hAnsi="Consolas" w:cs="Times New Roman"/>
-          <w:color w:val="A5D6FF"/>
-          <w:kern w:val="0"/>
-          <w:sz w:val="21"/>
-          <w:szCs w:val="21"/>
-          <w:lang w:eastAsia="nl-NL"/>
-          <w14:ligatures w14:val="none"/>
-        </w:rPr>
-        <w:t>="</w:t>
+        <w:t>    term="</w:t>
       </w:r>
       <w:proofErr w:type="spellStart"/>
       <w:r>
@@ -758,7 +708,6 @@
         <w:t xml:space="preserve">    </w:t>
       </w:r>
       <w:proofErr w:type="spellStart"/>
-      <w:proofErr w:type="gramStart"/>
       <w:r>
         <w:rPr>
           <w:rFonts w:ascii="Consolas" w:eastAsia="Times New Roman" w:hAnsi="Consolas" w:cs="Times New Roman"/>
@@ -772,7 +721,6 @@
         <w:t>retmax</w:t>
       </w:r>
       <w:proofErr w:type="spellEnd"/>
-      <w:proofErr w:type="gramEnd"/>
       <w:r>
         <w:rPr>
           <w:rFonts w:ascii="Consolas" w:eastAsia="Times New Roman" w:hAnsi="Consolas" w:cs="Times New Roman"/>
@@ -857,7 +805,6 @@
           <w14:ligatures w14:val="none"/>
         </w:rPr>
       </w:pPr>
-      <w:proofErr w:type="gramStart"/>
       <w:r>
         <w:rPr>
           <w:rFonts w:ascii="Consolas" w:eastAsia="Times New Roman" w:hAnsi="Consolas" w:cs="Times New Roman"/>
@@ -868,20 +815,7 @@
           <w:lang w:eastAsia="nl-NL"/>
           <w14:ligatures w14:val="none"/>
         </w:rPr>
-        <w:t>record</w:t>
-      </w:r>
-      <w:proofErr w:type="gramEnd"/>
-      <w:r>
-        <w:rPr>
-          <w:rFonts w:ascii="Consolas" w:eastAsia="Times New Roman" w:hAnsi="Consolas" w:cs="Times New Roman"/>
-          <w:color w:val="A5D6FF"/>
-          <w:kern w:val="0"/>
-          <w:sz w:val="21"/>
-          <w:szCs w:val="21"/>
-          <w:lang w:eastAsia="nl-NL"/>
-          <w14:ligatures w14:val="none"/>
-        </w:rPr>
-        <w:t xml:space="preserve"> = </w:t>
+        <w:t xml:space="preserve">record = </w:t>
       </w:r>
       <w:proofErr w:type="spellStart"/>
       <w:r>
@@ -930,7 +864,6 @@
         </w:rPr>
       </w:pPr>
       <w:proofErr w:type="spellStart"/>
-      <w:proofErr w:type="gramStart"/>
       <w:r>
         <w:rPr>
           <w:rFonts w:ascii="Consolas" w:eastAsia="Times New Roman" w:hAnsi="Consolas" w:cs="Times New Roman"/>
@@ -944,7 +877,6 @@
         <w:t>handle.close</w:t>
       </w:r>
       <w:proofErr w:type="spellEnd"/>
-      <w:proofErr w:type="gramEnd"/>
       <w:r>
         <w:rPr>
           <w:rFonts w:ascii="Consolas" w:eastAsia="Times New Roman" w:hAnsi="Consolas" w:cs="Times New Roman"/>
@@ -997,7 +929,6 @@
           <w14:ligatures w14:val="none"/>
         </w:rPr>
       </w:pPr>
-      <w:proofErr w:type="gramStart"/>
       <w:r>
         <w:rPr>
           <w:rFonts w:ascii="Consolas" w:eastAsia="Times New Roman" w:hAnsi="Consolas" w:cs="Times New Roman"/>
@@ -1008,20 +939,7 @@
           <w:lang w:eastAsia="nl-NL"/>
           <w14:ligatures w14:val="none"/>
         </w:rPr>
-        <w:t>print</w:t>
-      </w:r>
-      <w:proofErr w:type="gramEnd"/>
-      <w:r>
-        <w:rPr>
-          <w:rFonts w:ascii="Consolas" w:eastAsia="Times New Roman" w:hAnsi="Consolas" w:cs="Times New Roman"/>
-          <w:color w:val="A5D6FF"/>
-          <w:kern w:val="0"/>
-          <w:sz w:val="21"/>
-          <w:szCs w:val="21"/>
-          <w:lang w:eastAsia="nl-NL"/>
-          <w14:ligatures w14:val="none"/>
-        </w:rPr>
-        <w:t>(record)</w:t>
+        <w:t>print(record)</w:t>
       </w:r>
     </w:p>
     <w:p>
@@ -1120,22 +1038,260 @@
         <w:rPr>
           <w:lang w:val="en-BE"/>
         </w:rPr>
-        <w:t xml:space="preserve"> op subset </w:t>
-      </w:r>
-      <w:proofErr w:type="gramStart"/>
-      <w:r>
-        <w:rPr>
-          <w:lang w:val="en-BE"/>
-        </w:rPr>
-        <w:t>van</w:t>
-      </w:r>
-      <w:proofErr w:type="gramEnd"/>
-      <w:r>
-        <w:rPr>
-          <w:lang w:val="en-BE"/>
-        </w:rPr>
-        <w:t xml:space="preserve"> de data</w:t>
-      </w:r>
+        <w:t xml:space="preserve"> op subset van de data</w:t>
+      </w:r>
+      <w:r>
+        <w:rPr>
+          <w:lang w:val="en-BE"/>
+        </w:rPr>
+        <w:t xml:space="preserve"> </w:t>
+      </w:r>
+      <w:r>
+        <w:rPr>
+          <w:lang w:val="en-BE"/>
+        </w:rPr>
+        <w:sym w:font="Wingdings" w:char="F0E0"/>
+      </w:r>
+      <w:r>
+        <w:rPr>
+          <w:lang w:val="en-BE"/>
+        </w:rPr>
+        <w:t xml:space="preserve"> script </w:t>
+      </w:r>
+      <w:proofErr w:type="spellStart"/>
+      <w:r>
+        <w:rPr>
+          <w:lang w:val="en-BE"/>
+        </w:rPr>
+        <w:t>geeft</w:t>
+      </w:r>
+      <w:proofErr w:type="spellEnd"/>
+      <w:r>
+        <w:rPr>
+          <w:lang w:val="en-BE"/>
+        </w:rPr>
+        <w:t xml:space="preserve"> </w:t>
+      </w:r>
+      <w:proofErr w:type="spellStart"/>
+      <w:r>
+        <w:rPr>
+          <w:lang w:val="en-BE"/>
+        </w:rPr>
+        <w:t>accesie</w:t>
+      </w:r>
+      <w:proofErr w:type="spellEnd"/>
+      <w:r>
+        <w:rPr>
+          <w:lang w:val="en-BE"/>
+        </w:rPr>
+        <w:t xml:space="preserve"> numbers maar de </w:t>
+      </w:r>
+      <w:proofErr w:type="spellStart"/>
+      <w:r>
+        <w:rPr>
+          <w:lang w:val="en-BE"/>
+        </w:rPr>
+        <w:t>zoekterm</w:t>
+      </w:r>
+      <w:proofErr w:type="spellEnd"/>
+      <w:r>
+        <w:rPr>
+          <w:lang w:val="en-BE"/>
+        </w:rPr>
+        <w:t xml:space="preserve"> is </w:t>
+      </w:r>
+      <w:proofErr w:type="spellStart"/>
+      <w:r>
+        <w:rPr>
+          <w:lang w:val="en-BE"/>
+        </w:rPr>
+        <w:t>niet</w:t>
+      </w:r>
+      <w:proofErr w:type="spellEnd"/>
+      <w:r>
+        <w:rPr>
+          <w:lang w:val="en-BE"/>
+        </w:rPr>
+        <w:t xml:space="preserve"> </w:t>
+      </w:r>
+      <w:proofErr w:type="spellStart"/>
+      <w:r>
+        <w:rPr>
+          <w:lang w:val="en-BE"/>
+        </w:rPr>
+        <w:t>specefiek</w:t>
+      </w:r>
+      <w:proofErr w:type="spellEnd"/>
+      <w:r>
+        <w:rPr>
+          <w:lang w:val="en-BE"/>
+        </w:rPr>
+        <w:t xml:space="preserve"> </w:t>
+      </w:r>
+      <w:proofErr w:type="spellStart"/>
+      <w:r>
+        <w:rPr>
+          <w:lang w:val="en-BE"/>
+        </w:rPr>
+        <w:t>genoeg</w:t>
+      </w:r>
+      <w:proofErr w:type="spellEnd"/>
+      <w:r>
+        <w:rPr>
+          <w:lang w:val="en-BE"/>
+        </w:rPr>
+        <w:t xml:space="preserve">. </w:t>
+      </w:r>
+      <w:proofErr w:type="spellStart"/>
+      <w:r>
+        <w:rPr>
+          <w:lang w:val="en-BE"/>
+        </w:rPr>
+        <w:t>Proberen</w:t>
+      </w:r>
+      <w:proofErr w:type="spellEnd"/>
+      <w:r>
+        <w:rPr>
+          <w:lang w:val="en-BE"/>
+        </w:rPr>
+        <w:t xml:space="preserve"> van </w:t>
+      </w:r>
+      <w:proofErr w:type="spellStart"/>
+      <w:r>
+        <w:rPr>
+          <w:lang w:val="en-BE"/>
+        </w:rPr>
+        <w:t>zoeken</w:t>
+      </w:r>
+      <w:proofErr w:type="spellEnd"/>
+      <w:r>
+        <w:rPr>
+          <w:lang w:val="en-BE"/>
+        </w:rPr>
+        <w:t xml:space="preserve"> met </w:t>
+      </w:r>
+      <w:proofErr w:type="spellStart"/>
+      <w:r>
+        <w:rPr>
+          <w:lang w:val="en-BE"/>
+        </w:rPr>
+        <w:t>een</w:t>
+      </w:r>
+      <w:proofErr w:type="spellEnd"/>
+      <w:r>
+        <w:rPr>
+          <w:lang w:val="en-BE"/>
+        </w:rPr>
+        <w:t xml:space="preserve"> query met </w:t>
+      </w:r>
+      <w:proofErr w:type="spellStart"/>
+      <w:r>
+        <w:rPr>
+          <w:lang w:val="en-BE"/>
+        </w:rPr>
+        <w:t>verschillende</w:t>
+      </w:r>
+      <w:proofErr w:type="spellEnd"/>
+      <w:r>
+        <w:rPr>
+          <w:lang w:val="en-BE"/>
+        </w:rPr>
+        <w:t xml:space="preserve"> </w:t>
+      </w:r>
+      <w:proofErr w:type="spellStart"/>
+      <w:r>
+        <w:rPr>
+          <w:lang w:val="en-BE"/>
+        </w:rPr>
+        <w:t>zoektermen</w:t>
+      </w:r>
+      <w:proofErr w:type="spellEnd"/>
+    </w:p>
+    <w:p>
+      <w:pPr>
+        <w:ind w:left="1416"/>
+        <w:rPr>
+          <w:lang w:val="en-BE"/>
+        </w:rPr>
+      </w:pPr>
+      <w:proofErr w:type="spellStart"/>
+      <w:r>
+        <w:rPr>
+          <w:lang w:val="en-BE"/>
+        </w:rPr>
+        <w:t>Tietel</w:t>
+      </w:r>
+      <w:proofErr w:type="spellEnd"/>
+      <w:r>
+        <w:rPr>
+          <w:lang w:val="en-BE"/>
+        </w:rPr>
+        <w:t xml:space="preserve"> </w:t>
+      </w:r>
+      <w:proofErr w:type="spellStart"/>
+      <w:r>
+        <w:rPr>
+          <w:lang w:val="en-BE"/>
+        </w:rPr>
+        <w:t>toegevoed</w:t>
+      </w:r>
+      <w:proofErr w:type="spellEnd"/>
+      <w:r>
+        <w:rPr>
+          <w:lang w:val="en-BE"/>
+        </w:rPr>
+        <w:t xml:space="preserve"> per keyword om </w:t>
+      </w:r>
+      <w:proofErr w:type="spellStart"/>
+      <w:r>
+        <w:rPr>
+          <w:lang w:val="en-BE"/>
+        </w:rPr>
+        <w:t>overzicht</w:t>
+      </w:r>
+      <w:proofErr w:type="spellEnd"/>
+      <w:r>
+        <w:rPr>
+          <w:lang w:val="en-BE"/>
+        </w:rPr>
+        <w:t xml:space="preserve"> </w:t>
+      </w:r>
+      <w:proofErr w:type="spellStart"/>
+      <w:r>
+        <w:rPr>
+          <w:lang w:val="en-BE"/>
+        </w:rPr>
+        <w:t>te</w:t>
+      </w:r>
+      <w:proofErr w:type="spellEnd"/>
+      <w:r>
+        <w:rPr>
+          <w:lang w:val="en-BE"/>
+        </w:rPr>
+        <w:t xml:space="preserve">   </w:t>
+      </w:r>
+      <w:proofErr w:type="spellStart"/>
+      <w:r>
+        <w:rPr>
+          <w:lang w:val="en-BE"/>
+        </w:rPr>
+        <w:t>geven</w:t>
+      </w:r>
+      <w:proofErr w:type="spellEnd"/>
+      <w:r>
+        <w:rPr>
+          <w:lang w:val="en-BE"/>
+        </w:rPr>
+        <w:t xml:space="preserve"> van </w:t>
+      </w:r>
+      <w:proofErr w:type="spellStart"/>
+      <w:r>
+        <w:rPr>
+          <w:lang w:val="en-BE"/>
+        </w:rPr>
+        <w:t>vershillen</w:t>
+      </w:r>
+      <w:proofErr w:type="spellEnd"/>
     </w:p>
     <w:sectPr>
       <w:pgSz w:w="11906" w:h="16838"/>

</xml_diff>

<commit_message>
made multyple jobs at once for faster woring
</commit_message>
<xml_diff>
--- a/Stage Meise logbook.docx
+++ b/Stage Meise logbook.docx
@@ -58,61 +58,11 @@
                 <w:lang w:val="en-BE"/>
               </w:rPr>
             </w:pPr>
-            <w:proofErr w:type="spellStart"/>
             <w:r>
               <w:rPr>
                 <w:lang w:val="en-BE"/>
               </w:rPr>
-              <w:t>Ronlijdeing</w:t>
-            </w:r>
-            <w:proofErr w:type="spellEnd"/>
-            <w:r>
-              <w:rPr>
-                <w:lang w:val="en-BE"/>
-              </w:rPr>
-              <w:t xml:space="preserve"> </w:t>
-            </w:r>
-            <w:proofErr w:type="spellStart"/>
-            <w:r>
-              <w:rPr>
-                <w:lang w:val="en-BE"/>
-              </w:rPr>
-              <w:t>en</w:t>
-            </w:r>
-            <w:proofErr w:type="spellEnd"/>
-            <w:r>
-              <w:rPr>
-                <w:lang w:val="en-BE"/>
-              </w:rPr>
-              <w:t xml:space="preserve"> </w:t>
-            </w:r>
-            <w:proofErr w:type="spellStart"/>
-            <w:r>
-              <w:rPr>
-                <w:lang w:val="en-BE"/>
-              </w:rPr>
-              <w:t>introductie</w:t>
-            </w:r>
-            <w:proofErr w:type="spellEnd"/>
-            <w:r>
-              <w:rPr>
-                <w:lang w:val="en-BE"/>
-              </w:rPr>
-              <w:t xml:space="preserve">, </w:t>
-            </w:r>
-            <w:proofErr w:type="spellStart"/>
-            <w:r>
-              <w:rPr>
-                <w:lang w:val="en-BE"/>
-              </w:rPr>
-              <w:t>uitleg</w:t>
-            </w:r>
-            <w:proofErr w:type="spellEnd"/>
-            <w:r>
-              <w:rPr>
-                <w:lang w:val="en-BE"/>
-              </w:rPr>
-              <w:t xml:space="preserve"> over de stage.</w:t>
+              <w:t>Ronlijdeing en introductie, uitleg over de stage.</w:t>
             </w:r>
           </w:p>
         </w:tc>
@@ -291,61 +241,17 @@
           <w:lang w:val="en-BE"/>
         </w:rPr>
       </w:pPr>
-      <w:proofErr w:type="spellStart"/>
-      <w:r>
-        <w:rPr>
-          <w:lang w:val="en-BE"/>
-        </w:rPr>
-        <w:t>Floralijst</w:t>
-      </w:r>
-      <w:proofErr w:type="spellEnd"/>
-      <w:r>
-        <w:rPr>
-          <w:lang w:val="en-BE"/>
-        </w:rPr>
-        <w:t xml:space="preserve"> </w:t>
-      </w:r>
-      <w:proofErr w:type="spellStart"/>
-      <w:r>
-        <w:rPr>
-          <w:lang w:val="en-BE"/>
-        </w:rPr>
-        <w:t>filteren</w:t>
-      </w:r>
-      <w:proofErr w:type="spellEnd"/>
-      <w:r>
-        <w:rPr>
-          <w:lang w:val="en-BE"/>
-        </w:rPr>
-        <w:t xml:space="preserve"> </w:t>
-      </w:r>
-      <w:proofErr w:type="spellStart"/>
-      <w:r>
-        <w:rPr>
-          <w:lang w:val="en-BE"/>
-        </w:rPr>
-        <w:t>en</w:t>
-      </w:r>
-      <w:proofErr w:type="spellEnd"/>
-      <w:r>
-        <w:rPr>
-          <w:lang w:val="en-BE"/>
-        </w:rPr>
-        <w:t xml:space="preserve"> </w:t>
-      </w:r>
-      <w:proofErr w:type="spellStart"/>
-      <w:r>
-        <w:rPr>
-          <w:lang w:val="en-BE"/>
-        </w:rPr>
-        <w:t>verwerken</w:t>
-      </w:r>
-      <w:proofErr w:type="spellEnd"/>
-      <w:r>
-        <w:rPr>
-          <w:lang w:val="en-BE"/>
-        </w:rPr>
-        <w:t xml:space="preserve">. (R) </w:t>
+      <w:r>
+        <w:rPr>
+          <w:lang w:val="en-BE"/>
+        </w:rPr>
+        <w:t xml:space="preserve">Floralijst </w:t>
+      </w:r>
+      <w:r>
+        <w:rPr>
+          <w:lang w:val="en-BE"/>
+        </w:rPr>
+        <w:t xml:space="preserve">filteren en verwerken. (R) </w:t>
       </w:r>
     </w:p>
     <w:p>
@@ -363,21 +269,7 @@
         <w:rPr>
           <w:lang w:val="en-BE"/>
         </w:rPr>
-        <w:t xml:space="preserve">Script </w:t>
-      </w:r>
-      <w:proofErr w:type="spellStart"/>
-      <w:r>
-        <w:rPr>
-          <w:lang w:val="en-BE"/>
-        </w:rPr>
-        <w:t>voor</w:t>
-      </w:r>
-      <w:proofErr w:type="spellEnd"/>
-      <w:r>
-        <w:rPr>
-          <w:lang w:val="en-BE"/>
-        </w:rPr>
-        <w:t xml:space="preserve"> ID </w:t>
+        <w:t xml:space="preserve">Script voor ID </w:t>
       </w:r>
     </w:p>
     <w:p>
@@ -391,19 +283,11 @@
           <w:lang w:val="en-BE"/>
         </w:rPr>
       </w:pPr>
-      <w:proofErr w:type="spellStart"/>
-      <w:r>
-        <w:rPr>
-          <w:lang w:val="en-BE"/>
-        </w:rPr>
-        <w:t>Eerste</w:t>
-      </w:r>
-      <w:proofErr w:type="spellEnd"/>
-      <w:r>
-        <w:rPr>
-          <w:lang w:val="en-BE"/>
-        </w:rPr>
-        <w:t xml:space="preserve"> run van script output: </w:t>
+      <w:r>
+        <w:rPr>
+          <w:lang w:val="en-BE"/>
+        </w:rPr>
+        <w:t xml:space="preserve">Eerste run van script output: </w:t>
       </w:r>
       <w:r>
         <w:rPr>
@@ -427,21 +311,7 @@
         <w:rPr>
           <w:lang w:val="en-BE"/>
         </w:rPr>
-        <w:t xml:space="preserve"> </w:t>
-      </w:r>
-      <w:proofErr w:type="spellStart"/>
-      <w:r>
-        <w:rPr>
-          <w:lang w:val="en-BE"/>
-        </w:rPr>
-        <w:t>testen</w:t>
-      </w:r>
-      <w:proofErr w:type="spellEnd"/>
-      <w:r>
-        <w:rPr>
-          <w:lang w:val="en-BE"/>
-        </w:rPr>
-        <w:t xml:space="preserve"> met 1 search term </w:t>
+        <w:t xml:space="preserve"> testen met 1 search term </w:t>
       </w:r>
     </w:p>
     <w:p>
@@ -505,9 +375,28 @@
           <w:lang w:eastAsia="nl-NL"/>
           <w14:ligatures w14:val="none"/>
         </w:rPr>
-        <w:t xml:space="preserve">handle = </w:t>
-      </w:r>
-      <w:proofErr w:type="spellStart"/>
+        <w:t>handle = Entrez.esearch(</w:t>
+      </w:r>
+    </w:p>
+    <w:p>
+      <w:pPr>
+        <w:pStyle w:val="Lijstalinea"/>
+        <w:numPr>
+          <w:ilvl w:val="0"/>
+          <w:numId w:val="1"/>
+        </w:numPr>
+        <w:shd w:val="clear" w:color="auto" w:fill="121314"/>
+        <w:spacing w:after="0" w:line="285" w:lineRule="atLeast"/>
+        <w:rPr>
+          <w:rFonts w:ascii="Consolas" w:eastAsia="Times New Roman" w:hAnsi="Consolas" w:cs="Times New Roman"/>
+          <w:color w:val="BBBEBF"/>
+          <w:kern w:val="0"/>
+          <w:sz w:val="21"/>
+          <w:szCs w:val="21"/>
+          <w:lang w:eastAsia="nl-NL"/>
+          <w14:ligatures w14:val="none"/>
+        </w:rPr>
+      </w:pPr>
       <w:r>
         <w:rPr>
           <w:rFonts w:ascii="Consolas" w:eastAsia="Times New Roman" w:hAnsi="Consolas" w:cs="Times New Roman"/>
@@ -518,9 +407,28 @@
           <w:lang w:eastAsia="nl-NL"/>
           <w14:ligatures w14:val="none"/>
         </w:rPr>
-        <w:t>Entrez.esearch</w:t>
-      </w:r>
-      <w:proofErr w:type="spellEnd"/>
+        <w:t>    db="nucleotide",</w:t>
+      </w:r>
+    </w:p>
+    <w:p>
+      <w:pPr>
+        <w:pStyle w:val="Lijstalinea"/>
+        <w:numPr>
+          <w:ilvl w:val="0"/>
+          <w:numId w:val="1"/>
+        </w:numPr>
+        <w:shd w:val="clear" w:color="auto" w:fill="121314"/>
+        <w:spacing w:after="0" w:line="285" w:lineRule="atLeast"/>
+        <w:rPr>
+          <w:rFonts w:ascii="Consolas" w:eastAsia="Times New Roman" w:hAnsi="Consolas" w:cs="Times New Roman"/>
+          <w:color w:val="BBBEBF"/>
+          <w:kern w:val="0"/>
+          <w:sz w:val="21"/>
+          <w:szCs w:val="21"/>
+          <w:lang w:eastAsia="nl-NL"/>
+          <w14:ligatures w14:val="none"/>
+        </w:rPr>
+      </w:pPr>
       <w:r>
         <w:rPr>
           <w:rFonts w:ascii="Consolas" w:eastAsia="Times New Roman" w:hAnsi="Consolas" w:cs="Times New Roman"/>
@@ -531,7 +439,7 @@
           <w:lang w:eastAsia="nl-NL"/>
           <w14:ligatures w14:val="none"/>
         </w:rPr>
-        <w:t>(</w:t>
+        <w:t>    term="Huperzia selago",</w:t>
       </w:r>
     </w:p>
     <w:p>
@@ -563,9 +471,28 @@
           <w:lang w:eastAsia="nl-NL"/>
           <w14:ligatures w14:val="none"/>
         </w:rPr>
-        <w:t xml:space="preserve">    </w:t>
-      </w:r>
-      <w:proofErr w:type="spellStart"/>
+        <w:t>    retmax=1</w:t>
+      </w:r>
+    </w:p>
+    <w:p>
+      <w:pPr>
+        <w:pStyle w:val="Lijstalinea"/>
+        <w:numPr>
+          <w:ilvl w:val="0"/>
+          <w:numId w:val="1"/>
+        </w:numPr>
+        <w:shd w:val="clear" w:color="auto" w:fill="121314"/>
+        <w:spacing w:after="0" w:line="285" w:lineRule="atLeast"/>
+        <w:rPr>
+          <w:rFonts w:ascii="Consolas" w:eastAsia="Times New Roman" w:hAnsi="Consolas" w:cs="Times New Roman"/>
+          <w:color w:val="BBBEBF"/>
+          <w:kern w:val="0"/>
+          <w:sz w:val="21"/>
+          <w:szCs w:val="21"/>
+          <w:lang w:eastAsia="nl-NL"/>
+          <w14:ligatures w14:val="none"/>
+        </w:rPr>
+      </w:pPr>
       <w:r>
         <w:rPr>
           <w:rFonts w:ascii="Consolas" w:eastAsia="Times New Roman" w:hAnsi="Consolas" w:cs="Times New Roman"/>
@@ -576,9 +503,48 @@
           <w:lang w:eastAsia="nl-NL"/>
           <w14:ligatures w14:val="none"/>
         </w:rPr>
-        <w:t>db</w:t>
-      </w:r>
-      <w:proofErr w:type="spellEnd"/>
+        <w:t>)</w:t>
+      </w:r>
+    </w:p>
+    <w:p>
+      <w:pPr>
+        <w:pStyle w:val="Lijstalinea"/>
+        <w:numPr>
+          <w:ilvl w:val="0"/>
+          <w:numId w:val="1"/>
+        </w:numPr>
+        <w:shd w:val="clear" w:color="auto" w:fill="121314"/>
+        <w:spacing w:after="0" w:line="285" w:lineRule="atLeast"/>
+        <w:rPr>
+          <w:rFonts w:ascii="Consolas" w:eastAsia="Times New Roman" w:hAnsi="Consolas" w:cs="Times New Roman"/>
+          <w:color w:val="BBBEBF"/>
+          <w:kern w:val="0"/>
+          <w:sz w:val="21"/>
+          <w:szCs w:val="21"/>
+          <w:lang w:eastAsia="nl-NL"/>
+          <w14:ligatures w14:val="none"/>
+        </w:rPr>
+      </w:pPr>
+    </w:p>
+    <w:p>
+      <w:pPr>
+        <w:pStyle w:val="Lijstalinea"/>
+        <w:numPr>
+          <w:ilvl w:val="0"/>
+          <w:numId w:val="1"/>
+        </w:numPr>
+        <w:shd w:val="clear" w:color="auto" w:fill="121314"/>
+        <w:spacing w:after="0" w:line="285" w:lineRule="atLeast"/>
+        <w:rPr>
+          <w:rFonts w:ascii="Consolas" w:eastAsia="Times New Roman" w:hAnsi="Consolas" w:cs="Times New Roman"/>
+          <w:color w:val="BBBEBF"/>
+          <w:kern w:val="0"/>
+          <w:sz w:val="21"/>
+          <w:szCs w:val="21"/>
+          <w:lang w:eastAsia="nl-NL"/>
+          <w14:ligatures w14:val="none"/>
+        </w:rPr>
+      </w:pPr>
       <w:r>
         <w:rPr>
           <w:rFonts w:ascii="Consolas" w:eastAsia="Times New Roman" w:hAnsi="Consolas" w:cs="Times New Roman"/>
@@ -589,7 +555,7 @@
           <w:lang w:eastAsia="nl-NL"/>
           <w14:ligatures w14:val="none"/>
         </w:rPr>
-        <w:t>="nucleotide",</w:t>
+        <w:t>record = Entrez.read(handle)</w:t>
       </w:r>
     </w:p>
     <w:p>
@@ -621,9 +587,48 @@
           <w:lang w:eastAsia="nl-NL"/>
           <w14:ligatures w14:val="none"/>
         </w:rPr>
-        <w:t>    term="</w:t>
-      </w:r>
-      <w:proofErr w:type="spellStart"/>
+        <w:t>handle.close()</w:t>
+      </w:r>
+    </w:p>
+    <w:p>
+      <w:pPr>
+        <w:pStyle w:val="Lijstalinea"/>
+        <w:numPr>
+          <w:ilvl w:val="0"/>
+          <w:numId w:val="1"/>
+        </w:numPr>
+        <w:shd w:val="clear" w:color="auto" w:fill="121314"/>
+        <w:spacing w:after="0" w:line="285" w:lineRule="atLeast"/>
+        <w:rPr>
+          <w:rFonts w:ascii="Consolas" w:eastAsia="Times New Roman" w:hAnsi="Consolas" w:cs="Times New Roman"/>
+          <w:color w:val="BBBEBF"/>
+          <w:kern w:val="0"/>
+          <w:sz w:val="21"/>
+          <w:szCs w:val="21"/>
+          <w:lang w:eastAsia="nl-NL"/>
+          <w14:ligatures w14:val="none"/>
+        </w:rPr>
+      </w:pPr>
+    </w:p>
+    <w:p>
+      <w:pPr>
+        <w:pStyle w:val="Lijstalinea"/>
+        <w:numPr>
+          <w:ilvl w:val="0"/>
+          <w:numId w:val="1"/>
+        </w:numPr>
+        <w:shd w:val="clear" w:color="auto" w:fill="121314"/>
+        <w:spacing w:after="0" w:line="285" w:lineRule="atLeast"/>
+        <w:rPr>
+          <w:rFonts w:ascii="Consolas" w:eastAsia="Times New Roman" w:hAnsi="Consolas" w:cs="Times New Roman"/>
+          <w:color w:val="BBBEBF"/>
+          <w:kern w:val="0"/>
+          <w:sz w:val="21"/>
+          <w:szCs w:val="21"/>
+          <w:lang w:eastAsia="nl-NL"/>
+          <w14:ligatures w14:val="none"/>
+        </w:rPr>
+      </w:pPr>
       <w:r>
         <w:rPr>
           <w:rFonts w:ascii="Consolas" w:eastAsia="Times New Roman" w:hAnsi="Consolas" w:cs="Times New Roman"/>
@@ -634,9 +639,48 @@
           <w:lang w:eastAsia="nl-NL"/>
           <w14:ligatures w14:val="none"/>
         </w:rPr>
-        <w:t>Huperzia</w:t>
-      </w:r>
-      <w:proofErr w:type="spellEnd"/>
+        <w:t>print(record)</w:t>
+      </w:r>
+    </w:p>
+    <w:p>
+      <w:pPr>
+        <w:pStyle w:val="Lijstalinea"/>
+        <w:numPr>
+          <w:ilvl w:val="0"/>
+          <w:numId w:val="1"/>
+        </w:numPr>
+        <w:shd w:val="clear" w:color="auto" w:fill="121314"/>
+        <w:spacing w:after="0" w:line="285" w:lineRule="atLeast"/>
+        <w:rPr>
+          <w:rFonts w:ascii="Consolas" w:eastAsia="Times New Roman" w:hAnsi="Consolas" w:cs="Times New Roman"/>
+          <w:color w:val="BBBEBF"/>
+          <w:kern w:val="0"/>
+          <w:sz w:val="21"/>
+          <w:szCs w:val="21"/>
+          <w:lang w:eastAsia="nl-NL"/>
+          <w14:ligatures w14:val="none"/>
+        </w:rPr>
+      </w:pPr>
+    </w:p>
+    <w:p>
+      <w:pPr>
+        <w:pStyle w:val="Lijstalinea"/>
+        <w:numPr>
+          <w:ilvl w:val="0"/>
+          <w:numId w:val="1"/>
+        </w:numPr>
+        <w:shd w:val="clear" w:color="auto" w:fill="121314"/>
+        <w:spacing w:after="0" w:line="285" w:lineRule="atLeast"/>
+        <w:rPr>
+          <w:rFonts w:ascii="Consolas" w:eastAsia="Times New Roman" w:hAnsi="Consolas" w:cs="Times New Roman"/>
+          <w:color w:val="BBBEBF"/>
+          <w:kern w:val="0"/>
+          <w:sz w:val="21"/>
+          <w:szCs w:val="21"/>
+          <w:lang w:eastAsia="nl-NL"/>
+          <w14:ligatures w14:val="none"/>
+        </w:rPr>
+      </w:pPr>
       <w:r>
         <w:rPr>
           <w:rFonts w:ascii="Consolas" w:eastAsia="Times New Roman" w:hAnsi="Consolas" w:cs="Times New Roman"/>
@@ -647,33 +691,151 @@
           <w:lang w:eastAsia="nl-NL"/>
           <w14:ligatures w14:val="none"/>
         </w:rPr>
+        <w:t>'''</w:t>
+      </w:r>
+    </w:p>
+    <w:p>
+      <w:pPr>
+        <w:ind w:left="1416"/>
+      </w:pPr>
+    </w:p>
+    <w:p>
+      <w:pPr>
+        <w:ind w:left="1416"/>
+        <w:rPr>
+          <w:lang w:val="en-BE"/>
+        </w:rPr>
+      </w:pPr>
+      <w:r>
+        <w:rPr>
+          <w:lang w:val="en-BE"/>
+        </w:rPr>
+        <w:t>1 search term werk, testen op subset van de data</w:t>
+      </w:r>
+      <w:r>
+        <w:rPr>
+          <w:lang w:val="en-BE"/>
+        </w:rPr>
         <w:t xml:space="preserve"> </w:t>
       </w:r>
-      <w:proofErr w:type="spellStart"/>
-      <w:r>
-        <w:rPr>
-          <w:rFonts w:ascii="Consolas" w:eastAsia="Times New Roman" w:hAnsi="Consolas" w:cs="Times New Roman"/>
-          <w:color w:val="A5D6FF"/>
-          <w:kern w:val="0"/>
-          <w:sz w:val="21"/>
-          <w:szCs w:val="21"/>
-          <w:lang w:eastAsia="nl-NL"/>
-          <w14:ligatures w14:val="none"/>
-        </w:rPr>
-        <w:t>selago</w:t>
-      </w:r>
-      <w:proofErr w:type="spellEnd"/>
-      <w:r>
-        <w:rPr>
-          <w:rFonts w:ascii="Consolas" w:eastAsia="Times New Roman" w:hAnsi="Consolas" w:cs="Times New Roman"/>
-          <w:color w:val="A5D6FF"/>
-          <w:kern w:val="0"/>
-          <w:sz w:val="21"/>
-          <w:szCs w:val="21"/>
-          <w:lang w:eastAsia="nl-NL"/>
-          <w14:ligatures w14:val="none"/>
-        </w:rPr>
-        <w:t>",</w:t>
+      <w:r>
+        <w:rPr>
+          <w:lang w:val="en-BE"/>
+        </w:rPr>
+        <w:sym w:font="Wingdings" w:char="F0E0"/>
+      </w:r>
+      <w:r>
+        <w:rPr>
+          <w:lang w:val="en-BE"/>
+        </w:rPr>
+        <w:t xml:space="preserve"> script geeft accesie numbers maar de zoekterm is niet specefiek genoeg. Proberen van zoeken met een query met verschillende zoektermen</w:t>
+      </w:r>
+    </w:p>
+    <w:p>
+      <w:pPr>
+        <w:ind w:left="1416"/>
+        <w:rPr>
+          <w:lang w:val="en-BE"/>
+        </w:rPr>
+      </w:pPr>
+      <w:r>
+        <w:rPr>
+          <w:lang w:val="en-BE"/>
+        </w:rPr>
+        <w:t>Tietel toegevoed per keyword om overzicht te   geven van vershillen</w:t>
+      </w:r>
+    </w:p>
+    <w:p>
+      <w:pPr>
+        <w:ind w:left="1416"/>
+        <w:rPr>
+          <w:lang w:val="en-BE"/>
+        </w:rPr>
+      </w:pPr>
+    </w:p>
+    <w:p>
+      <w:pPr>
+        <w:ind w:left="1416"/>
+        <w:rPr>
+          <w:lang w:val="en-BE"/>
+        </w:rPr>
+      </w:pPr>
+      <w:r>
+        <w:rPr>
+          <w:lang w:val="en-BE"/>
+        </w:rPr>
+        <w:t>Score system toegevoegd</w:t>
+      </w:r>
+    </w:p>
+    <w:p>
+      <w:pPr>
+        <w:ind w:left="1416"/>
+        <w:rPr>
+          <w:lang w:val="en-BE"/>
+        </w:rPr>
+      </w:pPr>
+      <w:r>
+        <w:rPr>
+          <w:lang w:val="en-BE"/>
+        </w:rPr>
+        <w:t>Gui ontwikellen (radio button werkt niet voor meerdere selecties)</w:t>
+      </w:r>
+    </w:p>
+    <w:p>
+      <w:pPr>
+        <w:ind w:left="1416"/>
+        <w:rPr>
+          <w:lang w:val="en-BE"/>
+        </w:rPr>
+      </w:pPr>
+      <w:r>
+        <w:rPr>
+          <w:lang w:val="en-BE"/>
+        </w:rPr>
+        <w:t>Code gebruikte placeholdertekst als input</w:t>
+      </w:r>
+    </w:p>
+    <w:p>
+      <w:pPr>
+        <w:ind w:left="1416"/>
+        <w:rPr>
+          <w:lang w:val="en-BE"/>
+        </w:rPr>
+      </w:pPr>
+      <w:r>
+        <w:rPr>
+          <w:lang w:val="en-BE"/>
+        </w:rPr>
+        <w:t>Progress bar toevoegen</w:t>
+      </w:r>
+    </w:p>
+    <w:p>
+      <w:pPr>
+        <w:ind w:left="1416"/>
+        <w:rPr>
+          <w:lang w:val="en-BE"/>
+        </w:rPr>
+      </w:pPr>
+      <w:r>
+        <w:rPr>
+          <w:lang w:val="en-BE"/>
+        </w:rPr>
+        <w:lastRenderedPageBreak/>
+        <w:t>Threading toepasen op script</w:t>
+      </w:r>
+    </w:p>
+    <w:p>
+      <w:pPr>
+        <w:ind w:left="1416"/>
+        <w:rPr>
+          <w:lang w:val="en-BE"/>
+        </w:rPr>
+      </w:pPr>
+      <w:r>
+        <w:rPr>
+          <w:lang w:val="en-BE"/>
+        </w:rPr>
+        <w:t>Code system standardizeren.</w:t>
       </w:r>
     </w:p>
     <w:p>
@@ -683,615 +845,296 @@
           <w:ilvl w:val="0"/>
           <w:numId w:val="1"/>
         </w:numPr>
-        <w:shd w:val="clear" w:color="auto" w:fill="121314"/>
-        <w:spacing w:after="0" w:line="285" w:lineRule="atLeast"/>
-        <w:rPr>
-          <w:rFonts w:ascii="Consolas" w:eastAsia="Times New Roman" w:hAnsi="Consolas" w:cs="Times New Roman"/>
-          <w:color w:val="BBBEBF"/>
-          <w:kern w:val="0"/>
-          <w:sz w:val="21"/>
-          <w:szCs w:val="21"/>
-          <w:lang w:eastAsia="nl-NL"/>
-          <w14:ligatures w14:val="none"/>
-        </w:rPr>
-      </w:pPr>
-      <w:r>
-        <w:rPr>
-          <w:rFonts w:ascii="Consolas" w:eastAsia="Times New Roman" w:hAnsi="Consolas" w:cs="Times New Roman"/>
-          <w:color w:val="A5D6FF"/>
-          <w:kern w:val="0"/>
-          <w:sz w:val="21"/>
-          <w:szCs w:val="21"/>
-          <w:lang w:eastAsia="nl-NL"/>
-          <w14:ligatures w14:val="none"/>
-        </w:rPr>
-        <w:t xml:space="preserve">    </w:t>
-      </w:r>
-      <w:proofErr w:type="spellStart"/>
-      <w:r>
-        <w:rPr>
-          <w:rFonts w:ascii="Consolas" w:eastAsia="Times New Roman" w:hAnsi="Consolas" w:cs="Times New Roman"/>
-          <w:color w:val="A5D6FF"/>
-          <w:kern w:val="0"/>
-          <w:sz w:val="21"/>
-          <w:szCs w:val="21"/>
-          <w:lang w:eastAsia="nl-NL"/>
-          <w14:ligatures w14:val="none"/>
-        </w:rPr>
-        <w:t>retmax</w:t>
-      </w:r>
-      <w:proofErr w:type="spellEnd"/>
-      <w:r>
-        <w:rPr>
-          <w:rFonts w:ascii="Consolas" w:eastAsia="Times New Roman" w:hAnsi="Consolas" w:cs="Times New Roman"/>
-          <w:color w:val="A5D6FF"/>
-          <w:kern w:val="0"/>
-          <w:sz w:val="21"/>
-          <w:szCs w:val="21"/>
-          <w:lang w:eastAsia="nl-NL"/>
-          <w14:ligatures w14:val="none"/>
-        </w:rPr>
-        <w:t>=1</w:t>
-      </w:r>
-    </w:p>
-    <w:p>
-      <w:pPr>
-        <w:pStyle w:val="Lijstalinea"/>
+        <w:rPr>
+          <w:lang w:val="en-BE"/>
+        </w:rPr>
+      </w:pPr>
+      <w:r>
+        <w:rPr>
+          <w:lang w:val="en-BE"/>
+        </w:rPr>
+        <w:t xml:space="preserve">BOLD </w:t>
+      </w:r>
+    </w:p>
+    <w:p>
+      <w:pPr>
+        <w:ind w:left="1416"/>
+        <w:rPr>
+          <w:lang w:val="en-US"/>
+        </w:rPr>
+      </w:pPr>
+      <w:r>
+        <w:rPr>
+          <w:lang w:val="en-US"/>
+        </w:rPr>
+        <w:t>Here's a breakdown of the main differences and the traps I had to work around:</w:t>
+      </w:r>
+    </w:p>
+    <w:p>
+      <w:pPr>
+        <w:ind w:left="1416"/>
+      </w:pPr>
+      <w:r>
+        <w:t>1. API shape is fundamentally different</w:t>
+      </w:r>
+    </w:p>
+    <w:p>
+      <w:pPr>
         <w:numPr>
           <w:ilvl w:val="0"/>
-          <w:numId w:val="1"/>
+          <w:numId w:val="2"/>
         </w:numPr>
-        <w:shd w:val="clear" w:color="auto" w:fill="121314"/>
-        <w:spacing w:after="0" w:line="285" w:lineRule="atLeast"/>
-        <w:rPr>
-          <w:rFonts w:ascii="Consolas" w:eastAsia="Times New Roman" w:hAnsi="Consolas" w:cs="Times New Roman"/>
-          <w:color w:val="BBBEBF"/>
-          <w:kern w:val="0"/>
-          <w:sz w:val="21"/>
-          <w:szCs w:val="21"/>
-          <w:lang w:eastAsia="nl-NL"/>
-          <w14:ligatures w14:val="none"/>
-        </w:rPr>
-      </w:pPr>
-      <w:r>
-        <w:rPr>
-          <w:rFonts w:ascii="Consolas" w:eastAsia="Times New Roman" w:hAnsi="Consolas" w:cs="Times New Roman"/>
-          <w:color w:val="A5D6FF"/>
-          <w:kern w:val="0"/>
-          <w:sz w:val="21"/>
-          <w:szCs w:val="21"/>
-          <w:lang w:eastAsia="nl-NL"/>
-          <w14:ligatures w14:val="none"/>
-        </w:rPr>
-        <w:t>)</w:t>
-      </w:r>
-    </w:p>
-    <w:p>
-      <w:pPr>
-        <w:pStyle w:val="Lijstalinea"/>
+        <w:rPr>
+          <w:lang w:val="en-US"/>
+        </w:rPr>
+      </w:pPr>
+      <w:r>
+        <w:rPr>
+          <w:lang w:val="en-US"/>
+        </w:rPr>
+        <w:t>NCBI Entrez is a 2-call pattern: esearch (get IDs) → efetch (get GenBank records), keyed by species+marker in one query.</w:t>
+      </w:r>
+    </w:p>
+    <w:p>
+      <w:pPr>
         <w:numPr>
           <w:ilvl w:val="0"/>
-          <w:numId w:val="1"/>
+          <w:numId w:val="2"/>
         </w:numPr>
-        <w:shd w:val="clear" w:color="auto" w:fill="121314"/>
-        <w:spacing w:after="0" w:line="285" w:lineRule="atLeast"/>
-        <w:rPr>
-          <w:rFonts w:ascii="Consolas" w:eastAsia="Times New Roman" w:hAnsi="Consolas" w:cs="Times New Roman"/>
-          <w:color w:val="BBBEBF"/>
-          <w:kern w:val="0"/>
-          <w:sz w:val="21"/>
-          <w:szCs w:val="21"/>
-          <w:lang w:eastAsia="nl-NL"/>
-          <w14:ligatures w14:val="none"/>
-        </w:rPr>
-      </w:pPr>
-    </w:p>
-    <w:p>
-      <w:pPr>
-        <w:pStyle w:val="Lijstalinea"/>
+        <w:rPr>
+          <w:lang w:val="en-US"/>
+        </w:rPr>
+      </w:pPr>
+      <w:r>
+        <w:rPr>
+          <w:lang w:val="en-US"/>
+        </w:rPr>
+        <w:t>BOLD v5 is a 3-step token flow: query/preprocessor (validate the term) → query (get a query_id) → documents/&lt;query_id&gt;/download (actually get data). You can't skip straight to fetching — you need that query_id first.</w:t>
+      </w:r>
+    </w:p>
+    <w:p>
+      <w:pPr>
+        <w:ind w:left="1416"/>
+        <w:rPr>
+          <w:lang w:val="en-US"/>
+        </w:rPr>
+      </w:pPr>
+      <w:r>
+        <w:rPr>
+          <w:lang w:val="en-US"/>
+        </w:rPr>
+        <w:t>2. No per-marker filtering server-side</w:t>
+      </w:r>
+      <w:r>
+        <w:rPr>
+          <w:lang w:val="en-US"/>
+        </w:rPr>
+        <w:br/>
+        <w:t>NCBI lets you put the marker directly in the search query ("species"[Organism] AND rbcL). BOLD has no marker scope — a species query returns records for </w:t>
+      </w:r>
+      <w:r>
+        <w:rPr>
+          <w:i/>
+          <w:iCs/>
+          <w:lang w:val="en-US"/>
+        </w:rPr>
+        <w:t>every</w:t>
+      </w:r>
+      <w:r>
+        <w:rPr>
+          <w:lang w:val="en-US"/>
+        </w:rPr>
+        <w:t> marker at once, and you filter by marker_code locally. I turned this into an advantage: fetch once per species, cache it, and reuse across all markers instead of hitting the API once per species-marker pair like the NCBI version does.</w:t>
+      </w:r>
+    </w:p>
+    <w:p>
+      <w:pPr>
+        <w:ind w:left="1416"/>
+        <w:rPr>
+          <w:lang w:val="en-US"/>
+        </w:rPr>
+      </w:pPr>
+      <w:r>
+        <w:rPr>
+          <w:lang w:val="en-US"/>
+        </w:rPr>
+        <w:t>3. Response format is JSONL, not XML/GenBank</w:t>
+      </w:r>
+      <w:r>
+        <w:rPr>
+          <w:lang w:val="en-US"/>
+        </w:rPr>
+        <w:br/>
+        <w:t>BOLD's download endpoint returns newline-delimited JSON, not a JSON array. If you json.loads() the whole response body you get a parse error — you have to split on newlines and parse each line individually. This isn't documented clearly anywhere; I only found it by hitting the live endpoint with curl.</w:t>
+      </w:r>
+    </w:p>
+    <w:p>
+      <w:pPr>
+        <w:ind w:left="1416"/>
+        <w:rPr>
+          <w:lang w:val="en-US"/>
+        </w:rPr>
+      </w:pPr>
+      <w:r>
+        <w:rPr>
+          <w:lang w:val="en-US"/>
+        </w:rPr>
+        <w:t>4. "Not found" isn't obvious</w:t>
+      </w:r>
+      <w:r>
+        <w:rPr>
+          <w:lang w:val="en-US"/>
+        </w:rPr>
+        <w:br/>
+        <w:t>NCBI's esearch clearly returns an empty IdList when nothing matches. BOLD's preprocessor step </w:t>
+      </w:r>
+      <w:r>
+        <w:rPr>
+          <w:i/>
+          <w:iCs/>
+          <w:lang w:val="en-US"/>
+        </w:rPr>
+        <w:t>always</w:t>
+      </w:r>
+      <w:r>
+        <w:rPr>
+          <w:lang w:val="en-US"/>
+        </w:rPr>
+        <w:t> returns a "successful" match — even garbage input like Zzznonexistentplantxyz gets silently reinterpreted as an ID search and produces a valid query_id. The actual "no data" signal only shows up as an empty response body at the final download step. Easy to miss and assume the request worked.</w:t>
+      </w:r>
+    </w:p>
+    <w:p>
+      <w:pPr>
+        <w:ind w:left="1416"/>
+        <w:rPr>
+          <w:lang w:val="en-US"/>
+        </w:rPr>
+      </w:pPr>
+      <w:r>
+        <w:rPr>
+          <w:lang w:val="en-US"/>
+        </w:rPr>
+        <w:t>5. Marker naming isn't consistent</w:t>
+      </w:r>
+      <w:r>
+        <w:rPr>
+          <w:lang w:val="en-US"/>
+        </w:rPr>
+        <w:br/>
+        <w:t>NCBI/GenBank convention writes psbA-trnH; BOLD stores the same marker as trnH-psbA (genes reversed). A naive string match would silently return zero hits for that marker. I had to write a normalizer that splits on -, lowercases, and sorts the parts before comparing.</w:t>
+      </w:r>
+    </w:p>
+    <w:p>
+      <w:pPr>
+        <w:ind w:left="1416"/>
+      </w:pPr>
+      <w:r>
+        <w:lastRenderedPageBreak/>
+        <w:t>6. Field mapping quirks</w:t>
+      </w:r>
+    </w:p>
+    <w:p>
+      <w:pPr>
         <w:numPr>
           <w:ilvl w:val="0"/>
-          <w:numId w:val="1"/>
+          <w:numId w:val="3"/>
         </w:numPr>
-        <w:shd w:val="clear" w:color="auto" w:fill="121314"/>
-        <w:spacing w:after="0" w:line="285" w:lineRule="atLeast"/>
-        <w:rPr>
-          <w:rFonts w:ascii="Consolas" w:eastAsia="Times New Roman" w:hAnsi="Consolas" w:cs="Times New Roman"/>
-          <w:color w:val="BBBEBF"/>
-          <w:kern w:val="0"/>
-          <w:sz w:val="21"/>
-          <w:szCs w:val="21"/>
-          <w:lang w:eastAsia="nl-NL"/>
-          <w14:ligatures w14:val="none"/>
-        </w:rPr>
-      </w:pPr>
-      <w:r>
-        <w:rPr>
-          <w:rFonts w:ascii="Consolas" w:eastAsia="Times New Roman" w:hAnsi="Consolas" w:cs="Times New Roman"/>
-          <w:color w:val="A5D6FF"/>
-          <w:kern w:val="0"/>
-          <w:sz w:val="21"/>
-          <w:szCs w:val="21"/>
-          <w:lang w:eastAsia="nl-NL"/>
-          <w14:ligatures w14:val="none"/>
-        </w:rPr>
-        <w:t xml:space="preserve">record = </w:t>
-      </w:r>
-      <w:proofErr w:type="spellStart"/>
-      <w:r>
-        <w:rPr>
-          <w:rFonts w:ascii="Consolas" w:eastAsia="Times New Roman" w:hAnsi="Consolas" w:cs="Times New Roman"/>
-          <w:color w:val="A5D6FF"/>
-          <w:kern w:val="0"/>
-          <w:sz w:val="21"/>
-          <w:szCs w:val="21"/>
-          <w:lang w:eastAsia="nl-NL"/>
-          <w14:ligatures w14:val="none"/>
-        </w:rPr>
-        <w:t>Entrez.read</w:t>
-      </w:r>
-      <w:proofErr w:type="spellEnd"/>
-      <w:r>
-        <w:rPr>
-          <w:rFonts w:ascii="Consolas" w:eastAsia="Times New Roman" w:hAnsi="Consolas" w:cs="Times New Roman"/>
-          <w:color w:val="A5D6FF"/>
-          <w:kern w:val="0"/>
-          <w:sz w:val="21"/>
-          <w:szCs w:val="21"/>
-          <w:lang w:eastAsia="nl-NL"/>
-          <w14:ligatures w14:val="none"/>
-        </w:rPr>
-        <w:t>(handle)</w:t>
-      </w:r>
-    </w:p>
-    <w:p>
-      <w:pPr>
-        <w:pStyle w:val="Lijstalinea"/>
+        <w:rPr>
+          <w:lang w:val="en-US"/>
+        </w:rPr>
+      </w:pPr>
+      <w:r>
+        <w:rPr>
+          <w:lang w:val="en-US"/>
+        </w:rPr>
+        <w:t>country/ocean — the literal JSON key contains a /, which is fine in Python dicts but easy to fumble with typos.</w:t>
+      </w:r>
+    </w:p>
+    <w:p>
+      <w:pPr>
         <w:numPr>
           <w:ilvl w:val="0"/>
-          <w:numId w:val="1"/>
+          <w:numId w:val="3"/>
         </w:numPr>
-        <w:shd w:val="clear" w:color="auto" w:fill="121314"/>
-        <w:spacing w:after="0" w:line="285" w:lineRule="atLeast"/>
-        <w:rPr>
-          <w:rFonts w:ascii="Consolas" w:eastAsia="Times New Roman" w:hAnsi="Consolas" w:cs="Times New Roman"/>
-          <w:color w:val="BBBEBF"/>
-          <w:kern w:val="0"/>
-          <w:sz w:val="21"/>
-          <w:szCs w:val="21"/>
-          <w:lang w:eastAsia="nl-NL"/>
-          <w14:ligatures w14:val="none"/>
-        </w:rPr>
-      </w:pPr>
-      <w:proofErr w:type="spellStart"/>
-      <w:r>
-        <w:rPr>
-          <w:rFonts w:ascii="Consolas" w:eastAsia="Times New Roman" w:hAnsi="Consolas" w:cs="Times New Roman"/>
-          <w:color w:val="A5D6FF"/>
-          <w:kern w:val="0"/>
-          <w:sz w:val="21"/>
-          <w:szCs w:val="21"/>
-          <w:lang w:eastAsia="nl-NL"/>
-          <w14:ligatures w14:val="none"/>
-        </w:rPr>
-        <w:t>handle.close</w:t>
-      </w:r>
-      <w:proofErr w:type="spellEnd"/>
-      <w:r>
-        <w:rPr>
-          <w:rFonts w:ascii="Consolas" w:eastAsia="Times New Roman" w:hAnsi="Consolas" w:cs="Times New Roman"/>
-          <w:color w:val="A5D6FF"/>
-          <w:kern w:val="0"/>
-          <w:sz w:val="21"/>
-          <w:szCs w:val="21"/>
-          <w:lang w:eastAsia="nl-NL"/>
-          <w14:ligatures w14:val="none"/>
-        </w:rPr>
-        <w:t>()</w:t>
-      </w:r>
-    </w:p>
-    <w:p>
-      <w:pPr>
-        <w:pStyle w:val="Lijstalinea"/>
+        <w:rPr>
+          <w:lang w:val="en-US"/>
+        </w:rPr>
+      </w:pPr>
+      <w:r>
+        <w:rPr>
+          <w:lang w:val="en-US"/>
+        </w:rPr>
+        <w:t>Coordinates come back as a [lat, lon] list (or null), not a formatted string like NCBI's lat_lon qualifier — needed manual formatting.</w:t>
+      </w:r>
+    </w:p>
+    <w:p>
+      <w:pPr>
         <w:numPr>
           <w:ilvl w:val="0"/>
-          <w:numId w:val="1"/>
+          <w:numId w:val="3"/>
         </w:numPr>
-        <w:shd w:val="clear" w:color="auto" w:fill="121314"/>
-        <w:spacing w:after="0" w:line="285" w:lineRule="atLeast"/>
-        <w:rPr>
-          <w:rFonts w:ascii="Consolas" w:eastAsia="Times New Roman" w:hAnsi="Consolas" w:cs="Times New Roman"/>
-          <w:color w:val="BBBEBF"/>
-          <w:kern w:val="0"/>
-          <w:sz w:val="21"/>
-          <w:szCs w:val="21"/>
-          <w:lang w:eastAsia="nl-NL"/>
-          <w14:ligatures w14:val="none"/>
-        </w:rPr>
-      </w:pPr>
-    </w:p>
-    <w:p>
-      <w:pPr>
-        <w:pStyle w:val="Lijstalinea"/>
+        <w:rPr>
+          <w:lang w:val="en-US"/>
+        </w:rPr>
+      </w:pPr>
+      <w:r>
+        <w:rPr>
+          <w:lang w:val="en-US"/>
+        </w:rPr>
+        <w:t>No direct "voucher" field — had to fall back through museumid → sampleid.</w:t>
+      </w:r>
+    </w:p>
+    <w:p>
+      <w:pPr>
         <w:numPr>
           <w:ilvl w:val="0"/>
-          <w:numId w:val="1"/>
+          <w:numId w:val="3"/>
         </w:numPr>
-        <w:shd w:val="clear" w:color="auto" w:fill="121314"/>
-        <w:spacing w:after="0" w:line="285" w:lineRule="atLeast"/>
-        <w:rPr>
-          <w:rFonts w:ascii="Consolas" w:eastAsia="Times New Roman" w:hAnsi="Consolas" w:cs="Times New Roman"/>
-          <w:color w:val="BBBEBF"/>
-          <w:kern w:val="0"/>
-          <w:sz w:val="21"/>
-          <w:szCs w:val="21"/>
-          <w:lang w:eastAsia="nl-NL"/>
-          <w14:ligatures w14:val="none"/>
-        </w:rPr>
-      </w:pPr>
-      <w:r>
-        <w:rPr>
-          <w:rFonts w:ascii="Consolas" w:eastAsia="Times New Roman" w:hAnsi="Consolas" w:cs="Times New Roman"/>
-          <w:color w:val="A5D6FF"/>
-          <w:kern w:val="0"/>
-          <w:sz w:val="21"/>
-          <w:szCs w:val="21"/>
-          <w:lang w:eastAsia="nl-NL"/>
-          <w14:ligatures w14:val="none"/>
-        </w:rPr>
-        <w:t>print(record)</w:t>
-      </w:r>
-    </w:p>
-    <w:p>
-      <w:pPr>
-        <w:pStyle w:val="Lijstalinea"/>
-        <w:numPr>
-          <w:ilvl w:val="0"/>
-          <w:numId w:val="1"/>
-        </w:numPr>
-        <w:shd w:val="clear" w:color="auto" w:fill="121314"/>
-        <w:spacing w:after="0" w:line="285" w:lineRule="atLeast"/>
-        <w:rPr>
-          <w:rFonts w:ascii="Consolas" w:eastAsia="Times New Roman" w:hAnsi="Consolas" w:cs="Times New Roman"/>
-          <w:color w:val="BBBEBF"/>
-          <w:kern w:val="0"/>
-          <w:sz w:val="21"/>
-          <w:szCs w:val="21"/>
-          <w:lang w:eastAsia="nl-NL"/>
-          <w14:ligatures w14:val="none"/>
-        </w:rPr>
-      </w:pPr>
-    </w:p>
-    <w:p>
-      <w:pPr>
-        <w:pStyle w:val="Lijstalinea"/>
-        <w:numPr>
-          <w:ilvl w:val="0"/>
-          <w:numId w:val="1"/>
-        </w:numPr>
-        <w:shd w:val="clear" w:color="auto" w:fill="121314"/>
-        <w:spacing w:after="0" w:line="285" w:lineRule="atLeast"/>
-        <w:rPr>
-          <w:rFonts w:ascii="Consolas" w:eastAsia="Times New Roman" w:hAnsi="Consolas" w:cs="Times New Roman"/>
-          <w:color w:val="BBBEBF"/>
-          <w:kern w:val="0"/>
-          <w:sz w:val="21"/>
-          <w:szCs w:val="21"/>
-          <w:lang w:eastAsia="nl-NL"/>
-          <w14:ligatures w14:val="none"/>
-        </w:rPr>
-      </w:pPr>
-      <w:r>
-        <w:rPr>
-          <w:rFonts w:ascii="Consolas" w:eastAsia="Times New Roman" w:hAnsi="Consolas" w:cs="Times New Roman"/>
-          <w:color w:val="A5D6FF"/>
-          <w:kern w:val="0"/>
-          <w:sz w:val="21"/>
-          <w:szCs w:val="21"/>
-          <w:lang w:eastAsia="nl-NL"/>
-          <w14:ligatures w14:val="none"/>
-        </w:rPr>
-        <w:t>'''</w:t>
+        <w:rPr>
+          <w:lang w:val="en-US"/>
+        </w:rPr>
+      </w:pPr>
+      <w:r>
+        <w:rPr>
+          <w:lang w:val="en-US"/>
+        </w:rPr>
+        <w:t>No API key/email needed (unlike Entrez), which is simpler, but also means no rate-limit headers to calibrate the sleep timer against.</w:t>
       </w:r>
     </w:p>
     <w:p>
       <w:pPr>
         <w:ind w:left="1416"/>
-      </w:pPr>
-    </w:p>
-    <w:p>
-      <w:pPr>
-        <w:ind w:left="1416"/>
-        <w:rPr>
-          <w:lang w:val="en-BE"/>
-        </w:rPr>
-      </w:pPr>
-      <w:r>
-        <w:rPr>
-          <w:lang w:val="en-BE"/>
-        </w:rPr>
-        <w:t xml:space="preserve">1 search term </w:t>
-      </w:r>
-      <w:proofErr w:type="spellStart"/>
-      <w:r>
-        <w:rPr>
-          <w:lang w:val="en-BE"/>
-        </w:rPr>
-        <w:t>werk</w:t>
-      </w:r>
-      <w:proofErr w:type="spellEnd"/>
-      <w:r>
-        <w:rPr>
-          <w:lang w:val="en-BE"/>
-        </w:rPr>
-        <w:t xml:space="preserve">, </w:t>
-      </w:r>
-      <w:proofErr w:type="spellStart"/>
-      <w:r>
-        <w:rPr>
-          <w:lang w:val="en-BE"/>
-        </w:rPr>
-        <w:t>testen</w:t>
-      </w:r>
-      <w:proofErr w:type="spellEnd"/>
-      <w:r>
-        <w:rPr>
-          <w:lang w:val="en-BE"/>
-        </w:rPr>
-        <w:t xml:space="preserve"> op subset van de data</w:t>
-      </w:r>
-      <w:r>
-        <w:rPr>
-          <w:lang w:val="en-BE"/>
-        </w:rPr>
-        <w:t xml:space="preserve"> </w:t>
-      </w:r>
-      <w:r>
-        <w:rPr>
-          <w:lang w:val="en-BE"/>
-        </w:rPr>
-        <w:sym w:font="Wingdings" w:char="F0E0"/>
-      </w:r>
-      <w:r>
-        <w:rPr>
-          <w:lang w:val="en-BE"/>
-        </w:rPr>
-        <w:t xml:space="preserve"> script </w:t>
-      </w:r>
-      <w:proofErr w:type="spellStart"/>
-      <w:r>
-        <w:rPr>
-          <w:lang w:val="en-BE"/>
-        </w:rPr>
-        <w:t>geeft</w:t>
-      </w:r>
-      <w:proofErr w:type="spellEnd"/>
-      <w:r>
-        <w:rPr>
-          <w:lang w:val="en-BE"/>
-        </w:rPr>
-        <w:t xml:space="preserve"> </w:t>
-      </w:r>
-      <w:proofErr w:type="spellStart"/>
-      <w:r>
-        <w:rPr>
-          <w:lang w:val="en-BE"/>
-        </w:rPr>
-        <w:t>accesie</w:t>
-      </w:r>
-      <w:proofErr w:type="spellEnd"/>
-      <w:r>
-        <w:rPr>
-          <w:lang w:val="en-BE"/>
-        </w:rPr>
-        <w:t xml:space="preserve"> numbers maar de </w:t>
-      </w:r>
-      <w:proofErr w:type="spellStart"/>
-      <w:r>
-        <w:rPr>
-          <w:lang w:val="en-BE"/>
-        </w:rPr>
-        <w:t>zoekterm</w:t>
-      </w:r>
-      <w:proofErr w:type="spellEnd"/>
-      <w:r>
-        <w:rPr>
-          <w:lang w:val="en-BE"/>
-        </w:rPr>
-        <w:t xml:space="preserve"> is </w:t>
-      </w:r>
-      <w:proofErr w:type="spellStart"/>
-      <w:r>
-        <w:rPr>
-          <w:lang w:val="en-BE"/>
-        </w:rPr>
-        <w:t>niet</w:t>
-      </w:r>
-      <w:proofErr w:type="spellEnd"/>
-      <w:r>
-        <w:rPr>
-          <w:lang w:val="en-BE"/>
-        </w:rPr>
-        <w:t xml:space="preserve"> </w:t>
-      </w:r>
-      <w:proofErr w:type="spellStart"/>
-      <w:r>
-        <w:rPr>
-          <w:lang w:val="en-BE"/>
-        </w:rPr>
-        <w:t>specefiek</w:t>
-      </w:r>
-      <w:proofErr w:type="spellEnd"/>
-      <w:r>
-        <w:rPr>
-          <w:lang w:val="en-BE"/>
-        </w:rPr>
-        <w:t xml:space="preserve"> </w:t>
-      </w:r>
-      <w:proofErr w:type="spellStart"/>
-      <w:r>
-        <w:rPr>
-          <w:lang w:val="en-BE"/>
-        </w:rPr>
-        <w:t>genoeg</w:t>
-      </w:r>
-      <w:proofErr w:type="spellEnd"/>
-      <w:r>
-        <w:rPr>
-          <w:lang w:val="en-BE"/>
-        </w:rPr>
-        <w:t xml:space="preserve">. </w:t>
-      </w:r>
-      <w:proofErr w:type="spellStart"/>
-      <w:r>
-        <w:rPr>
-          <w:lang w:val="en-BE"/>
-        </w:rPr>
-        <w:t>Proberen</w:t>
-      </w:r>
-      <w:proofErr w:type="spellEnd"/>
-      <w:r>
-        <w:rPr>
-          <w:lang w:val="en-BE"/>
-        </w:rPr>
-        <w:t xml:space="preserve"> van </w:t>
-      </w:r>
-      <w:proofErr w:type="spellStart"/>
-      <w:r>
-        <w:rPr>
-          <w:lang w:val="en-BE"/>
-        </w:rPr>
-        <w:t>zoeken</w:t>
-      </w:r>
-      <w:proofErr w:type="spellEnd"/>
-      <w:r>
-        <w:rPr>
-          <w:lang w:val="en-BE"/>
-        </w:rPr>
-        <w:t xml:space="preserve"> met </w:t>
-      </w:r>
-      <w:proofErr w:type="spellStart"/>
-      <w:r>
-        <w:rPr>
-          <w:lang w:val="en-BE"/>
-        </w:rPr>
-        <w:t>een</w:t>
-      </w:r>
-      <w:proofErr w:type="spellEnd"/>
-      <w:r>
-        <w:rPr>
-          <w:lang w:val="en-BE"/>
-        </w:rPr>
-        <w:t xml:space="preserve"> query met </w:t>
-      </w:r>
-      <w:proofErr w:type="spellStart"/>
-      <w:r>
-        <w:rPr>
-          <w:lang w:val="en-BE"/>
-        </w:rPr>
-        <w:t>verschillende</w:t>
-      </w:r>
-      <w:proofErr w:type="spellEnd"/>
-      <w:r>
-        <w:rPr>
-          <w:lang w:val="en-BE"/>
-        </w:rPr>
-        <w:t xml:space="preserve"> </w:t>
-      </w:r>
-      <w:proofErr w:type="spellStart"/>
-      <w:r>
-        <w:rPr>
-          <w:lang w:val="en-BE"/>
-        </w:rPr>
-        <w:t>zoektermen</w:t>
-      </w:r>
-      <w:proofErr w:type="spellEnd"/>
-    </w:p>
-    <w:p>
-      <w:pPr>
-        <w:ind w:left="1416"/>
-        <w:rPr>
-          <w:lang w:val="en-BE"/>
-        </w:rPr>
-      </w:pPr>
-      <w:proofErr w:type="spellStart"/>
-      <w:r>
-        <w:rPr>
-          <w:lang w:val="en-BE"/>
-        </w:rPr>
-        <w:t>Tietel</w:t>
-      </w:r>
-      <w:proofErr w:type="spellEnd"/>
-      <w:r>
-        <w:rPr>
-          <w:lang w:val="en-BE"/>
-        </w:rPr>
-        <w:t xml:space="preserve"> </w:t>
-      </w:r>
-      <w:proofErr w:type="spellStart"/>
-      <w:r>
-        <w:rPr>
-          <w:lang w:val="en-BE"/>
-        </w:rPr>
-        <w:t>toegevoed</w:t>
-      </w:r>
-      <w:proofErr w:type="spellEnd"/>
-      <w:r>
-        <w:rPr>
-          <w:lang w:val="en-BE"/>
-        </w:rPr>
-        <w:t xml:space="preserve"> per keyword om </w:t>
-      </w:r>
-      <w:proofErr w:type="spellStart"/>
-      <w:r>
-        <w:rPr>
-          <w:lang w:val="en-BE"/>
-        </w:rPr>
-        <w:t>overzicht</w:t>
-      </w:r>
-      <w:proofErr w:type="spellEnd"/>
-      <w:r>
-        <w:rPr>
-          <w:lang w:val="en-BE"/>
-        </w:rPr>
-        <w:t xml:space="preserve"> </w:t>
-      </w:r>
-      <w:proofErr w:type="spellStart"/>
-      <w:r>
-        <w:rPr>
-          <w:lang w:val="en-BE"/>
-        </w:rPr>
-        <w:t>te</w:t>
-      </w:r>
-      <w:proofErr w:type="spellEnd"/>
-      <w:r>
-        <w:rPr>
-          <w:lang w:val="en-BE"/>
-        </w:rPr>
-        <w:t xml:space="preserve">   </w:t>
-      </w:r>
-      <w:proofErr w:type="spellStart"/>
-      <w:r>
-        <w:rPr>
-          <w:lang w:val="en-BE"/>
-        </w:rPr>
-        <w:t>geven</w:t>
-      </w:r>
-      <w:proofErr w:type="spellEnd"/>
-      <w:r>
-        <w:rPr>
-          <w:lang w:val="en-BE"/>
-        </w:rPr>
-        <w:t xml:space="preserve"> van </w:t>
-      </w:r>
-      <w:proofErr w:type="spellStart"/>
-      <w:r>
-        <w:rPr>
-          <w:lang w:val="en-BE"/>
-        </w:rPr>
-        <w:t>vershillen</w:t>
-      </w:r>
-      <w:proofErr w:type="spellEnd"/>
+        <w:rPr>
+          <w:lang w:val="en-US"/>
+        </w:rPr>
+      </w:pPr>
+      <w:r>
+        <w:rPr>
+          <w:lang w:val="en-US"/>
+        </w:rPr>
+        <w:t>7. Documentation was actually the hardest part</w:t>
+      </w:r>
+      <w:r>
+        <w:rPr>
+          <w:lang w:val="en-US"/>
+        </w:rPr>
+        <w:br/>
+        <w:t>Both the old (v4.boldsystems.org) and new (portal.boldsystems.org/api/docs) doc pages returned 403s to automated fetches. I ended up reverse-engineering the real behavior by hitting the live endpoints with curl and inspecting raw responses rather than reading a spec — which is also how I caught the JSONL format and the "always succeeds" preprocessor quirk above.</w:t>
+      </w:r>
+    </w:p>
+    <w:p>
+      <w:r>
+        <w:rPr>
+          <w:lang w:val="en-US"/>
+        </w:rPr>
+        <w:tab/>
+      </w:r>
+      <w:r>
+        <w:t>Resttime van 0,1 werkt niet moet p</w:t>
+      </w:r>
+      <w:r>
+        <w:t>roberen met een langere rest time</w:t>
+      </w:r>
     </w:p>
     <w:sectPr>
       <w:pgSz w:w="11906" w:h="16838"/>
@@ -1306,6 +1149,304 @@
 <file path=word/numbering.xml><?xml version="1.0" encoding="utf-8"?>
 <w:numbering xmlns:wpc="http://schemas.microsoft.com/office/word/2010/wordprocessingCanvas" xmlns:cx="http://schemas.microsoft.com/office/drawing/2014/chartex" xmlns:cx1="http://schemas.microsoft.com/office/drawing/2015/9/8/chartex" xmlns:cx2="http://schemas.microsoft.com/office/drawing/2015/10/21/chartex" xmlns:cx3="http://schemas.microsoft.com/office/drawing/2016/5/9/chartex" xmlns:cx4="http://schemas.microsoft.com/office/drawing/2016/5/10/chartex" xmlns:cx5="http://schemas.microsoft.com/office/drawing/2016/5/11/chartex" xmlns:cx6="http://schemas.microsoft.com/office/drawing/2016/5/12/chartex" xmlns:cx7="http://schemas.microsoft.com/office/drawing/2016/5/13/chartex" xmlns:cx8="http://schemas.microsoft.com/office/drawing/2016/5/14/chartex" xmlns:mc="http://schemas.openxmlformats.org/markup-compatibility/2006" xmlns:aink="http://schemas.microsoft.com/office/drawing/2016/ink" xmlns:am3d="http://schemas.microsoft.com/office/drawing/2017/model3d" xmlns:o="urn:schemas-microsoft-com:office:office" xmlns:oel="http://schemas.microsoft.com/office/2019/extlst" xmlns:r="http://schemas.openxmlformats.org/officeDocument/2006/relationships" xmlns:m="http://schemas.openxmlformats.org/officeDocument/2006/math" xmlns:v="urn:schemas-microsoft-com:vml" xmlns:wp14="http://schemas.microsoft.com/office/word/2010/wordprocessingDrawing" xmlns:wp="http://schemas.openxmlformats.org/drawingml/2006/wordprocessingDrawing" xmlns:w10="urn:schemas-microsoft-com:office:word" xmlns:w="http://schemas.openxmlformats.org/wordprocessingml/2006/main" xmlns:w14="http://schemas.microsoft.com/office/word/2010/wordml" xmlns:w15="http://schemas.microsoft.com/office/word/2012/wordml" xmlns:w16cex="http://schemas.microsoft.com/office/word/2018/wordml/cex" xmlns:w16cid="http://schemas.microsoft.com/office/word/2016/wordml/cid" xmlns:w16="http://schemas.microsoft.com/office/word/2018/wordml" xmlns:w16du="http://schemas.microsoft.com/office/word/2023/wordml/word16du" xmlns:w16sdtdh="http://schemas.microsoft.com/office/word/2020/wordml/sdtdatahash" xmlns:w16sdtfl="http://schemas.microsoft.com/office/word/2024/wordml/sdtformatlock" xmlns:w16se="http://schemas.microsoft.com/office/word/2015/wordml/symex" xmlns:wpg="http://schemas.microsoft.com/office/word/2010/wordprocessingGroup" xmlns:wpi="http://schemas.microsoft.com/office/word/2010/wordprocessingInk" xmlns:wne="http://schemas.microsoft.com/office/word/2006/wordml" xmlns:wps="http://schemas.microsoft.com/office/word/2010/wordprocessingShape" mc:Ignorable="w14 w15 w16se w16cid w16 w16cex w16sdtdh w16sdtfl w16du wp14">
   <w:abstractNum w:abstractNumId="0" w15:restartNumberingAfterBreak="0">
+    <w:nsid w:val="0BDF2136"/>
+    <w:multiLevelType w:val="multilevel"/>
+    <w:tmpl w:val="970E872C"/>
+    <w:lvl w:ilvl="0">
+      <w:start w:val="1"/>
+      <w:numFmt w:val="bullet"/>
+      <w:lvlText w:val=""/>
+      <w:lvlJc w:val="left"/>
+      <w:pPr>
+        <w:tabs>
+          <w:tab w:val="num" w:pos="720"/>
+        </w:tabs>
+        <w:ind w:left="720" w:hanging="360"/>
+      </w:pPr>
+      <w:rPr>
+        <w:rFonts w:ascii="Symbol" w:hAnsi="Symbol" w:hint="default"/>
+        <w:sz w:val="20"/>
+      </w:rPr>
+    </w:lvl>
+    <w:lvl w:ilvl="1" w:tentative="1">
+      <w:start w:val="1"/>
+      <w:numFmt w:val="bullet"/>
+      <w:lvlText w:val="o"/>
+      <w:lvlJc w:val="left"/>
+      <w:pPr>
+        <w:tabs>
+          <w:tab w:val="num" w:pos="1440"/>
+        </w:tabs>
+        <w:ind w:left="1440" w:hanging="360"/>
+      </w:pPr>
+      <w:rPr>
+        <w:rFonts w:ascii="Courier New" w:hAnsi="Courier New" w:hint="default"/>
+        <w:sz w:val="20"/>
+      </w:rPr>
+    </w:lvl>
+    <w:lvl w:ilvl="2" w:tentative="1">
+      <w:start w:val="1"/>
+      <w:numFmt w:val="bullet"/>
+      <w:lvlText w:val=""/>
+      <w:lvlJc w:val="left"/>
+      <w:pPr>
+        <w:tabs>
+          <w:tab w:val="num" w:pos="2160"/>
+        </w:tabs>
+        <w:ind w:left="2160" w:hanging="360"/>
+      </w:pPr>
+      <w:rPr>
+        <w:rFonts w:ascii="Wingdings" w:hAnsi="Wingdings" w:hint="default"/>
+        <w:sz w:val="20"/>
+      </w:rPr>
+    </w:lvl>
+    <w:lvl w:ilvl="3" w:tentative="1">
+      <w:start w:val="1"/>
+      <w:numFmt w:val="bullet"/>
+      <w:lvlText w:val=""/>
+      <w:lvlJc w:val="left"/>
+      <w:pPr>
+        <w:tabs>
+          <w:tab w:val="num" w:pos="2880"/>
+        </w:tabs>
+        <w:ind w:left="2880" w:hanging="360"/>
+      </w:pPr>
+      <w:rPr>
+        <w:rFonts w:ascii="Wingdings" w:hAnsi="Wingdings" w:hint="default"/>
+        <w:sz w:val="20"/>
+      </w:rPr>
+    </w:lvl>
+    <w:lvl w:ilvl="4" w:tentative="1">
+      <w:start w:val="1"/>
+      <w:numFmt w:val="bullet"/>
+      <w:lvlText w:val=""/>
+      <w:lvlJc w:val="left"/>
+      <w:pPr>
+        <w:tabs>
+          <w:tab w:val="num" w:pos="3600"/>
+        </w:tabs>
+        <w:ind w:left="3600" w:hanging="360"/>
+      </w:pPr>
+      <w:rPr>
+        <w:rFonts w:ascii="Wingdings" w:hAnsi="Wingdings" w:hint="default"/>
+        <w:sz w:val="20"/>
+      </w:rPr>
+    </w:lvl>
+    <w:lvl w:ilvl="5" w:tentative="1">
+      <w:start w:val="1"/>
+      <w:numFmt w:val="bullet"/>
+      <w:lvlText w:val=""/>
+      <w:lvlJc w:val="left"/>
+      <w:pPr>
+        <w:tabs>
+          <w:tab w:val="num" w:pos="4320"/>
+        </w:tabs>
+        <w:ind w:left="4320" w:hanging="360"/>
+      </w:pPr>
+      <w:rPr>
+        <w:rFonts w:ascii="Wingdings" w:hAnsi="Wingdings" w:hint="default"/>
+        <w:sz w:val="20"/>
+      </w:rPr>
+    </w:lvl>
+    <w:lvl w:ilvl="6" w:tentative="1">
+      <w:start w:val="1"/>
+      <w:numFmt w:val="bullet"/>
+      <w:lvlText w:val=""/>
+      <w:lvlJc w:val="left"/>
+      <w:pPr>
+        <w:tabs>
+          <w:tab w:val="num" w:pos="5040"/>
+        </w:tabs>
+        <w:ind w:left="5040" w:hanging="360"/>
+      </w:pPr>
+      <w:rPr>
+        <w:rFonts w:ascii="Wingdings" w:hAnsi="Wingdings" w:hint="default"/>
+        <w:sz w:val="20"/>
+      </w:rPr>
+    </w:lvl>
+    <w:lvl w:ilvl="7" w:tentative="1">
+      <w:start w:val="1"/>
+      <w:numFmt w:val="bullet"/>
+      <w:lvlText w:val=""/>
+      <w:lvlJc w:val="left"/>
+      <w:pPr>
+        <w:tabs>
+          <w:tab w:val="num" w:pos="5760"/>
+        </w:tabs>
+        <w:ind w:left="5760" w:hanging="360"/>
+      </w:pPr>
+      <w:rPr>
+        <w:rFonts w:ascii="Wingdings" w:hAnsi="Wingdings" w:hint="default"/>
+        <w:sz w:val="20"/>
+      </w:rPr>
+    </w:lvl>
+    <w:lvl w:ilvl="8" w:tentative="1">
+      <w:start w:val="1"/>
+      <w:numFmt w:val="bullet"/>
+      <w:lvlText w:val=""/>
+      <w:lvlJc w:val="left"/>
+      <w:pPr>
+        <w:tabs>
+          <w:tab w:val="num" w:pos="6480"/>
+        </w:tabs>
+        <w:ind w:left="6480" w:hanging="360"/>
+      </w:pPr>
+      <w:rPr>
+        <w:rFonts w:ascii="Wingdings" w:hAnsi="Wingdings" w:hint="default"/>
+        <w:sz w:val="20"/>
+      </w:rPr>
+    </w:lvl>
+  </w:abstractNum>
+  <w:abstractNum w:abstractNumId="1" w15:restartNumberingAfterBreak="0">
+    <w:nsid w:val="1DCB2FB8"/>
+    <w:multiLevelType w:val="multilevel"/>
+    <w:tmpl w:val="CDACF7C4"/>
+    <w:lvl w:ilvl="0">
+      <w:start w:val="1"/>
+      <w:numFmt w:val="bullet"/>
+      <w:lvlText w:val=""/>
+      <w:lvlJc w:val="left"/>
+      <w:pPr>
+        <w:tabs>
+          <w:tab w:val="num" w:pos="720"/>
+        </w:tabs>
+        <w:ind w:left="720" w:hanging="360"/>
+      </w:pPr>
+      <w:rPr>
+        <w:rFonts w:ascii="Symbol" w:hAnsi="Symbol" w:hint="default"/>
+        <w:sz w:val="20"/>
+      </w:rPr>
+    </w:lvl>
+    <w:lvl w:ilvl="1" w:tentative="1">
+      <w:start w:val="1"/>
+      <w:numFmt w:val="bullet"/>
+      <w:lvlText w:val="o"/>
+      <w:lvlJc w:val="left"/>
+      <w:pPr>
+        <w:tabs>
+          <w:tab w:val="num" w:pos="1440"/>
+        </w:tabs>
+        <w:ind w:left="1440" w:hanging="360"/>
+      </w:pPr>
+      <w:rPr>
+        <w:rFonts w:ascii="Courier New" w:hAnsi="Courier New" w:hint="default"/>
+        <w:sz w:val="20"/>
+      </w:rPr>
+    </w:lvl>
+    <w:lvl w:ilvl="2" w:tentative="1">
+      <w:start w:val="1"/>
+      <w:numFmt w:val="bullet"/>
+      <w:lvlText w:val=""/>
+      <w:lvlJc w:val="left"/>
+      <w:pPr>
+        <w:tabs>
+          <w:tab w:val="num" w:pos="2160"/>
+        </w:tabs>
+        <w:ind w:left="2160" w:hanging="360"/>
+      </w:pPr>
+      <w:rPr>
+        <w:rFonts w:ascii="Wingdings" w:hAnsi="Wingdings" w:hint="default"/>
+        <w:sz w:val="20"/>
+      </w:rPr>
+    </w:lvl>
+    <w:lvl w:ilvl="3" w:tentative="1">
+      <w:start w:val="1"/>
+      <w:numFmt w:val="bullet"/>
+      <w:lvlText w:val=""/>
+      <w:lvlJc w:val="left"/>
+      <w:pPr>
+        <w:tabs>
+          <w:tab w:val="num" w:pos="2880"/>
+        </w:tabs>
+        <w:ind w:left="2880" w:hanging="360"/>
+      </w:pPr>
+      <w:rPr>
+        <w:rFonts w:ascii="Wingdings" w:hAnsi="Wingdings" w:hint="default"/>
+        <w:sz w:val="20"/>
+      </w:rPr>
+    </w:lvl>
+    <w:lvl w:ilvl="4" w:tentative="1">
+      <w:start w:val="1"/>
+      <w:numFmt w:val="bullet"/>
+      <w:lvlText w:val=""/>
+      <w:lvlJc w:val="left"/>
+      <w:pPr>
+        <w:tabs>
+          <w:tab w:val="num" w:pos="3600"/>
+        </w:tabs>
+        <w:ind w:left="3600" w:hanging="360"/>
+      </w:pPr>
+      <w:rPr>
+        <w:rFonts w:ascii="Wingdings" w:hAnsi="Wingdings" w:hint="default"/>
+        <w:sz w:val="20"/>
+      </w:rPr>
+    </w:lvl>
+    <w:lvl w:ilvl="5" w:tentative="1">
+      <w:start w:val="1"/>
+      <w:numFmt w:val="bullet"/>
+      <w:lvlText w:val=""/>
+      <w:lvlJc w:val="left"/>
+      <w:pPr>
+        <w:tabs>
+          <w:tab w:val="num" w:pos="4320"/>
+        </w:tabs>
+        <w:ind w:left="4320" w:hanging="360"/>
+      </w:pPr>
+      <w:rPr>
+        <w:rFonts w:ascii="Wingdings" w:hAnsi="Wingdings" w:hint="default"/>
+        <w:sz w:val="20"/>
+      </w:rPr>
+    </w:lvl>
+    <w:lvl w:ilvl="6" w:tentative="1">
+      <w:start w:val="1"/>
+      <w:numFmt w:val="bullet"/>
+      <w:lvlText w:val=""/>
+      <w:lvlJc w:val="left"/>
+      <w:pPr>
+        <w:tabs>
+          <w:tab w:val="num" w:pos="5040"/>
+        </w:tabs>
+        <w:ind w:left="5040" w:hanging="360"/>
+      </w:pPr>
+      <w:rPr>
+        <w:rFonts w:ascii="Wingdings" w:hAnsi="Wingdings" w:hint="default"/>
+        <w:sz w:val="20"/>
+      </w:rPr>
+    </w:lvl>
+    <w:lvl w:ilvl="7" w:tentative="1">
+      <w:start w:val="1"/>
+      <w:numFmt w:val="bullet"/>
+      <w:lvlText w:val=""/>
+      <w:lvlJc w:val="left"/>
+      <w:pPr>
+        <w:tabs>
+          <w:tab w:val="num" w:pos="5760"/>
+        </w:tabs>
+        <w:ind w:left="5760" w:hanging="360"/>
+      </w:pPr>
+      <w:rPr>
+        <w:rFonts w:ascii="Wingdings" w:hAnsi="Wingdings" w:hint="default"/>
+        <w:sz w:val="20"/>
+      </w:rPr>
+    </w:lvl>
+    <w:lvl w:ilvl="8" w:tentative="1">
+      <w:start w:val="1"/>
+      <w:numFmt w:val="bullet"/>
+      <w:lvlText w:val=""/>
+      <w:lvlJc w:val="left"/>
+      <w:pPr>
+        <w:tabs>
+          <w:tab w:val="num" w:pos="6480"/>
+        </w:tabs>
+        <w:ind w:left="6480" w:hanging="360"/>
+      </w:pPr>
+      <w:rPr>
+        <w:rFonts w:ascii="Wingdings" w:hAnsi="Wingdings" w:hint="default"/>
+        <w:sz w:val="20"/>
+      </w:rPr>
+    </w:lvl>
+  </w:abstractNum>
+  <w:abstractNum w:abstractNumId="2" w15:restartNumberingAfterBreak="0">
     <w:nsid w:val="4ABB3DD6"/>
     <w:multiLevelType w:val="hybridMultilevel"/>
     <w:tmpl w:val="D186BFF2"/>
@@ -1418,7 +1559,13 @@
     </w:lvl>
   </w:abstractNum>
   <w:num w:numId="1" w16cid:durableId="1374963453">
+    <w:abstractNumId w:val="2"/>
+  </w:num>
+  <w:num w:numId="2" w16cid:durableId="460270665">
     <w:abstractNumId w:val="0"/>
+  </w:num>
+  <w:num w:numId="3" w16cid:durableId="1858887320">
+    <w:abstractNumId w:val="1"/>
   </w:num>
 </w:numbering>
 </file>

</xml_diff>

<commit_message>
BOLD accesion search with GUI
</commit_message>
<xml_diff>
--- a/Stage Meise logbook.docx
+++ b/Stage Meise logbook.docx
@@ -58,61 +58,11 @@
                 <w:lang w:val="en-BE"/>
               </w:rPr>
             </w:pPr>
-            <w:proofErr w:type="spellStart"/>
             <w:r>
               <w:rPr>
                 <w:lang w:val="en-BE"/>
               </w:rPr>
-              <w:t>Ronlijdeing</w:t>
-            </w:r>
-            <w:proofErr w:type="spellEnd"/>
-            <w:r>
-              <w:rPr>
-                <w:lang w:val="en-BE"/>
-              </w:rPr>
-              <w:t xml:space="preserve"> </w:t>
-            </w:r>
-            <w:proofErr w:type="spellStart"/>
-            <w:r>
-              <w:rPr>
-                <w:lang w:val="en-BE"/>
-              </w:rPr>
-              <w:t>en</w:t>
-            </w:r>
-            <w:proofErr w:type="spellEnd"/>
-            <w:r>
-              <w:rPr>
-                <w:lang w:val="en-BE"/>
-              </w:rPr>
-              <w:t xml:space="preserve"> </w:t>
-            </w:r>
-            <w:proofErr w:type="spellStart"/>
-            <w:r>
-              <w:rPr>
-                <w:lang w:val="en-BE"/>
-              </w:rPr>
-              <w:t>introductie</w:t>
-            </w:r>
-            <w:proofErr w:type="spellEnd"/>
-            <w:r>
-              <w:rPr>
-                <w:lang w:val="en-BE"/>
-              </w:rPr>
-              <w:t xml:space="preserve">, </w:t>
-            </w:r>
-            <w:proofErr w:type="spellStart"/>
-            <w:r>
-              <w:rPr>
-                <w:lang w:val="en-BE"/>
-              </w:rPr>
-              <w:t>uitleg</w:t>
-            </w:r>
-            <w:proofErr w:type="spellEnd"/>
-            <w:r>
-              <w:rPr>
-                <w:lang w:val="en-BE"/>
-              </w:rPr>
-              <w:t xml:space="preserve"> over de stage.</w:t>
+              <w:t>Ronlijdeing en introductie, uitleg over de stage.</w:t>
             </w:r>
           </w:p>
         </w:tc>
@@ -291,61 +241,17 @@
           <w:lang w:val="en-BE"/>
         </w:rPr>
       </w:pPr>
-      <w:proofErr w:type="spellStart"/>
-      <w:r>
-        <w:rPr>
-          <w:lang w:val="en-BE"/>
-        </w:rPr>
-        <w:t>Floralijst</w:t>
-      </w:r>
-      <w:proofErr w:type="spellEnd"/>
-      <w:r>
-        <w:rPr>
-          <w:lang w:val="en-BE"/>
-        </w:rPr>
-        <w:t xml:space="preserve"> </w:t>
-      </w:r>
-      <w:proofErr w:type="spellStart"/>
-      <w:r>
-        <w:rPr>
-          <w:lang w:val="en-BE"/>
-        </w:rPr>
-        <w:t>filteren</w:t>
-      </w:r>
-      <w:proofErr w:type="spellEnd"/>
-      <w:r>
-        <w:rPr>
-          <w:lang w:val="en-BE"/>
-        </w:rPr>
-        <w:t xml:space="preserve"> </w:t>
-      </w:r>
-      <w:proofErr w:type="spellStart"/>
-      <w:r>
-        <w:rPr>
-          <w:lang w:val="en-BE"/>
-        </w:rPr>
-        <w:t>en</w:t>
-      </w:r>
-      <w:proofErr w:type="spellEnd"/>
-      <w:r>
-        <w:rPr>
-          <w:lang w:val="en-BE"/>
-        </w:rPr>
-        <w:t xml:space="preserve"> </w:t>
-      </w:r>
-      <w:proofErr w:type="spellStart"/>
-      <w:r>
-        <w:rPr>
-          <w:lang w:val="en-BE"/>
-        </w:rPr>
-        <w:t>verwerken</w:t>
-      </w:r>
-      <w:proofErr w:type="spellEnd"/>
-      <w:r>
-        <w:rPr>
-          <w:lang w:val="en-BE"/>
-        </w:rPr>
-        <w:t xml:space="preserve">. (R) </w:t>
+      <w:r>
+        <w:rPr>
+          <w:lang w:val="en-BE"/>
+        </w:rPr>
+        <w:t xml:space="preserve">Floralijst </w:t>
+      </w:r>
+      <w:r>
+        <w:rPr>
+          <w:lang w:val="en-BE"/>
+        </w:rPr>
+        <w:t xml:space="preserve">filteren en verwerken. (R) </w:t>
       </w:r>
     </w:p>
     <w:p>
@@ -363,21 +269,7 @@
         <w:rPr>
           <w:lang w:val="en-BE"/>
         </w:rPr>
-        <w:t xml:space="preserve">Script </w:t>
-      </w:r>
-      <w:proofErr w:type="spellStart"/>
-      <w:r>
-        <w:rPr>
-          <w:lang w:val="en-BE"/>
-        </w:rPr>
-        <w:t>voor</w:t>
-      </w:r>
-      <w:proofErr w:type="spellEnd"/>
-      <w:r>
-        <w:rPr>
-          <w:lang w:val="en-BE"/>
-        </w:rPr>
-        <w:t xml:space="preserve"> ID </w:t>
+        <w:t xml:space="preserve">Script voor ID </w:t>
       </w:r>
     </w:p>
     <w:p>
@@ -391,19 +283,11 @@
           <w:lang w:val="en-BE"/>
         </w:rPr>
       </w:pPr>
-      <w:proofErr w:type="spellStart"/>
-      <w:r>
-        <w:rPr>
-          <w:lang w:val="en-BE"/>
-        </w:rPr>
-        <w:t>Eerste</w:t>
-      </w:r>
-      <w:proofErr w:type="spellEnd"/>
-      <w:r>
-        <w:rPr>
-          <w:lang w:val="en-BE"/>
-        </w:rPr>
-        <w:t xml:space="preserve"> run van script output: </w:t>
+      <w:r>
+        <w:rPr>
+          <w:lang w:val="en-BE"/>
+        </w:rPr>
+        <w:t xml:space="preserve">Eerste run van script output: </w:t>
       </w:r>
       <w:r>
         <w:rPr>
@@ -427,21 +311,7 @@
         <w:rPr>
           <w:lang w:val="en-BE"/>
         </w:rPr>
-        <w:t xml:space="preserve"> </w:t>
-      </w:r>
-      <w:proofErr w:type="spellStart"/>
-      <w:r>
-        <w:rPr>
-          <w:lang w:val="en-BE"/>
-        </w:rPr>
-        <w:t>testen</w:t>
-      </w:r>
-      <w:proofErr w:type="spellEnd"/>
-      <w:r>
-        <w:rPr>
-          <w:lang w:val="en-BE"/>
-        </w:rPr>
-        <w:t xml:space="preserve"> met 1 search term </w:t>
+        <w:t xml:space="preserve"> testen met 1 search term </w:t>
       </w:r>
     </w:p>
     <w:p>
@@ -505,9 +375,28 @@
           <w:lang w:eastAsia="nl-NL"/>
           <w14:ligatures w14:val="none"/>
         </w:rPr>
-        <w:t xml:space="preserve">handle = </w:t>
-      </w:r>
-      <w:proofErr w:type="spellStart"/>
+        <w:t>handle = Entrez.esearch(</w:t>
+      </w:r>
+    </w:p>
+    <w:p>
+      <w:pPr>
+        <w:pStyle w:val="Lijstalinea"/>
+        <w:numPr>
+          <w:ilvl w:val="0"/>
+          <w:numId w:val="1"/>
+        </w:numPr>
+        <w:shd w:val="clear" w:color="auto" w:fill="121314"/>
+        <w:spacing w:after="0" w:line="285" w:lineRule="atLeast"/>
+        <w:rPr>
+          <w:rFonts w:ascii="Consolas" w:eastAsia="Times New Roman" w:hAnsi="Consolas" w:cs="Times New Roman"/>
+          <w:color w:val="BBBEBF"/>
+          <w:kern w:val="0"/>
+          <w:sz w:val="21"/>
+          <w:szCs w:val="21"/>
+          <w:lang w:eastAsia="nl-NL"/>
+          <w14:ligatures w14:val="none"/>
+        </w:rPr>
+      </w:pPr>
       <w:r>
         <w:rPr>
           <w:rFonts w:ascii="Consolas" w:eastAsia="Times New Roman" w:hAnsi="Consolas" w:cs="Times New Roman"/>
@@ -518,9 +407,28 @@
           <w:lang w:eastAsia="nl-NL"/>
           <w14:ligatures w14:val="none"/>
         </w:rPr>
-        <w:t>Entrez.esearch</w:t>
-      </w:r>
-      <w:proofErr w:type="spellEnd"/>
+        <w:t>    db="nucleotide",</w:t>
+      </w:r>
+    </w:p>
+    <w:p>
+      <w:pPr>
+        <w:pStyle w:val="Lijstalinea"/>
+        <w:numPr>
+          <w:ilvl w:val="0"/>
+          <w:numId w:val="1"/>
+        </w:numPr>
+        <w:shd w:val="clear" w:color="auto" w:fill="121314"/>
+        <w:spacing w:after="0" w:line="285" w:lineRule="atLeast"/>
+        <w:rPr>
+          <w:rFonts w:ascii="Consolas" w:eastAsia="Times New Roman" w:hAnsi="Consolas" w:cs="Times New Roman"/>
+          <w:color w:val="BBBEBF"/>
+          <w:kern w:val="0"/>
+          <w:sz w:val="21"/>
+          <w:szCs w:val="21"/>
+          <w:lang w:eastAsia="nl-NL"/>
+          <w14:ligatures w14:val="none"/>
+        </w:rPr>
+      </w:pPr>
       <w:r>
         <w:rPr>
           <w:rFonts w:ascii="Consolas" w:eastAsia="Times New Roman" w:hAnsi="Consolas" w:cs="Times New Roman"/>
@@ -531,7 +439,7 @@
           <w:lang w:eastAsia="nl-NL"/>
           <w14:ligatures w14:val="none"/>
         </w:rPr>
-        <w:t>(</w:t>
+        <w:t>    term="Huperzia selago",</w:t>
       </w:r>
     </w:p>
     <w:p>
@@ -563,9 +471,28 @@
           <w:lang w:eastAsia="nl-NL"/>
           <w14:ligatures w14:val="none"/>
         </w:rPr>
-        <w:t xml:space="preserve">    </w:t>
-      </w:r>
-      <w:proofErr w:type="spellStart"/>
+        <w:t>    retmax=1</w:t>
+      </w:r>
+    </w:p>
+    <w:p>
+      <w:pPr>
+        <w:pStyle w:val="Lijstalinea"/>
+        <w:numPr>
+          <w:ilvl w:val="0"/>
+          <w:numId w:val="1"/>
+        </w:numPr>
+        <w:shd w:val="clear" w:color="auto" w:fill="121314"/>
+        <w:spacing w:after="0" w:line="285" w:lineRule="atLeast"/>
+        <w:rPr>
+          <w:rFonts w:ascii="Consolas" w:eastAsia="Times New Roman" w:hAnsi="Consolas" w:cs="Times New Roman"/>
+          <w:color w:val="BBBEBF"/>
+          <w:kern w:val="0"/>
+          <w:sz w:val="21"/>
+          <w:szCs w:val="21"/>
+          <w:lang w:eastAsia="nl-NL"/>
+          <w14:ligatures w14:val="none"/>
+        </w:rPr>
+      </w:pPr>
       <w:r>
         <w:rPr>
           <w:rFonts w:ascii="Consolas" w:eastAsia="Times New Roman" w:hAnsi="Consolas" w:cs="Times New Roman"/>
@@ -576,9 +503,48 @@
           <w:lang w:eastAsia="nl-NL"/>
           <w14:ligatures w14:val="none"/>
         </w:rPr>
-        <w:t>db</w:t>
-      </w:r>
-      <w:proofErr w:type="spellEnd"/>
+        <w:t>)</w:t>
+      </w:r>
+    </w:p>
+    <w:p>
+      <w:pPr>
+        <w:pStyle w:val="Lijstalinea"/>
+        <w:numPr>
+          <w:ilvl w:val="0"/>
+          <w:numId w:val="1"/>
+        </w:numPr>
+        <w:shd w:val="clear" w:color="auto" w:fill="121314"/>
+        <w:spacing w:after="0" w:line="285" w:lineRule="atLeast"/>
+        <w:rPr>
+          <w:rFonts w:ascii="Consolas" w:eastAsia="Times New Roman" w:hAnsi="Consolas" w:cs="Times New Roman"/>
+          <w:color w:val="BBBEBF"/>
+          <w:kern w:val="0"/>
+          <w:sz w:val="21"/>
+          <w:szCs w:val="21"/>
+          <w:lang w:eastAsia="nl-NL"/>
+          <w14:ligatures w14:val="none"/>
+        </w:rPr>
+      </w:pPr>
+    </w:p>
+    <w:p>
+      <w:pPr>
+        <w:pStyle w:val="Lijstalinea"/>
+        <w:numPr>
+          <w:ilvl w:val="0"/>
+          <w:numId w:val="1"/>
+        </w:numPr>
+        <w:shd w:val="clear" w:color="auto" w:fill="121314"/>
+        <w:spacing w:after="0" w:line="285" w:lineRule="atLeast"/>
+        <w:rPr>
+          <w:rFonts w:ascii="Consolas" w:eastAsia="Times New Roman" w:hAnsi="Consolas" w:cs="Times New Roman"/>
+          <w:color w:val="BBBEBF"/>
+          <w:kern w:val="0"/>
+          <w:sz w:val="21"/>
+          <w:szCs w:val="21"/>
+          <w:lang w:eastAsia="nl-NL"/>
+          <w14:ligatures w14:val="none"/>
+        </w:rPr>
+      </w:pPr>
       <w:r>
         <w:rPr>
           <w:rFonts w:ascii="Consolas" w:eastAsia="Times New Roman" w:hAnsi="Consolas" w:cs="Times New Roman"/>
@@ -589,7 +555,7 @@
           <w:lang w:eastAsia="nl-NL"/>
           <w14:ligatures w14:val="none"/>
         </w:rPr>
-        <w:t>="nucleotide",</w:t>
+        <w:t>record = Entrez.read(handle)</w:t>
       </w:r>
     </w:p>
     <w:p>
@@ -621,9 +587,48 @@
           <w:lang w:eastAsia="nl-NL"/>
           <w14:ligatures w14:val="none"/>
         </w:rPr>
-        <w:t>    term="</w:t>
-      </w:r>
-      <w:proofErr w:type="spellStart"/>
+        <w:t>handle.close()</w:t>
+      </w:r>
+    </w:p>
+    <w:p>
+      <w:pPr>
+        <w:pStyle w:val="Lijstalinea"/>
+        <w:numPr>
+          <w:ilvl w:val="0"/>
+          <w:numId w:val="1"/>
+        </w:numPr>
+        <w:shd w:val="clear" w:color="auto" w:fill="121314"/>
+        <w:spacing w:after="0" w:line="285" w:lineRule="atLeast"/>
+        <w:rPr>
+          <w:rFonts w:ascii="Consolas" w:eastAsia="Times New Roman" w:hAnsi="Consolas" w:cs="Times New Roman"/>
+          <w:color w:val="BBBEBF"/>
+          <w:kern w:val="0"/>
+          <w:sz w:val="21"/>
+          <w:szCs w:val="21"/>
+          <w:lang w:eastAsia="nl-NL"/>
+          <w14:ligatures w14:val="none"/>
+        </w:rPr>
+      </w:pPr>
+    </w:p>
+    <w:p>
+      <w:pPr>
+        <w:pStyle w:val="Lijstalinea"/>
+        <w:numPr>
+          <w:ilvl w:val="0"/>
+          <w:numId w:val="1"/>
+        </w:numPr>
+        <w:shd w:val="clear" w:color="auto" w:fill="121314"/>
+        <w:spacing w:after="0" w:line="285" w:lineRule="atLeast"/>
+        <w:rPr>
+          <w:rFonts w:ascii="Consolas" w:eastAsia="Times New Roman" w:hAnsi="Consolas" w:cs="Times New Roman"/>
+          <w:color w:val="BBBEBF"/>
+          <w:kern w:val="0"/>
+          <w:sz w:val="21"/>
+          <w:szCs w:val="21"/>
+          <w:lang w:eastAsia="nl-NL"/>
+          <w14:ligatures w14:val="none"/>
+        </w:rPr>
+      </w:pPr>
       <w:r>
         <w:rPr>
           <w:rFonts w:ascii="Consolas" w:eastAsia="Times New Roman" w:hAnsi="Consolas" w:cs="Times New Roman"/>
@@ -634,9 +639,48 @@
           <w:lang w:eastAsia="nl-NL"/>
           <w14:ligatures w14:val="none"/>
         </w:rPr>
-        <w:t>Huperzia</w:t>
-      </w:r>
-      <w:proofErr w:type="spellEnd"/>
+        <w:t>print(record)</w:t>
+      </w:r>
+    </w:p>
+    <w:p>
+      <w:pPr>
+        <w:pStyle w:val="Lijstalinea"/>
+        <w:numPr>
+          <w:ilvl w:val="0"/>
+          <w:numId w:val="1"/>
+        </w:numPr>
+        <w:shd w:val="clear" w:color="auto" w:fill="121314"/>
+        <w:spacing w:after="0" w:line="285" w:lineRule="atLeast"/>
+        <w:rPr>
+          <w:rFonts w:ascii="Consolas" w:eastAsia="Times New Roman" w:hAnsi="Consolas" w:cs="Times New Roman"/>
+          <w:color w:val="BBBEBF"/>
+          <w:kern w:val="0"/>
+          <w:sz w:val="21"/>
+          <w:szCs w:val="21"/>
+          <w:lang w:eastAsia="nl-NL"/>
+          <w14:ligatures w14:val="none"/>
+        </w:rPr>
+      </w:pPr>
+    </w:p>
+    <w:p>
+      <w:pPr>
+        <w:pStyle w:val="Lijstalinea"/>
+        <w:numPr>
+          <w:ilvl w:val="0"/>
+          <w:numId w:val="1"/>
+        </w:numPr>
+        <w:shd w:val="clear" w:color="auto" w:fill="121314"/>
+        <w:spacing w:after="0" w:line="285" w:lineRule="atLeast"/>
+        <w:rPr>
+          <w:rFonts w:ascii="Consolas" w:eastAsia="Times New Roman" w:hAnsi="Consolas" w:cs="Times New Roman"/>
+          <w:color w:val="BBBEBF"/>
+          <w:kern w:val="0"/>
+          <w:sz w:val="21"/>
+          <w:szCs w:val="21"/>
+          <w:lang w:eastAsia="nl-NL"/>
+          <w14:ligatures w14:val="none"/>
+        </w:rPr>
+      </w:pPr>
       <w:r>
         <w:rPr>
           <w:rFonts w:ascii="Consolas" w:eastAsia="Times New Roman" w:hAnsi="Consolas" w:cs="Times New Roman"/>
@@ -647,33 +691,151 @@
           <w:lang w:eastAsia="nl-NL"/>
           <w14:ligatures w14:val="none"/>
         </w:rPr>
+        <w:t>'''</w:t>
+      </w:r>
+    </w:p>
+    <w:p>
+      <w:pPr>
+        <w:ind w:left="1416"/>
+      </w:pPr>
+    </w:p>
+    <w:p>
+      <w:pPr>
+        <w:ind w:left="1416"/>
+        <w:rPr>
+          <w:lang w:val="en-BE"/>
+        </w:rPr>
+      </w:pPr>
+      <w:r>
+        <w:rPr>
+          <w:lang w:val="en-BE"/>
+        </w:rPr>
+        <w:t>1 search term werk, testen op subset van de data</w:t>
+      </w:r>
+      <w:r>
+        <w:rPr>
+          <w:lang w:val="en-BE"/>
+        </w:rPr>
         <w:t xml:space="preserve"> </w:t>
       </w:r>
-      <w:proofErr w:type="spellStart"/>
-      <w:r>
-        <w:rPr>
-          <w:rFonts w:ascii="Consolas" w:eastAsia="Times New Roman" w:hAnsi="Consolas" w:cs="Times New Roman"/>
-          <w:color w:val="A5D6FF"/>
-          <w:kern w:val="0"/>
-          <w:sz w:val="21"/>
-          <w:szCs w:val="21"/>
-          <w:lang w:eastAsia="nl-NL"/>
-          <w14:ligatures w14:val="none"/>
-        </w:rPr>
-        <w:t>selago</w:t>
-      </w:r>
-      <w:proofErr w:type="spellEnd"/>
-      <w:r>
-        <w:rPr>
-          <w:rFonts w:ascii="Consolas" w:eastAsia="Times New Roman" w:hAnsi="Consolas" w:cs="Times New Roman"/>
-          <w:color w:val="A5D6FF"/>
-          <w:kern w:val="0"/>
-          <w:sz w:val="21"/>
-          <w:szCs w:val="21"/>
-          <w:lang w:eastAsia="nl-NL"/>
-          <w14:ligatures w14:val="none"/>
-        </w:rPr>
-        <w:t>",</w:t>
+      <w:r>
+        <w:rPr>
+          <w:lang w:val="en-BE"/>
+        </w:rPr>
+        <w:sym w:font="Wingdings" w:char="F0E0"/>
+      </w:r>
+      <w:r>
+        <w:rPr>
+          <w:lang w:val="en-BE"/>
+        </w:rPr>
+        <w:t xml:space="preserve"> script geeft accesie numbers maar de zoekterm is niet specefiek genoeg. Proberen van zoeken met een query met verschillende zoektermen</w:t>
+      </w:r>
+    </w:p>
+    <w:p>
+      <w:pPr>
+        <w:ind w:left="1416"/>
+        <w:rPr>
+          <w:lang w:val="en-BE"/>
+        </w:rPr>
+      </w:pPr>
+      <w:r>
+        <w:rPr>
+          <w:lang w:val="en-BE"/>
+        </w:rPr>
+        <w:t>Tietel toegevoed per keyword om overzicht te   geven van vershillen</w:t>
+      </w:r>
+    </w:p>
+    <w:p>
+      <w:pPr>
+        <w:ind w:left="1416"/>
+        <w:rPr>
+          <w:lang w:val="en-BE"/>
+        </w:rPr>
+      </w:pPr>
+    </w:p>
+    <w:p>
+      <w:pPr>
+        <w:ind w:left="1416"/>
+        <w:rPr>
+          <w:lang w:val="en-BE"/>
+        </w:rPr>
+      </w:pPr>
+      <w:r>
+        <w:rPr>
+          <w:lang w:val="en-BE"/>
+        </w:rPr>
+        <w:t>Score system toegevoegd</w:t>
+      </w:r>
+    </w:p>
+    <w:p>
+      <w:pPr>
+        <w:ind w:left="1416"/>
+        <w:rPr>
+          <w:lang w:val="en-BE"/>
+        </w:rPr>
+      </w:pPr>
+      <w:r>
+        <w:rPr>
+          <w:lang w:val="en-BE"/>
+        </w:rPr>
+        <w:t>Gui ontwikellen (radio button werkt niet voor meerdere selecties)</w:t>
+      </w:r>
+    </w:p>
+    <w:p>
+      <w:pPr>
+        <w:ind w:left="1416"/>
+        <w:rPr>
+          <w:lang w:val="en-BE"/>
+        </w:rPr>
+      </w:pPr>
+      <w:r>
+        <w:rPr>
+          <w:lang w:val="en-BE"/>
+        </w:rPr>
+        <w:t>Code gebruikte placeholdertekst als input</w:t>
+      </w:r>
+    </w:p>
+    <w:p>
+      <w:pPr>
+        <w:ind w:left="1416"/>
+        <w:rPr>
+          <w:lang w:val="en-BE"/>
+        </w:rPr>
+      </w:pPr>
+      <w:r>
+        <w:rPr>
+          <w:lang w:val="en-BE"/>
+        </w:rPr>
+        <w:t>Progress bar toevoegen</w:t>
+      </w:r>
+    </w:p>
+    <w:p>
+      <w:pPr>
+        <w:ind w:left="1416"/>
+        <w:rPr>
+          <w:lang w:val="en-BE"/>
+        </w:rPr>
+      </w:pPr>
+      <w:r>
+        <w:rPr>
+          <w:lang w:val="en-BE"/>
+        </w:rPr>
+        <w:lastRenderedPageBreak/>
+        <w:t>Threading toepasen op script</w:t>
+      </w:r>
+    </w:p>
+    <w:p>
+      <w:pPr>
+        <w:ind w:left="1416"/>
+        <w:rPr>
+          <w:lang w:val="en-BE"/>
+        </w:rPr>
+      </w:pPr>
+      <w:r>
+        <w:rPr>
+          <w:lang w:val="en-BE"/>
+        </w:rPr>
+        <w:t>Code system standardizeren.</w:t>
       </w:r>
     </w:p>
     <w:p>
@@ -683,615 +845,296 @@
           <w:ilvl w:val="0"/>
           <w:numId w:val="1"/>
         </w:numPr>
-        <w:shd w:val="clear" w:color="auto" w:fill="121314"/>
-        <w:spacing w:after="0" w:line="285" w:lineRule="atLeast"/>
-        <w:rPr>
-          <w:rFonts w:ascii="Consolas" w:eastAsia="Times New Roman" w:hAnsi="Consolas" w:cs="Times New Roman"/>
-          <w:color w:val="BBBEBF"/>
-          <w:kern w:val="0"/>
-          <w:sz w:val="21"/>
-          <w:szCs w:val="21"/>
-          <w:lang w:eastAsia="nl-NL"/>
-          <w14:ligatures w14:val="none"/>
-        </w:rPr>
-      </w:pPr>
-      <w:r>
-        <w:rPr>
-          <w:rFonts w:ascii="Consolas" w:eastAsia="Times New Roman" w:hAnsi="Consolas" w:cs="Times New Roman"/>
-          <w:color w:val="A5D6FF"/>
-          <w:kern w:val="0"/>
-          <w:sz w:val="21"/>
-          <w:szCs w:val="21"/>
-          <w:lang w:eastAsia="nl-NL"/>
-          <w14:ligatures w14:val="none"/>
-        </w:rPr>
-        <w:t xml:space="preserve">    </w:t>
-      </w:r>
-      <w:proofErr w:type="spellStart"/>
-      <w:r>
-        <w:rPr>
-          <w:rFonts w:ascii="Consolas" w:eastAsia="Times New Roman" w:hAnsi="Consolas" w:cs="Times New Roman"/>
-          <w:color w:val="A5D6FF"/>
-          <w:kern w:val="0"/>
-          <w:sz w:val="21"/>
-          <w:szCs w:val="21"/>
-          <w:lang w:eastAsia="nl-NL"/>
-          <w14:ligatures w14:val="none"/>
-        </w:rPr>
-        <w:t>retmax</w:t>
-      </w:r>
-      <w:proofErr w:type="spellEnd"/>
-      <w:r>
-        <w:rPr>
-          <w:rFonts w:ascii="Consolas" w:eastAsia="Times New Roman" w:hAnsi="Consolas" w:cs="Times New Roman"/>
-          <w:color w:val="A5D6FF"/>
-          <w:kern w:val="0"/>
-          <w:sz w:val="21"/>
-          <w:szCs w:val="21"/>
-          <w:lang w:eastAsia="nl-NL"/>
-          <w14:ligatures w14:val="none"/>
-        </w:rPr>
-        <w:t>=1</w:t>
-      </w:r>
-    </w:p>
-    <w:p>
-      <w:pPr>
-        <w:pStyle w:val="Lijstalinea"/>
+        <w:rPr>
+          <w:lang w:val="en-BE"/>
+        </w:rPr>
+      </w:pPr>
+      <w:r>
+        <w:rPr>
+          <w:lang w:val="en-BE"/>
+        </w:rPr>
+        <w:t xml:space="preserve">BOLD </w:t>
+      </w:r>
+    </w:p>
+    <w:p>
+      <w:pPr>
+        <w:ind w:left="1416"/>
+        <w:rPr>
+          <w:lang w:val="en-US"/>
+        </w:rPr>
+      </w:pPr>
+      <w:r>
+        <w:rPr>
+          <w:lang w:val="en-US"/>
+        </w:rPr>
+        <w:t>Here's a breakdown of the main differences and the traps I had to work around:</w:t>
+      </w:r>
+    </w:p>
+    <w:p>
+      <w:pPr>
+        <w:ind w:left="1416"/>
+      </w:pPr>
+      <w:r>
+        <w:t>1. API shape is fundamentally different</w:t>
+      </w:r>
+    </w:p>
+    <w:p>
+      <w:pPr>
         <w:numPr>
           <w:ilvl w:val="0"/>
-          <w:numId w:val="1"/>
+          <w:numId w:val="2"/>
         </w:numPr>
-        <w:shd w:val="clear" w:color="auto" w:fill="121314"/>
-        <w:spacing w:after="0" w:line="285" w:lineRule="atLeast"/>
-        <w:rPr>
-          <w:rFonts w:ascii="Consolas" w:eastAsia="Times New Roman" w:hAnsi="Consolas" w:cs="Times New Roman"/>
-          <w:color w:val="BBBEBF"/>
-          <w:kern w:val="0"/>
-          <w:sz w:val="21"/>
-          <w:szCs w:val="21"/>
-          <w:lang w:eastAsia="nl-NL"/>
-          <w14:ligatures w14:val="none"/>
-        </w:rPr>
-      </w:pPr>
-      <w:r>
-        <w:rPr>
-          <w:rFonts w:ascii="Consolas" w:eastAsia="Times New Roman" w:hAnsi="Consolas" w:cs="Times New Roman"/>
-          <w:color w:val="A5D6FF"/>
-          <w:kern w:val="0"/>
-          <w:sz w:val="21"/>
-          <w:szCs w:val="21"/>
-          <w:lang w:eastAsia="nl-NL"/>
-          <w14:ligatures w14:val="none"/>
-        </w:rPr>
-        <w:t>)</w:t>
-      </w:r>
-    </w:p>
-    <w:p>
-      <w:pPr>
-        <w:pStyle w:val="Lijstalinea"/>
+        <w:rPr>
+          <w:lang w:val="en-US"/>
+        </w:rPr>
+      </w:pPr>
+      <w:r>
+        <w:rPr>
+          <w:lang w:val="en-US"/>
+        </w:rPr>
+        <w:t>NCBI Entrez is a 2-call pattern: esearch (get IDs) → efetch (get GenBank records), keyed by species+marker in one query.</w:t>
+      </w:r>
+    </w:p>
+    <w:p>
+      <w:pPr>
         <w:numPr>
           <w:ilvl w:val="0"/>
-          <w:numId w:val="1"/>
+          <w:numId w:val="2"/>
         </w:numPr>
-        <w:shd w:val="clear" w:color="auto" w:fill="121314"/>
-        <w:spacing w:after="0" w:line="285" w:lineRule="atLeast"/>
-        <w:rPr>
-          <w:rFonts w:ascii="Consolas" w:eastAsia="Times New Roman" w:hAnsi="Consolas" w:cs="Times New Roman"/>
-          <w:color w:val="BBBEBF"/>
-          <w:kern w:val="0"/>
-          <w:sz w:val="21"/>
-          <w:szCs w:val="21"/>
-          <w:lang w:eastAsia="nl-NL"/>
-          <w14:ligatures w14:val="none"/>
-        </w:rPr>
-      </w:pPr>
-    </w:p>
-    <w:p>
-      <w:pPr>
-        <w:pStyle w:val="Lijstalinea"/>
+        <w:rPr>
+          <w:lang w:val="en-US"/>
+        </w:rPr>
+      </w:pPr>
+      <w:r>
+        <w:rPr>
+          <w:lang w:val="en-US"/>
+        </w:rPr>
+        <w:t>BOLD v5 is a 3-step token flow: query/preprocessor (validate the term) → query (get a query_id) → documents/&lt;query_id&gt;/download (actually get data). You can't skip straight to fetching — you need that query_id first.</w:t>
+      </w:r>
+    </w:p>
+    <w:p>
+      <w:pPr>
+        <w:ind w:left="1416"/>
+        <w:rPr>
+          <w:lang w:val="en-US"/>
+        </w:rPr>
+      </w:pPr>
+      <w:r>
+        <w:rPr>
+          <w:lang w:val="en-US"/>
+        </w:rPr>
+        <w:t>2. No per-marker filtering server-side</w:t>
+      </w:r>
+      <w:r>
+        <w:rPr>
+          <w:lang w:val="en-US"/>
+        </w:rPr>
+        <w:br/>
+        <w:t>NCBI lets you put the marker directly in the search query ("species"[Organism] AND rbcL). BOLD has no marker scope — a species query returns records for </w:t>
+      </w:r>
+      <w:r>
+        <w:rPr>
+          <w:i/>
+          <w:iCs/>
+          <w:lang w:val="en-US"/>
+        </w:rPr>
+        <w:t>every</w:t>
+      </w:r>
+      <w:r>
+        <w:rPr>
+          <w:lang w:val="en-US"/>
+        </w:rPr>
+        <w:t> marker at once, and you filter by marker_code locally. I turned this into an advantage: fetch once per species, cache it, and reuse across all markers instead of hitting the API once per species-marker pair like the NCBI version does.</w:t>
+      </w:r>
+    </w:p>
+    <w:p>
+      <w:pPr>
+        <w:ind w:left="1416"/>
+        <w:rPr>
+          <w:lang w:val="en-US"/>
+        </w:rPr>
+      </w:pPr>
+      <w:r>
+        <w:rPr>
+          <w:lang w:val="en-US"/>
+        </w:rPr>
+        <w:t>3. Response format is JSONL, not XML/GenBank</w:t>
+      </w:r>
+      <w:r>
+        <w:rPr>
+          <w:lang w:val="en-US"/>
+        </w:rPr>
+        <w:br/>
+        <w:t>BOLD's download endpoint returns newline-delimited JSON, not a JSON array. If you json.loads() the whole response body you get a parse error — you have to split on newlines and parse each line individually. This isn't documented clearly anywhere; I only found it by hitting the live endpoint with curl.</w:t>
+      </w:r>
+    </w:p>
+    <w:p>
+      <w:pPr>
+        <w:ind w:left="1416"/>
+        <w:rPr>
+          <w:lang w:val="en-US"/>
+        </w:rPr>
+      </w:pPr>
+      <w:r>
+        <w:rPr>
+          <w:lang w:val="en-US"/>
+        </w:rPr>
+        <w:t>4. "Not found" isn't obvious</w:t>
+      </w:r>
+      <w:r>
+        <w:rPr>
+          <w:lang w:val="en-US"/>
+        </w:rPr>
+        <w:br/>
+        <w:t>NCBI's esearch clearly returns an empty IdList when nothing matches. BOLD's preprocessor step </w:t>
+      </w:r>
+      <w:r>
+        <w:rPr>
+          <w:i/>
+          <w:iCs/>
+          <w:lang w:val="en-US"/>
+        </w:rPr>
+        <w:t>always</w:t>
+      </w:r>
+      <w:r>
+        <w:rPr>
+          <w:lang w:val="en-US"/>
+        </w:rPr>
+        <w:t> returns a "successful" match — even garbage input like Zzznonexistentplantxyz gets silently reinterpreted as an ID search and produces a valid query_id. The actual "no data" signal only shows up as an empty response body at the final download step. Easy to miss and assume the request worked.</w:t>
+      </w:r>
+    </w:p>
+    <w:p>
+      <w:pPr>
+        <w:ind w:left="1416"/>
+        <w:rPr>
+          <w:lang w:val="en-US"/>
+        </w:rPr>
+      </w:pPr>
+      <w:r>
+        <w:rPr>
+          <w:lang w:val="en-US"/>
+        </w:rPr>
+        <w:t>5. Marker naming isn't consistent</w:t>
+      </w:r>
+      <w:r>
+        <w:rPr>
+          <w:lang w:val="en-US"/>
+        </w:rPr>
+        <w:br/>
+        <w:t>NCBI/GenBank convention writes psbA-trnH; BOLD stores the same marker as trnH-psbA (genes reversed). A naive string match would silently return zero hits for that marker. I had to write a normalizer that splits on -, lowercases, and sorts the parts before comparing.</w:t>
+      </w:r>
+    </w:p>
+    <w:p>
+      <w:pPr>
+        <w:ind w:left="1416"/>
+      </w:pPr>
+      <w:r>
+        <w:lastRenderedPageBreak/>
+        <w:t>6. Field mapping quirks</w:t>
+      </w:r>
+    </w:p>
+    <w:p>
+      <w:pPr>
         <w:numPr>
           <w:ilvl w:val="0"/>
-          <w:numId w:val="1"/>
+          <w:numId w:val="3"/>
         </w:numPr>
-        <w:shd w:val="clear" w:color="auto" w:fill="121314"/>
-        <w:spacing w:after="0" w:line="285" w:lineRule="atLeast"/>
-        <w:rPr>
-          <w:rFonts w:ascii="Consolas" w:eastAsia="Times New Roman" w:hAnsi="Consolas" w:cs="Times New Roman"/>
-          <w:color w:val="BBBEBF"/>
-          <w:kern w:val="0"/>
-          <w:sz w:val="21"/>
-          <w:szCs w:val="21"/>
-          <w:lang w:eastAsia="nl-NL"/>
-          <w14:ligatures w14:val="none"/>
-        </w:rPr>
-      </w:pPr>
-      <w:r>
-        <w:rPr>
-          <w:rFonts w:ascii="Consolas" w:eastAsia="Times New Roman" w:hAnsi="Consolas" w:cs="Times New Roman"/>
-          <w:color w:val="A5D6FF"/>
-          <w:kern w:val="0"/>
-          <w:sz w:val="21"/>
-          <w:szCs w:val="21"/>
-          <w:lang w:eastAsia="nl-NL"/>
-          <w14:ligatures w14:val="none"/>
-        </w:rPr>
-        <w:t xml:space="preserve">record = </w:t>
-      </w:r>
-      <w:proofErr w:type="spellStart"/>
-      <w:r>
-        <w:rPr>
-          <w:rFonts w:ascii="Consolas" w:eastAsia="Times New Roman" w:hAnsi="Consolas" w:cs="Times New Roman"/>
-          <w:color w:val="A5D6FF"/>
-          <w:kern w:val="0"/>
-          <w:sz w:val="21"/>
-          <w:szCs w:val="21"/>
-          <w:lang w:eastAsia="nl-NL"/>
-          <w14:ligatures w14:val="none"/>
-        </w:rPr>
-        <w:t>Entrez.read</w:t>
-      </w:r>
-      <w:proofErr w:type="spellEnd"/>
-      <w:r>
-        <w:rPr>
-          <w:rFonts w:ascii="Consolas" w:eastAsia="Times New Roman" w:hAnsi="Consolas" w:cs="Times New Roman"/>
-          <w:color w:val="A5D6FF"/>
-          <w:kern w:val="0"/>
-          <w:sz w:val="21"/>
-          <w:szCs w:val="21"/>
-          <w:lang w:eastAsia="nl-NL"/>
-          <w14:ligatures w14:val="none"/>
-        </w:rPr>
-        <w:t>(handle)</w:t>
-      </w:r>
-    </w:p>
-    <w:p>
-      <w:pPr>
-        <w:pStyle w:val="Lijstalinea"/>
+        <w:rPr>
+          <w:lang w:val="en-US"/>
+        </w:rPr>
+      </w:pPr>
+      <w:r>
+        <w:rPr>
+          <w:lang w:val="en-US"/>
+        </w:rPr>
+        <w:t>country/ocean — the literal JSON key contains a /, which is fine in Python dicts but easy to fumble with typos.</w:t>
+      </w:r>
+    </w:p>
+    <w:p>
+      <w:pPr>
         <w:numPr>
           <w:ilvl w:val="0"/>
-          <w:numId w:val="1"/>
+          <w:numId w:val="3"/>
         </w:numPr>
-        <w:shd w:val="clear" w:color="auto" w:fill="121314"/>
-        <w:spacing w:after="0" w:line="285" w:lineRule="atLeast"/>
-        <w:rPr>
-          <w:rFonts w:ascii="Consolas" w:eastAsia="Times New Roman" w:hAnsi="Consolas" w:cs="Times New Roman"/>
-          <w:color w:val="BBBEBF"/>
-          <w:kern w:val="0"/>
-          <w:sz w:val="21"/>
-          <w:szCs w:val="21"/>
-          <w:lang w:eastAsia="nl-NL"/>
-          <w14:ligatures w14:val="none"/>
-        </w:rPr>
-      </w:pPr>
-      <w:proofErr w:type="spellStart"/>
-      <w:r>
-        <w:rPr>
-          <w:rFonts w:ascii="Consolas" w:eastAsia="Times New Roman" w:hAnsi="Consolas" w:cs="Times New Roman"/>
-          <w:color w:val="A5D6FF"/>
-          <w:kern w:val="0"/>
-          <w:sz w:val="21"/>
-          <w:szCs w:val="21"/>
-          <w:lang w:eastAsia="nl-NL"/>
-          <w14:ligatures w14:val="none"/>
-        </w:rPr>
-        <w:t>handle.close</w:t>
-      </w:r>
-      <w:proofErr w:type="spellEnd"/>
-      <w:r>
-        <w:rPr>
-          <w:rFonts w:ascii="Consolas" w:eastAsia="Times New Roman" w:hAnsi="Consolas" w:cs="Times New Roman"/>
-          <w:color w:val="A5D6FF"/>
-          <w:kern w:val="0"/>
-          <w:sz w:val="21"/>
-          <w:szCs w:val="21"/>
-          <w:lang w:eastAsia="nl-NL"/>
-          <w14:ligatures w14:val="none"/>
-        </w:rPr>
-        <w:t>()</w:t>
-      </w:r>
-    </w:p>
-    <w:p>
-      <w:pPr>
-        <w:pStyle w:val="Lijstalinea"/>
+        <w:rPr>
+          <w:lang w:val="en-US"/>
+        </w:rPr>
+      </w:pPr>
+      <w:r>
+        <w:rPr>
+          <w:lang w:val="en-US"/>
+        </w:rPr>
+        <w:t>Coordinates come back as a [lat, lon] list (or null), not a formatted string like NCBI's lat_lon qualifier — needed manual formatting.</w:t>
+      </w:r>
+    </w:p>
+    <w:p>
+      <w:pPr>
         <w:numPr>
           <w:ilvl w:val="0"/>
-          <w:numId w:val="1"/>
+          <w:numId w:val="3"/>
         </w:numPr>
-        <w:shd w:val="clear" w:color="auto" w:fill="121314"/>
-        <w:spacing w:after="0" w:line="285" w:lineRule="atLeast"/>
-        <w:rPr>
-          <w:rFonts w:ascii="Consolas" w:eastAsia="Times New Roman" w:hAnsi="Consolas" w:cs="Times New Roman"/>
-          <w:color w:val="BBBEBF"/>
-          <w:kern w:val="0"/>
-          <w:sz w:val="21"/>
-          <w:szCs w:val="21"/>
-          <w:lang w:eastAsia="nl-NL"/>
-          <w14:ligatures w14:val="none"/>
-        </w:rPr>
-      </w:pPr>
-    </w:p>
-    <w:p>
-      <w:pPr>
-        <w:pStyle w:val="Lijstalinea"/>
+        <w:rPr>
+          <w:lang w:val="en-US"/>
+        </w:rPr>
+      </w:pPr>
+      <w:r>
+        <w:rPr>
+          <w:lang w:val="en-US"/>
+        </w:rPr>
+        <w:t>No direct "voucher" field — had to fall back through museumid → sampleid.</w:t>
+      </w:r>
+    </w:p>
+    <w:p>
+      <w:pPr>
         <w:numPr>
           <w:ilvl w:val="0"/>
-          <w:numId w:val="1"/>
+          <w:numId w:val="3"/>
         </w:numPr>
-        <w:shd w:val="clear" w:color="auto" w:fill="121314"/>
-        <w:spacing w:after="0" w:line="285" w:lineRule="atLeast"/>
-        <w:rPr>
-          <w:rFonts w:ascii="Consolas" w:eastAsia="Times New Roman" w:hAnsi="Consolas" w:cs="Times New Roman"/>
-          <w:color w:val="BBBEBF"/>
-          <w:kern w:val="0"/>
-          <w:sz w:val="21"/>
-          <w:szCs w:val="21"/>
-          <w:lang w:eastAsia="nl-NL"/>
-          <w14:ligatures w14:val="none"/>
-        </w:rPr>
-      </w:pPr>
-      <w:r>
-        <w:rPr>
-          <w:rFonts w:ascii="Consolas" w:eastAsia="Times New Roman" w:hAnsi="Consolas" w:cs="Times New Roman"/>
-          <w:color w:val="A5D6FF"/>
-          <w:kern w:val="0"/>
-          <w:sz w:val="21"/>
-          <w:szCs w:val="21"/>
-          <w:lang w:eastAsia="nl-NL"/>
-          <w14:ligatures w14:val="none"/>
-        </w:rPr>
-        <w:t>print(record)</w:t>
-      </w:r>
-    </w:p>
-    <w:p>
-      <w:pPr>
-        <w:pStyle w:val="Lijstalinea"/>
-        <w:numPr>
-          <w:ilvl w:val="0"/>
-          <w:numId w:val="1"/>
-        </w:numPr>
-        <w:shd w:val="clear" w:color="auto" w:fill="121314"/>
-        <w:spacing w:after="0" w:line="285" w:lineRule="atLeast"/>
-        <w:rPr>
-          <w:rFonts w:ascii="Consolas" w:eastAsia="Times New Roman" w:hAnsi="Consolas" w:cs="Times New Roman"/>
-          <w:color w:val="BBBEBF"/>
-          <w:kern w:val="0"/>
-          <w:sz w:val="21"/>
-          <w:szCs w:val="21"/>
-          <w:lang w:eastAsia="nl-NL"/>
-          <w14:ligatures w14:val="none"/>
-        </w:rPr>
-      </w:pPr>
-    </w:p>
-    <w:p>
-      <w:pPr>
-        <w:pStyle w:val="Lijstalinea"/>
-        <w:numPr>
-          <w:ilvl w:val="0"/>
-          <w:numId w:val="1"/>
-        </w:numPr>
-        <w:shd w:val="clear" w:color="auto" w:fill="121314"/>
-        <w:spacing w:after="0" w:line="285" w:lineRule="atLeast"/>
-        <w:rPr>
-          <w:rFonts w:ascii="Consolas" w:eastAsia="Times New Roman" w:hAnsi="Consolas" w:cs="Times New Roman"/>
-          <w:color w:val="BBBEBF"/>
-          <w:kern w:val="0"/>
-          <w:sz w:val="21"/>
-          <w:szCs w:val="21"/>
-          <w:lang w:eastAsia="nl-NL"/>
-          <w14:ligatures w14:val="none"/>
-        </w:rPr>
-      </w:pPr>
-      <w:r>
-        <w:rPr>
-          <w:rFonts w:ascii="Consolas" w:eastAsia="Times New Roman" w:hAnsi="Consolas" w:cs="Times New Roman"/>
-          <w:color w:val="A5D6FF"/>
-          <w:kern w:val="0"/>
-          <w:sz w:val="21"/>
-          <w:szCs w:val="21"/>
-          <w:lang w:eastAsia="nl-NL"/>
-          <w14:ligatures w14:val="none"/>
-        </w:rPr>
-        <w:t>'''</w:t>
+        <w:rPr>
+          <w:lang w:val="en-US"/>
+        </w:rPr>
+      </w:pPr>
+      <w:r>
+        <w:rPr>
+          <w:lang w:val="en-US"/>
+        </w:rPr>
+        <w:t>No API key/email needed (unlike Entrez), which is simpler, but also means no rate-limit headers to calibrate the sleep timer against.</w:t>
       </w:r>
     </w:p>
     <w:p>
       <w:pPr>
         <w:ind w:left="1416"/>
-      </w:pPr>
-    </w:p>
-    <w:p>
-      <w:pPr>
-        <w:ind w:left="1416"/>
-        <w:rPr>
-          <w:lang w:val="en-BE"/>
-        </w:rPr>
-      </w:pPr>
-      <w:r>
-        <w:rPr>
-          <w:lang w:val="en-BE"/>
-        </w:rPr>
-        <w:t xml:space="preserve">1 search term </w:t>
-      </w:r>
-      <w:proofErr w:type="spellStart"/>
-      <w:r>
-        <w:rPr>
-          <w:lang w:val="en-BE"/>
-        </w:rPr>
-        <w:t>werk</w:t>
-      </w:r>
-      <w:proofErr w:type="spellEnd"/>
-      <w:r>
-        <w:rPr>
-          <w:lang w:val="en-BE"/>
-        </w:rPr>
-        <w:t xml:space="preserve">, </w:t>
-      </w:r>
-      <w:proofErr w:type="spellStart"/>
-      <w:r>
-        <w:rPr>
-          <w:lang w:val="en-BE"/>
-        </w:rPr>
-        <w:t>testen</w:t>
-      </w:r>
-      <w:proofErr w:type="spellEnd"/>
-      <w:r>
-        <w:rPr>
-          <w:lang w:val="en-BE"/>
-        </w:rPr>
-        <w:t xml:space="preserve"> op subset van de data</w:t>
-      </w:r>
-      <w:r>
-        <w:rPr>
-          <w:lang w:val="en-BE"/>
-        </w:rPr>
-        <w:t xml:space="preserve"> </w:t>
-      </w:r>
-      <w:r>
-        <w:rPr>
-          <w:lang w:val="en-BE"/>
-        </w:rPr>
-        <w:sym w:font="Wingdings" w:char="F0E0"/>
-      </w:r>
-      <w:r>
-        <w:rPr>
-          <w:lang w:val="en-BE"/>
-        </w:rPr>
-        <w:t xml:space="preserve"> script </w:t>
-      </w:r>
-      <w:proofErr w:type="spellStart"/>
-      <w:r>
-        <w:rPr>
-          <w:lang w:val="en-BE"/>
-        </w:rPr>
-        <w:t>geeft</w:t>
-      </w:r>
-      <w:proofErr w:type="spellEnd"/>
-      <w:r>
-        <w:rPr>
-          <w:lang w:val="en-BE"/>
-        </w:rPr>
-        <w:t xml:space="preserve"> </w:t>
-      </w:r>
-      <w:proofErr w:type="spellStart"/>
-      <w:r>
-        <w:rPr>
-          <w:lang w:val="en-BE"/>
-        </w:rPr>
-        <w:t>accesie</w:t>
-      </w:r>
-      <w:proofErr w:type="spellEnd"/>
-      <w:r>
-        <w:rPr>
-          <w:lang w:val="en-BE"/>
-        </w:rPr>
-        <w:t xml:space="preserve"> numbers maar de </w:t>
-      </w:r>
-      <w:proofErr w:type="spellStart"/>
-      <w:r>
-        <w:rPr>
-          <w:lang w:val="en-BE"/>
-        </w:rPr>
-        <w:t>zoekterm</w:t>
-      </w:r>
-      <w:proofErr w:type="spellEnd"/>
-      <w:r>
-        <w:rPr>
-          <w:lang w:val="en-BE"/>
-        </w:rPr>
-        <w:t xml:space="preserve"> is </w:t>
-      </w:r>
-      <w:proofErr w:type="spellStart"/>
-      <w:r>
-        <w:rPr>
-          <w:lang w:val="en-BE"/>
-        </w:rPr>
-        <w:t>niet</w:t>
-      </w:r>
-      <w:proofErr w:type="spellEnd"/>
-      <w:r>
-        <w:rPr>
-          <w:lang w:val="en-BE"/>
-        </w:rPr>
-        <w:t xml:space="preserve"> </w:t>
-      </w:r>
-      <w:proofErr w:type="spellStart"/>
-      <w:r>
-        <w:rPr>
-          <w:lang w:val="en-BE"/>
-        </w:rPr>
-        <w:t>specefiek</w:t>
-      </w:r>
-      <w:proofErr w:type="spellEnd"/>
-      <w:r>
-        <w:rPr>
-          <w:lang w:val="en-BE"/>
-        </w:rPr>
-        <w:t xml:space="preserve"> </w:t>
-      </w:r>
-      <w:proofErr w:type="spellStart"/>
-      <w:r>
-        <w:rPr>
-          <w:lang w:val="en-BE"/>
-        </w:rPr>
-        <w:t>genoeg</w:t>
-      </w:r>
-      <w:proofErr w:type="spellEnd"/>
-      <w:r>
-        <w:rPr>
-          <w:lang w:val="en-BE"/>
-        </w:rPr>
-        <w:t xml:space="preserve">. </w:t>
-      </w:r>
-      <w:proofErr w:type="spellStart"/>
-      <w:r>
-        <w:rPr>
-          <w:lang w:val="en-BE"/>
-        </w:rPr>
-        <w:t>Proberen</w:t>
-      </w:r>
-      <w:proofErr w:type="spellEnd"/>
-      <w:r>
-        <w:rPr>
-          <w:lang w:val="en-BE"/>
-        </w:rPr>
-        <w:t xml:space="preserve"> van </w:t>
-      </w:r>
-      <w:proofErr w:type="spellStart"/>
-      <w:r>
-        <w:rPr>
-          <w:lang w:val="en-BE"/>
-        </w:rPr>
-        <w:t>zoeken</w:t>
-      </w:r>
-      <w:proofErr w:type="spellEnd"/>
-      <w:r>
-        <w:rPr>
-          <w:lang w:val="en-BE"/>
-        </w:rPr>
-        <w:t xml:space="preserve"> met </w:t>
-      </w:r>
-      <w:proofErr w:type="spellStart"/>
-      <w:r>
-        <w:rPr>
-          <w:lang w:val="en-BE"/>
-        </w:rPr>
-        <w:t>een</w:t>
-      </w:r>
-      <w:proofErr w:type="spellEnd"/>
-      <w:r>
-        <w:rPr>
-          <w:lang w:val="en-BE"/>
-        </w:rPr>
-        <w:t xml:space="preserve"> query met </w:t>
-      </w:r>
-      <w:proofErr w:type="spellStart"/>
-      <w:r>
-        <w:rPr>
-          <w:lang w:val="en-BE"/>
-        </w:rPr>
-        <w:t>verschillende</w:t>
-      </w:r>
-      <w:proofErr w:type="spellEnd"/>
-      <w:r>
-        <w:rPr>
-          <w:lang w:val="en-BE"/>
-        </w:rPr>
-        <w:t xml:space="preserve"> </w:t>
-      </w:r>
-      <w:proofErr w:type="spellStart"/>
-      <w:r>
-        <w:rPr>
-          <w:lang w:val="en-BE"/>
-        </w:rPr>
-        <w:t>zoektermen</w:t>
-      </w:r>
-      <w:proofErr w:type="spellEnd"/>
-    </w:p>
-    <w:p>
-      <w:pPr>
-        <w:ind w:left="1416"/>
-        <w:rPr>
-          <w:lang w:val="en-BE"/>
-        </w:rPr>
-      </w:pPr>
-      <w:proofErr w:type="spellStart"/>
-      <w:r>
-        <w:rPr>
-          <w:lang w:val="en-BE"/>
-        </w:rPr>
-        <w:t>Tietel</w:t>
-      </w:r>
-      <w:proofErr w:type="spellEnd"/>
-      <w:r>
-        <w:rPr>
-          <w:lang w:val="en-BE"/>
-        </w:rPr>
-        <w:t xml:space="preserve"> </w:t>
-      </w:r>
-      <w:proofErr w:type="spellStart"/>
-      <w:r>
-        <w:rPr>
-          <w:lang w:val="en-BE"/>
-        </w:rPr>
-        <w:t>toegevoed</w:t>
-      </w:r>
-      <w:proofErr w:type="spellEnd"/>
-      <w:r>
-        <w:rPr>
-          <w:lang w:val="en-BE"/>
-        </w:rPr>
-        <w:t xml:space="preserve"> per keyword om </w:t>
-      </w:r>
-      <w:proofErr w:type="spellStart"/>
-      <w:r>
-        <w:rPr>
-          <w:lang w:val="en-BE"/>
-        </w:rPr>
-        <w:t>overzicht</w:t>
-      </w:r>
-      <w:proofErr w:type="spellEnd"/>
-      <w:r>
-        <w:rPr>
-          <w:lang w:val="en-BE"/>
-        </w:rPr>
-        <w:t xml:space="preserve"> </w:t>
-      </w:r>
-      <w:proofErr w:type="spellStart"/>
-      <w:r>
-        <w:rPr>
-          <w:lang w:val="en-BE"/>
-        </w:rPr>
-        <w:t>te</w:t>
-      </w:r>
-      <w:proofErr w:type="spellEnd"/>
-      <w:r>
-        <w:rPr>
-          <w:lang w:val="en-BE"/>
-        </w:rPr>
-        <w:t xml:space="preserve">   </w:t>
-      </w:r>
-      <w:proofErr w:type="spellStart"/>
-      <w:r>
-        <w:rPr>
-          <w:lang w:val="en-BE"/>
-        </w:rPr>
-        <w:t>geven</w:t>
-      </w:r>
-      <w:proofErr w:type="spellEnd"/>
-      <w:r>
-        <w:rPr>
-          <w:lang w:val="en-BE"/>
-        </w:rPr>
-        <w:t xml:space="preserve"> van </w:t>
-      </w:r>
-      <w:proofErr w:type="spellStart"/>
-      <w:r>
-        <w:rPr>
-          <w:lang w:val="en-BE"/>
-        </w:rPr>
-        <w:t>vershillen</w:t>
-      </w:r>
-      <w:proofErr w:type="spellEnd"/>
+        <w:rPr>
+          <w:lang w:val="en-US"/>
+        </w:rPr>
+      </w:pPr>
+      <w:r>
+        <w:rPr>
+          <w:lang w:val="en-US"/>
+        </w:rPr>
+        <w:t>7. Documentation was actually the hardest part</w:t>
+      </w:r>
+      <w:r>
+        <w:rPr>
+          <w:lang w:val="en-US"/>
+        </w:rPr>
+        <w:br/>
+        <w:t>Both the old (v4.boldsystems.org) and new (portal.boldsystems.org/api/docs) doc pages returned 403s to automated fetches. I ended up reverse-engineering the real behavior by hitting the live endpoints with curl and inspecting raw responses rather than reading a spec — which is also how I caught the JSONL format and the "always succeeds" preprocessor quirk above.</w:t>
+      </w:r>
+    </w:p>
+    <w:p>
+      <w:r>
+        <w:rPr>
+          <w:lang w:val="en-US"/>
+        </w:rPr>
+        <w:tab/>
+      </w:r>
+      <w:r>
+        <w:t>Resttime van 0,1 werkt niet moet p</w:t>
+      </w:r>
+      <w:r>
+        <w:t>roberen met een langere rest time</w:t>
+      </w:r>
     </w:p>
     <w:sectPr>
       <w:pgSz w:w="11906" w:h="16838"/>
@@ -1306,6 +1149,304 @@
 <file path=word/numbering.xml><?xml version="1.0" encoding="utf-8"?>
 <w:numbering xmlns:wpc="http://schemas.microsoft.com/office/word/2010/wordprocessingCanvas" xmlns:cx="http://schemas.microsoft.com/office/drawing/2014/chartex" xmlns:cx1="http://schemas.microsoft.com/office/drawing/2015/9/8/chartex" xmlns:cx2="http://schemas.microsoft.com/office/drawing/2015/10/21/chartex" xmlns:cx3="http://schemas.microsoft.com/office/drawing/2016/5/9/chartex" xmlns:cx4="http://schemas.microsoft.com/office/drawing/2016/5/10/chartex" xmlns:cx5="http://schemas.microsoft.com/office/drawing/2016/5/11/chartex" xmlns:cx6="http://schemas.microsoft.com/office/drawing/2016/5/12/chartex" xmlns:cx7="http://schemas.microsoft.com/office/drawing/2016/5/13/chartex" xmlns:cx8="http://schemas.microsoft.com/office/drawing/2016/5/14/chartex" xmlns:mc="http://schemas.openxmlformats.org/markup-compatibility/2006" xmlns:aink="http://schemas.microsoft.com/office/drawing/2016/ink" xmlns:am3d="http://schemas.microsoft.com/office/drawing/2017/model3d" xmlns:o="urn:schemas-microsoft-com:office:office" xmlns:oel="http://schemas.microsoft.com/office/2019/extlst" xmlns:r="http://schemas.openxmlformats.org/officeDocument/2006/relationships" xmlns:m="http://schemas.openxmlformats.org/officeDocument/2006/math" xmlns:v="urn:schemas-microsoft-com:vml" xmlns:wp14="http://schemas.microsoft.com/office/word/2010/wordprocessingDrawing" xmlns:wp="http://schemas.openxmlformats.org/drawingml/2006/wordprocessingDrawing" xmlns:w10="urn:schemas-microsoft-com:office:word" xmlns:w="http://schemas.openxmlformats.org/wordprocessingml/2006/main" xmlns:w14="http://schemas.microsoft.com/office/word/2010/wordml" xmlns:w15="http://schemas.microsoft.com/office/word/2012/wordml" xmlns:w16cex="http://schemas.microsoft.com/office/word/2018/wordml/cex" xmlns:w16cid="http://schemas.microsoft.com/office/word/2016/wordml/cid" xmlns:w16="http://schemas.microsoft.com/office/word/2018/wordml" xmlns:w16du="http://schemas.microsoft.com/office/word/2023/wordml/word16du" xmlns:w16sdtdh="http://schemas.microsoft.com/office/word/2020/wordml/sdtdatahash" xmlns:w16sdtfl="http://schemas.microsoft.com/office/word/2024/wordml/sdtformatlock" xmlns:w16se="http://schemas.microsoft.com/office/word/2015/wordml/symex" xmlns:wpg="http://schemas.microsoft.com/office/word/2010/wordprocessingGroup" xmlns:wpi="http://schemas.microsoft.com/office/word/2010/wordprocessingInk" xmlns:wne="http://schemas.microsoft.com/office/word/2006/wordml" xmlns:wps="http://schemas.microsoft.com/office/word/2010/wordprocessingShape" mc:Ignorable="w14 w15 w16se w16cid w16 w16cex w16sdtdh w16sdtfl w16du wp14">
   <w:abstractNum w:abstractNumId="0" w15:restartNumberingAfterBreak="0">
+    <w:nsid w:val="0BDF2136"/>
+    <w:multiLevelType w:val="multilevel"/>
+    <w:tmpl w:val="970E872C"/>
+    <w:lvl w:ilvl="0">
+      <w:start w:val="1"/>
+      <w:numFmt w:val="bullet"/>
+      <w:lvlText w:val=""/>
+      <w:lvlJc w:val="left"/>
+      <w:pPr>
+        <w:tabs>
+          <w:tab w:val="num" w:pos="720"/>
+        </w:tabs>
+        <w:ind w:left="720" w:hanging="360"/>
+      </w:pPr>
+      <w:rPr>
+        <w:rFonts w:ascii="Symbol" w:hAnsi="Symbol" w:hint="default"/>
+        <w:sz w:val="20"/>
+      </w:rPr>
+    </w:lvl>
+    <w:lvl w:ilvl="1" w:tentative="1">
+      <w:start w:val="1"/>
+      <w:numFmt w:val="bullet"/>
+      <w:lvlText w:val="o"/>
+      <w:lvlJc w:val="left"/>
+      <w:pPr>
+        <w:tabs>
+          <w:tab w:val="num" w:pos="1440"/>
+        </w:tabs>
+        <w:ind w:left="1440" w:hanging="360"/>
+      </w:pPr>
+      <w:rPr>
+        <w:rFonts w:ascii="Courier New" w:hAnsi="Courier New" w:hint="default"/>
+        <w:sz w:val="20"/>
+      </w:rPr>
+    </w:lvl>
+    <w:lvl w:ilvl="2" w:tentative="1">
+      <w:start w:val="1"/>
+      <w:numFmt w:val="bullet"/>
+      <w:lvlText w:val=""/>
+      <w:lvlJc w:val="left"/>
+      <w:pPr>
+        <w:tabs>
+          <w:tab w:val="num" w:pos="2160"/>
+        </w:tabs>
+        <w:ind w:left="2160" w:hanging="360"/>
+      </w:pPr>
+      <w:rPr>
+        <w:rFonts w:ascii="Wingdings" w:hAnsi="Wingdings" w:hint="default"/>
+        <w:sz w:val="20"/>
+      </w:rPr>
+    </w:lvl>
+    <w:lvl w:ilvl="3" w:tentative="1">
+      <w:start w:val="1"/>
+      <w:numFmt w:val="bullet"/>
+      <w:lvlText w:val=""/>
+      <w:lvlJc w:val="left"/>
+      <w:pPr>
+        <w:tabs>
+          <w:tab w:val="num" w:pos="2880"/>
+        </w:tabs>
+        <w:ind w:left="2880" w:hanging="360"/>
+      </w:pPr>
+      <w:rPr>
+        <w:rFonts w:ascii="Wingdings" w:hAnsi="Wingdings" w:hint="default"/>
+        <w:sz w:val="20"/>
+      </w:rPr>
+    </w:lvl>
+    <w:lvl w:ilvl="4" w:tentative="1">
+      <w:start w:val="1"/>
+      <w:numFmt w:val="bullet"/>
+      <w:lvlText w:val=""/>
+      <w:lvlJc w:val="left"/>
+      <w:pPr>
+        <w:tabs>
+          <w:tab w:val="num" w:pos="3600"/>
+        </w:tabs>
+        <w:ind w:left="3600" w:hanging="360"/>
+      </w:pPr>
+      <w:rPr>
+        <w:rFonts w:ascii="Wingdings" w:hAnsi="Wingdings" w:hint="default"/>
+        <w:sz w:val="20"/>
+      </w:rPr>
+    </w:lvl>
+    <w:lvl w:ilvl="5" w:tentative="1">
+      <w:start w:val="1"/>
+      <w:numFmt w:val="bullet"/>
+      <w:lvlText w:val=""/>
+      <w:lvlJc w:val="left"/>
+      <w:pPr>
+        <w:tabs>
+          <w:tab w:val="num" w:pos="4320"/>
+        </w:tabs>
+        <w:ind w:left="4320" w:hanging="360"/>
+      </w:pPr>
+      <w:rPr>
+        <w:rFonts w:ascii="Wingdings" w:hAnsi="Wingdings" w:hint="default"/>
+        <w:sz w:val="20"/>
+      </w:rPr>
+    </w:lvl>
+    <w:lvl w:ilvl="6" w:tentative="1">
+      <w:start w:val="1"/>
+      <w:numFmt w:val="bullet"/>
+      <w:lvlText w:val=""/>
+      <w:lvlJc w:val="left"/>
+      <w:pPr>
+        <w:tabs>
+          <w:tab w:val="num" w:pos="5040"/>
+        </w:tabs>
+        <w:ind w:left="5040" w:hanging="360"/>
+      </w:pPr>
+      <w:rPr>
+        <w:rFonts w:ascii="Wingdings" w:hAnsi="Wingdings" w:hint="default"/>
+        <w:sz w:val="20"/>
+      </w:rPr>
+    </w:lvl>
+    <w:lvl w:ilvl="7" w:tentative="1">
+      <w:start w:val="1"/>
+      <w:numFmt w:val="bullet"/>
+      <w:lvlText w:val=""/>
+      <w:lvlJc w:val="left"/>
+      <w:pPr>
+        <w:tabs>
+          <w:tab w:val="num" w:pos="5760"/>
+        </w:tabs>
+        <w:ind w:left="5760" w:hanging="360"/>
+      </w:pPr>
+      <w:rPr>
+        <w:rFonts w:ascii="Wingdings" w:hAnsi="Wingdings" w:hint="default"/>
+        <w:sz w:val="20"/>
+      </w:rPr>
+    </w:lvl>
+    <w:lvl w:ilvl="8" w:tentative="1">
+      <w:start w:val="1"/>
+      <w:numFmt w:val="bullet"/>
+      <w:lvlText w:val=""/>
+      <w:lvlJc w:val="left"/>
+      <w:pPr>
+        <w:tabs>
+          <w:tab w:val="num" w:pos="6480"/>
+        </w:tabs>
+        <w:ind w:left="6480" w:hanging="360"/>
+      </w:pPr>
+      <w:rPr>
+        <w:rFonts w:ascii="Wingdings" w:hAnsi="Wingdings" w:hint="default"/>
+        <w:sz w:val="20"/>
+      </w:rPr>
+    </w:lvl>
+  </w:abstractNum>
+  <w:abstractNum w:abstractNumId="1" w15:restartNumberingAfterBreak="0">
+    <w:nsid w:val="1DCB2FB8"/>
+    <w:multiLevelType w:val="multilevel"/>
+    <w:tmpl w:val="CDACF7C4"/>
+    <w:lvl w:ilvl="0">
+      <w:start w:val="1"/>
+      <w:numFmt w:val="bullet"/>
+      <w:lvlText w:val=""/>
+      <w:lvlJc w:val="left"/>
+      <w:pPr>
+        <w:tabs>
+          <w:tab w:val="num" w:pos="720"/>
+        </w:tabs>
+        <w:ind w:left="720" w:hanging="360"/>
+      </w:pPr>
+      <w:rPr>
+        <w:rFonts w:ascii="Symbol" w:hAnsi="Symbol" w:hint="default"/>
+        <w:sz w:val="20"/>
+      </w:rPr>
+    </w:lvl>
+    <w:lvl w:ilvl="1" w:tentative="1">
+      <w:start w:val="1"/>
+      <w:numFmt w:val="bullet"/>
+      <w:lvlText w:val="o"/>
+      <w:lvlJc w:val="left"/>
+      <w:pPr>
+        <w:tabs>
+          <w:tab w:val="num" w:pos="1440"/>
+        </w:tabs>
+        <w:ind w:left="1440" w:hanging="360"/>
+      </w:pPr>
+      <w:rPr>
+        <w:rFonts w:ascii="Courier New" w:hAnsi="Courier New" w:hint="default"/>
+        <w:sz w:val="20"/>
+      </w:rPr>
+    </w:lvl>
+    <w:lvl w:ilvl="2" w:tentative="1">
+      <w:start w:val="1"/>
+      <w:numFmt w:val="bullet"/>
+      <w:lvlText w:val=""/>
+      <w:lvlJc w:val="left"/>
+      <w:pPr>
+        <w:tabs>
+          <w:tab w:val="num" w:pos="2160"/>
+        </w:tabs>
+        <w:ind w:left="2160" w:hanging="360"/>
+      </w:pPr>
+      <w:rPr>
+        <w:rFonts w:ascii="Wingdings" w:hAnsi="Wingdings" w:hint="default"/>
+        <w:sz w:val="20"/>
+      </w:rPr>
+    </w:lvl>
+    <w:lvl w:ilvl="3" w:tentative="1">
+      <w:start w:val="1"/>
+      <w:numFmt w:val="bullet"/>
+      <w:lvlText w:val=""/>
+      <w:lvlJc w:val="left"/>
+      <w:pPr>
+        <w:tabs>
+          <w:tab w:val="num" w:pos="2880"/>
+        </w:tabs>
+        <w:ind w:left="2880" w:hanging="360"/>
+      </w:pPr>
+      <w:rPr>
+        <w:rFonts w:ascii="Wingdings" w:hAnsi="Wingdings" w:hint="default"/>
+        <w:sz w:val="20"/>
+      </w:rPr>
+    </w:lvl>
+    <w:lvl w:ilvl="4" w:tentative="1">
+      <w:start w:val="1"/>
+      <w:numFmt w:val="bullet"/>
+      <w:lvlText w:val=""/>
+      <w:lvlJc w:val="left"/>
+      <w:pPr>
+        <w:tabs>
+          <w:tab w:val="num" w:pos="3600"/>
+        </w:tabs>
+        <w:ind w:left="3600" w:hanging="360"/>
+      </w:pPr>
+      <w:rPr>
+        <w:rFonts w:ascii="Wingdings" w:hAnsi="Wingdings" w:hint="default"/>
+        <w:sz w:val="20"/>
+      </w:rPr>
+    </w:lvl>
+    <w:lvl w:ilvl="5" w:tentative="1">
+      <w:start w:val="1"/>
+      <w:numFmt w:val="bullet"/>
+      <w:lvlText w:val=""/>
+      <w:lvlJc w:val="left"/>
+      <w:pPr>
+        <w:tabs>
+          <w:tab w:val="num" w:pos="4320"/>
+        </w:tabs>
+        <w:ind w:left="4320" w:hanging="360"/>
+      </w:pPr>
+      <w:rPr>
+        <w:rFonts w:ascii="Wingdings" w:hAnsi="Wingdings" w:hint="default"/>
+        <w:sz w:val="20"/>
+      </w:rPr>
+    </w:lvl>
+    <w:lvl w:ilvl="6" w:tentative="1">
+      <w:start w:val="1"/>
+      <w:numFmt w:val="bullet"/>
+      <w:lvlText w:val=""/>
+      <w:lvlJc w:val="left"/>
+      <w:pPr>
+        <w:tabs>
+          <w:tab w:val="num" w:pos="5040"/>
+        </w:tabs>
+        <w:ind w:left="5040" w:hanging="360"/>
+      </w:pPr>
+      <w:rPr>
+        <w:rFonts w:ascii="Wingdings" w:hAnsi="Wingdings" w:hint="default"/>
+        <w:sz w:val="20"/>
+      </w:rPr>
+    </w:lvl>
+    <w:lvl w:ilvl="7" w:tentative="1">
+      <w:start w:val="1"/>
+      <w:numFmt w:val="bullet"/>
+      <w:lvlText w:val=""/>
+      <w:lvlJc w:val="left"/>
+      <w:pPr>
+        <w:tabs>
+          <w:tab w:val="num" w:pos="5760"/>
+        </w:tabs>
+        <w:ind w:left="5760" w:hanging="360"/>
+      </w:pPr>
+      <w:rPr>
+        <w:rFonts w:ascii="Wingdings" w:hAnsi="Wingdings" w:hint="default"/>
+        <w:sz w:val="20"/>
+      </w:rPr>
+    </w:lvl>
+    <w:lvl w:ilvl="8" w:tentative="1">
+      <w:start w:val="1"/>
+      <w:numFmt w:val="bullet"/>
+      <w:lvlText w:val=""/>
+      <w:lvlJc w:val="left"/>
+      <w:pPr>
+        <w:tabs>
+          <w:tab w:val="num" w:pos="6480"/>
+        </w:tabs>
+        <w:ind w:left="6480" w:hanging="360"/>
+      </w:pPr>
+      <w:rPr>
+        <w:rFonts w:ascii="Wingdings" w:hAnsi="Wingdings" w:hint="default"/>
+        <w:sz w:val="20"/>
+      </w:rPr>
+    </w:lvl>
+  </w:abstractNum>
+  <w:abstractNum w:abstractNumId="2" w15:restartNumberingAfterBreak="0">
     <w:nsid w:val="4ABB3DD6"/>
     <w:multiLevelType w:val="hybridMultilevel"/>
     <w:tmpl w:val="D186BFF2"/>
@@ -1418,7 +1559,13 @@
     </w:lvl>
   </w:abstractNum>
   <w:num w:numId="1" w16cid:durableId="1374963453">
+    <w:abstractNumId w:val="2"/>
+  </w:num>
+  <w:num w:numId="2" w16cid:durableId="460270665">
     <w:abstractNumId w:val="0"/>
+  </w:num>
+  <w:num w:numId="3" w16cid:durableId="1858887320">
+    <w:abstractNumId w:val="1"/>
   </w:num>
 </w:numbering>
 </file>

</xml_diff>

<commit_message>
Fasta output stored in df
</commit_message>
<xml_diff>
--- a/Stage Meise logbook.docx
+++ b/Stage Meise logbook.docx
@@ -835,21 +835,7 @@
         <w:rPr>
           <w:lang w:val="en-BE"/>
         </w:rPr>
-        <w:t xml:space="preserve">Code system </w:t>
-      </w:r>
-      <w:proofErr w:type="spellStart"/>
-      <w:r>
-        <w:rPr>
-          <w:lang w:val="en-BE"/>
-        </w:rPr>
-        <w:t>standardizeren</w:t>
-      </w:r>
-      <w:proofErr w:type="spellEnd"/>
-      <w:r>
-        <w:rPr>
-          <w:lang w:val="en-BE"/>
-        </w:rPr>
-        <w:t>.</w:t>
+        <w:t>Code system standardizeren.</w:t>
       </w:r>
     </w:p>
     <w:p>
@@ -889,23 +875,7 @@
         <w:ind w:left="1416"/>
       </w:pPr>
       <w:r>
-        <w:t xml:space="preserve">1. API </w:t>
-      </w:r>
-      <w:proofErr w:type="spellStart"/>
-      <w:r>
-        <w:t>shape</w:t>
-      </w:r>
-      <w:proofErr w:type="spellEnd"/>
-      <w:r>
-        <w:t xml:space="preserve"> is </w:t>
-      </w:r>
-      <w:proofErr w:type="spellStart"/>
-      <w:r>
-        <w:t>fundamentally</w:t>
-      </w:r>
-      <w:proofErr w:type="spellEnd"/>
-      <w:r>
-        <w:t xml:space="preserve"> different</w:t>
+        <w:t>1. API shape is fundamentally different</w:t>
       </w:r>
     </w:p>
     <w:p>
@@ -922,49 +892,7 @@
         <w:rPr>
           <w:lang w:val="en-US"/>
         </w:rPr>
-        <w:t>NCBI Entrez is a 2-call pattern: </w:t>
-      </w:r>
-      <w:proofErr w:type="spellStart"/>
-      <w:r>
-        <w:rPr>
-          <w:lang w:val="en-US"/>
-        </w:rPr>
-        <w:t>esearch</w:t>
-      </w:r>
-      <w:proofErr w:type="spellEnd"/>
-      <w:r>
-        <w:rPr>
-          <w:lang w:val="en-US"/>
-        </w:rPr>
-        <w:t> (get IDs) → </w:t>
-      </w:r>
-      <w:proofErr w:type="spellStart"/>
-      <w:r>
-        <w:rPr>
-          <w:lang w:val="en-US"/>
-        </w:rPr>
-        <w:t>efetch</w:t>
-      </w:r>
-      <w:proofErr w:type="spellEnd"/>
-      <w:r>
-        <w:rPr>
-          <w:lang w:val="en-US"/>
-        </w:rPr>
-        <w:t xml:space="preserve"> (get GenBank records), keyed by </w:t>
-      </w:r>
-      <w:proofErr w:type="spellStart"/>
-      <w:r>
-        <w:rPr>
-          <w:lang w:val="en-US"/>
-        </w:rPr>
-        <w:t>species+marker</w:t>
-      </w:r>
-      <w:proofErr w:type="spellEnd"/>
-      <w:r>
-        <w:rPr>
-          <w:lang w:val="en-US"/>
-        </w:rPr>
-        <w:t xml:space="preserve"> in one query.</w:t>
+        <w:t>NCBI Entrez is a 2-call pattern: esearch (get IDs) → efetch (get GenBank records), keyed by species+marker in one query.</w:t>
       </w:r>
     </w:p>
     <w:p>
@@ -981,63 +909,7 @@
         <w:rPr>
           <w:lang w:val="en-US"/>
         </w:rPr>
-        <w:t>BOLD v5 is a 3-step token flow: query/preprocessor (validate the term) → query (get a </w:t>
-      </w:r>
-      <w:proofErr w:type="spellStart"/>
-      <w:r>
-        <w:rPr>
-          <w:lang w:val="en-US"/>
-        </w:rPr>
-        <w:t>query_id</w:t>
-      </w:r>
-      <w:proofErr w:type="spellEnd"/>
-      <w:r>
-        <w:rPr>
-          <w:lang w:val="en-US"/>
-        </w:rPr>
-        <w:t>) → documents/&lt;</w:t>
-      </w:r>
-      <w:proofErr w:type="spellStart"/>
-      <w:r>
-        <w:rPr>
-          <w:lang w:val="en-US"/>
-        </w:rPr>
-        <w:t>query_id</w:t>
-      </w:r>
-      <w:proofErr w:type="spellEnd"/>
-      <w:r>
-        <w:rPr>
-          <w:lang w:val="en-US"/>
-        </w:rPr>
-        <w:t>&gt;/download (</w:t>
-      </w:r>
-      <w:proofErr w:type="gramStart"/>
-      <w:r>
-        <w:rPr>
-          <w:lang w:val="en-US"/>
-        </w:rPr>
-        <w:t>actually get</w:t>
-      </w:r>
-      <w:proofErr w:type="gramEnd"/>
-      <w:r>
-        <w:rPr>
-          <w:lang w:val="en-US"/>
-        </w:rPr>
-        <w:t xml:space="preserve"> data). You can't skip straight to fetching — you need that </w:t>
-      </w:r>
-      <w:proofErr w:type="spellStart"/>
-      <w:r>
-        <w:rPr>
-          <w:lang w:val="en-US"/>
-        </w:rPr>
-        <w:t>query_id</w:t>
-      </w:r>
-      <w:proofErr w:type="spellEnd"/>
-      <w:r>
-        <w:rPr>
-          <w:lang w:val="en-US"/>
-        </w:rPr>
-        <w:t> first.</w:t>
+        <w:t>BOLD v5 is a 3-step token flow: query/preprocessor (validate the term) → query (get a query_id) → documents/&lt;query_id&gt;/download (actually get data). You can't skip straight to fetching — you need that query_id first.</w:t>
       </w:r>
     </w:p>
     <w:p>
@@ -1058,35 +930,7 @@
           <w:lang w:val="en-US"/>
         </w:rPr>
         <w:br/>
-        <w:t xml:space="preserve">NCBI lets you put the marker directly in the search query ("species"[Organism] AND </w:t>
-      </w:r>
-      <w:proofErr w:type="spellStart"/>
-      <w:r>
-        <w:rPr>
-          <w:lang w:val="en-US"/>
-        </w:rPr>
-        <w:t>rbcL</w:t>
-      </w:r>
-      <w:proofErr w:type="spellEnd"/>
-      <w:r>
-        <w:rPr>
-          <w:lang w:val="en-US"/>
-        </w:rPr>
-        <w:t xml:space="preserve">). BOLD has no marker </w:t>
-      </w:r>
-      <w:proofErr w:type="gramStart"/>
-      <w:r>
-        <w:rPr>
-          <w:lang w:val="en-US"/>
-        </w:rPr>
-        <w:t>scope — a</w:t>
-      </w:r>
-      <w:proofErr w:type="gramEnd"/>
-      <w:r>
-        <w:rPr>
-          <w:lang w:val="en-US"/>
-        </w:rPr>
-        <w:t xml:space="preserve"> species query returns records for </w:t>
+        <w:t>NCBI lets you put the marker directly in the search query ("species"[Organism] AND rbcL). BOLD has no marker scope — a species query returns records for </w:t>
       </w:r>
       <w:r>
         <w:rPr>
@@ -1100,35 +944,7 @@
         <w:rPr>
           <w:lang w:val="en-US"/>
         </w:rPr>
-        <w:t> marker at once, and you filter by </w:t>
-      </w:r>
-      <w:proofErr w:type="spellStart"/>
-      <w:r>
-        <w:rPr>
-          <w:lang w:val="en-US"/>
-        </w:rPr>
-        <w:t>marker_code</w:t>
-      </w:r>
-      <w:proofErr w:type="spellEnd"/>
-      <w:r>
-        <w:rPr>
-          <w:lang w:val="en-US"/>
-        </w:rPr>
-        <w:t xml:space="preserve"> locally. I turned this into an advantage: fetch once per species, cache it, and </w:t>
-      </w:r>
-      <w:proofErr w:type="gramStart"/>
-      <w:r>
-        <w:rPr>
-          <w:lang w:val="en-US"/>
-        </w:rPr>
-        <w:t>reuse across</w:t>
-      </w:r>
-      <w:proofErr w:type="gramEnd"/>
-      <w:r>
-        <w:rPr>
-          <w:lang w:val="en-US"/>
-        </w:rPr>
-        <w:t xml:space="preserve"> all markers instead of hitting the API once per species-marker pair like the NCBI version does.</w:t>
+        <w:t> marker at once, and you filter by marker_code locally. I turned this into an advantage: fetch once per species, cache it, and reuse across all markers instead of hitting the API once per species-marker pair like the NCBI version does.</w:t>
       </w:r>
     </w:p>
     <w:p>
@@ -1149,51 +965,7 @@
           <w:lang w:val="en-US"/>
         </w:rPr>
         <w:br/>
-        <w:t>BOLD's download endpoint returns newline-delimited JSON, not a JSON array. If you </w:t>
-      </w:r>
-      <w:proofErr w:type="spellStart"/>
-      <w:proofErr w:type="gramStart"/>
-      <w:r>
-        <w:rPr>
-          <w:lang w:val="en-US"/>
-        </w:rPr>
-        <w:t>json.loads</w:t>
-      </w:r>
-      <w:proofErr w:type="spellEnd"/>
-      <w:proofErr w:type="gramEnd"/>
-      <w:r>
-        <w:rPr>
-          <w:lang w:val="en-US"/>
-        </w:rPr>
-        <w:t xml:space="preserve">() the whole response </w:t>
-      </w:r>
-      <w:proofErr w:type="gramStart"/>
-      <w:r>
-        <w:rPr>
-          <w:lang w:val="en-US"/>
-        </w:rPr>
-        <w:t>body</w:t>
-      </w:r>
-      <w:proofErr w:type="gramEnd"/>
-      <w:r>
-        <w:rPr>
-          <w:lang w:val="en-US"/>
-        </w:rPr>
-        <w:t xml:space="preserve"> you get a parse error — you </w:t>
-      </w:r>
-      <w:proofErr w:type="gramStart"/>
-      <w:r>
-        <w:rPr>
-          <w:lang w:val="en-US"/>
-        </w:rPr>
-        <w:t>have to</w:t>
-      </w:r>
-      <w:proofErr w:type="gramEnd"/>
-      <w:r>
-        <w:rPr>
-          <w:lang w:val="en-US"/>
-        </w:rPr>
-        <w:t xml:space="preserve"> split on newlines and parse each line individually. This isn't documented clearly anywhere; I only found it by hitting the live endpoint with curl.</w:t>
+        <w:t>BOLD's download endpoint returns newline-delimited JSON, not a JSON array. If you json.loads() the whole response body you get a parse error — you have to split on newlines and parse each line individually. This isn't documented clearly anywhere; I only found it by hitting the live endpoint with curl.</w:t>
       </w:r>
     </w:p>
     <w:p>
@@ -1214,35 +986,7 @@
           <w:lang w:val="en-US"/>
         </w:rPr>
         <w:br/>
-        <w:t>NCBI's </w:t>
-      </w:r>
-      <w:proofErr w:type="spellStart"/>
-      <w:r>
-        <w:rPr>
-          <w:lang w:val="en-US"/>
-        </w:rPr>
-        <w:t>esearch</w:t>
-      </w:r>
-      <w:proofErr w:type="spellEnd"/>
-      <w:r>
-        <w:rPr>
-          <w:lang w:val="en-US"/>
-        </w:rPr>
-        <w:t> clearly returns an empty </w:t>
-      </w:r>
-      <w:proofErr w:type="spellStart"/>
-      <w:r>
-        <w:rPr>
-          <w:lang w:val="en-US"/>
-        </w:rPr>
-        <w:t>IdList</w:t>
-      </w:r>
-      <w:proofErr w:type="spellEnd"/>
-      <w:r>
-        <w:rPr>
-          <w:lang w:val="en-US"/>
-        </w:rPr>
-        <w:t> when nothing matches. BOLD's preprocessor step </w:t>
+        <w:t>NCBI's esearch clearly returns an empty IdList when nothing matches. BOLD's preprocessor step </w:t>
       </w:r>
       <w:r>
         <w:rPr>
@@ -1256,35 +1000,7 @@
         <w:rPr>
           <w:lang w:val="en-US"/>
         </w:rPr>
-        <w:t> returns a "successful" match — even garbage input like </w:t>
-      </w:r>
-      <w:proofErr w:type="spellStart"/>
-      <w:r>
-        <w:rPr>
-          <w:lang w:val="en-US"/>
-        </w:rPr>
-        <w:t>Zzznonexistentplantxyz</w:t>
-      </w:r>
-      <w:proofErr w:type="spellEnd"/>
-      <w:r>
-        <w:rPr>
-          <w:lang w:val="en-US"/>
-        </w:rPr>
-        <w:t> gets silently reinterpreted as an ID search and produces a valid </w:t>
-      </w:r>
-      <w:proofErr w:type="spellStart"/>
-      <w:r>
-        <w:rPr>
-          <w:lang w:val="en-US"/>
-        </w:rPr>
-        <w:t>query_id</w:t>
-      </w:r>
-      <w:proofErr w:type="spellEnd"/>
-      <w:r>
-        <w:rPr>
-          <w:lang w:val="en-US"/>
-        </w:rPr>
-        <w:t>. The actual "no data" signal only shows up as an empty response body at the final download step. Easy to miss and assume the request worked.</w:t>
+        <w:t> returns a "successful" match — even garbage input like Zzznonexistentplantxyz gets silently reinterpreted as an ID search and produces a valid query_id. The actual "no data" signal only shows up as an empty response body at the final download step. Easy to miss and assume the request worked.</w:t>
       </w:r>
     </w:p>
     <w:p>
@@ -1305,35 +1021,7 @@
           <w:lang w:val="en-US"/>
         </w:rPr>
         <w:br/>
-        <w:t>NCBI/GenBank convention writes </w:t>
-      </w:r>
-      <w:proofErr w:type="spellStart"/>
-      <w:r>
-        <w:rPr>
-          <w:lang w:val="en-US"/>
-        </w:rPr>
-        <w:t>psbA-trnH</w:t>
-      </w:r>
-      <w:proofErr w:type="spellEnd"/>
-      <w:r>
-        <w:rPr>
-          <w:lang w:val="en-US"/>
-        </w:rPr>
-        <w:t>; BOLD stores the same marker as </w:t>
-      </w:r>
-      <w:proofErr w:type="spellStart"/>
-      <w:r>
-        <w:rPr>
-          <w:lang w:val="en-US"/>
-        </w:rPr>
-        <w:t>trnH-psbA</w:t>
-      </w:r>
-      <w:proofErr w:type="spellEnd"/>
-      <w:r>
-        <w:rPr>
-          <w:lang w:val="en-US"/>
-        </w:rPr>
-        <w:t> (genes reversed). A naive string match would silently return zero hits for that marker. I had to write a normalizer that splits on -, lowercases, and sorts the parts before comparing.</w:t>
+        <w:t>NCBI/GenBank convention writes psbA-trnH; BOLD stores the same marker as trnH-psbA (genes reversed). A naive string match would silently return zero hits for that marker. I had to write a normalizer that splits on -, lowercases, and sorts the parts before comparing.</w:t>
       </w:r>
     </w:p>
     <w:p>
@@ -1342,21 +1030,8 @@
       </w:pPr>
       <w:r>
         <w:lastRenderedPageBreak/>
-        <w:t xml:space="preserve">6. Field </w:t>
-      </w:r>
-      <w:proofErr w:type="spellStart"/>
-      <w:r>
-        <w:t>mapping</w:t>
-      </w:r>
-      <w:proofErr w:type="spellEnd"/>
-      <w:r>
-        <w:t xml:space="preserve"> </w:t>
-      </w:r>
-      <w:proofErr w:type="spellStart"/>
-      <w:r>
-        <w:t>quirks</w:t>
-      </w:r>
-      <w:proofErr w:type="spellEnd"/>
+        <w:t>6. Field mapping quirks</w:t>
+      </w:r>
     </w:p>
     <w:p>
       <w:pPr>
@@ -1372,21 +1047,7 @@
         <w:rPr>
           <w:lang w:val="en-US"/>
         </w:rPr>
-        <w:t xml:space="preserve">country/ocean — the literal JSON key contains a /, which is fine in Python </w:t>
-      </w:r>
-      <w:proofErr w:type="spellStart"/>
-      <w:r>
-        <w:rPr>
-          <w:lang w:val="en-US"/>
-        </w:rPr>
-        <w:t>dicts</w:t>
-      </w:r>
-      <w:proofErr w:type="spellEnd"/>
-      <w:r>
-        <w:rPr>
-          <w:lang w:val="en-US"/>
-        </w:rPr>
-        <w:t xml:space="preserve"> but easy to fumble with typos.</w:t>
+        <w:t>country/ocean — the literal JSON key contains a /, which is fine in Python dicts but easy to fumble with typos.</w:t>
       </w:r>
     </w:p>
     <w:p>
@@ -1403,49 +1064,7 @@
         <w:rPr>
           <w:lang w:val="en-US"/>
         </w:rPr>
-        <w:t>Coordinates come back as a [</w:t>
-      </w:r>
-      <w:proofErr w:type="spellStart"/>
-      <w:r>
-        <w:rPr>
-          <w:lang w:val="en-US"/>
-        </w:rPr>
-        <w:t>lat</w:t>
-      </w:r>
-      <w:proofErr w:type="spellEnd"/>
-      <w:r>
-        <w:rPr>
-          <w:lang w:val="en-US"/>
-        </w:rPr>
-        <w:t xml:space="preserve">, </w:t>
-      </w:r>
-      <w:proofErr w:type="spellStart"/>
-      <w:r>
-        <w:rPr>
-          <w:lang w:val="en-US"/>
-        </w:rPr>
-        <w:t>lon</w:t>
-      </w:r>
-      <w:proofErr w:type="spellEnd"/>
-      <w:r>
-        <w:rPr>
-          <w:lang w:val="en-US"/>
-        </w:rPr>
-        <w:t>] list (or null), not a formatted string like NCBI's </w:t>
-      </w:r>
-      <w:proofErr w:type="spellStart"/>
-      <w:r>
-        <w:rPr>
-          <w:lang w:val="en-US"/>
-        </w:rPr>
-        <w:t>lat_lon</w:t>
-      </w:r>
-      <w:proofErr w:type="spellEnd"/>
-      <w:r>
-        <w:rPr>
-          <w:lang w:val="en-US"/>
-        </w:rPr>
-        <w:t> qualifier — needed manual formatting.</w:t>
+        <w:t>Coordinates come back as a [lat, lon] list (or null), not a formatted string like NCBI's lat_lon qualifier — needed manual formatting.</w:t>
       </w:r>
     </w:p>
     <w:p>
@@ -1462,35 +1081,7 @@
         <w:rPr>
           <w:lang w:val="en-US"/>
         </w:rPr>
-        <w:t>No direct "voucher" field — had to fall back through </w:t>
-      </w:r>
-      <w:proofErr w:type="spellStart"/>
-      <w:r>
-        <w:rPr>
-          <w:lang w:val="en-US"/>
-        </w:rPr>
-        <w:t>museumid</w:t>
-      </w:r>
-      <w:proofErr w:type="spellEnd"/>
-      <w:r>
-        <w:rPr>
-          <w:lang w:val="en-US"/>
-        </w:rPr>
-        <w:t> → </w:t>
-      </w:r>
-      <w:proofErr w:type="spellStart"/>
-      <w:r>
-        <w:rPr>
-          <w:lang w:val="en-US"/>
-        </w:rPr>
-        <w:t>sampleid</w:t>
-      </w:r>
-      <w:proofErr w:type="spellEnd"/>
-      <w:r>
-        <w:rPr>
-          <w:lang w:val="en-US"/>
-        </w:rPr>
-        <w:t>.</w:t>
+        <w:t>No direct "voucher" field — had to fall back through museumid → sampleid.</w:t>
       </w:r>
     </w:p>
     <w:p>
@@ -1521,42 +1112,14 @@
         <w:rPr>
           <w:lang w:val="en-US"/>
         </w:rPr>
-        <w:t xml:space="preserve">7. Documentation was </w:t>
-      </w:r>
-      <w:proofErr w:type="gramStart"/>
-      <w:r>
-        <w:rPr>
-          <w:lang w:val="en-US"/>
-        </w:rPr>
-        <w:t>actually the</w:t>
-      </w:r>
-      <w:proofErr w:type="gramEnd"/>
-      <w:r>
-        <w:rPr>
-          <w:lang w:val="en-US"/>
-        </w:rPr>
-        <w:t xml:space="preserve"> hardest part</w:t>
+        <w:t>7. Documentation was actually the hardest part</w:t>
       </w:r>
       <w:r>
         <w:rPr>
           <w:lang w:val="en-US"/>
         </w:rPr>
         <w:br/>
-        <w:t>Both the old (v4.boldsystems.org) and new (portal.boldsystems.org/</w:t>
-      </w:r>
-      <w:proofErr w:type="spellStart"/>
-      <w:r>
-        <w:rPr>
-          <w:lang w:val="en-US"/>
-        </w:rPr>
-        <w:t>api</w:t>
-      </w:r>
-      <w:proofErr w:type="spellEnd"/>
-      <w:r>
-        <w:rPr>
-          <w:lang w:val="en-US"/>
-        </w:rPr>
-        <w:t>/docs) doc pages returned 403s to automated fetches. I ended up reverse-engineering the real behavior by hitting the live endpoints with curl and inspecting raw responses rather than reading a spec — which is also how I caught the JSONL format and the "always succeeds" preprocessor quirk above.</w:t>
+        <w:t>Both the old (v4.boldsystems.org) and new (portal.boldsystems.org/api/docs) doc pages returned 403s to automated fetches. I ended up reverse-engineering the real behavior by hitting the live endpoints with curl and inspecting raw responses rather than reading a spec — which is also how I caught the JSONL format and the "always succeeds" preprocessor quirk above.</w:t>
       </w:r>
     </w:p>
     <w:p>
@@ -1566,13 +1129,8 @@
         </w:rPr>
         <w:tab/>
       </w:r>
-      <w:proofErr w:type="spellStart"/>
-      <w:r>
-        <w:t>Resttime</w:t>
-      </w:r>
-      <w:proofErr w:type="spellEnd"/>
-      <w:r>
-        <w:t xml:space="preserve"> van 0,1 werkt niet moet p</w:t>
+      <w:r>
+        <w:t>Resttime van 0,1 werkt niet moet p</w:t>
       </w:r>
       <w:r>
         <w:t>roberen met een langere rest time</w:t>
@@ -1606,35 +1164,7 @@
         <w:rPr>
           <w:lang w:val="en-US"/>
         </w:rPr>
-        <w:t>Retry with exponential backoff (</w:t>
-      </w:r>
-      <w:proofErr w:type="spellStart"/>
-      <w:r>
-        <w:rPr>
-          <w:lang w:val="en-US"/>
-        </w:rPr>
-        <w:t>bold_</w:t>
-      </w:r>
-      <w:proofErr w:type="gramStart"/>
-      <w:r>
-        <w:rPr>
-          <w:lang w:val="en-US"/>
-        </w:rPr>
-        <w:t>request</w:t>
-      </w:r>
-      <w:proofErr w:type="spellEnd"/>
-      <w:r>
-        <w:rPr>
-          <w:lang w:val="en-US"/>
-        </w:rPr>
-        <w:t>()) —</w:t>
-      </w:r>
-      <w:proofErr w:type="gramEnd"/>
-      <w:r>
-        <w:rPr>
-          <w:lang w:val="en-US"/>
-        </w:rPr>
-        <w:t xml:space="preserve"> on 403/429/5xx, it waits 5s, then 10s, 20s, 40s between attempts instead of failing immediately, in case the block is a short-lived rate-limit window.</w:t>
+        <w:t>Retry with exponential backoff (bold_request()) — on 403/429/5xx, it waits 5s, then 10s, 20s, 40s between attempts instead of failing immediately, in case the block is a short-lived rate-limit window.</w:t>
       </w:r>
     </w:p>
     <w:p>
@@ -1651,29 +1181,7 @@
         <w:rPr>
           <w:lang w:val="en-US"/>
         </w:rPr>
-        <w:t>Circuit breaker (</w:t>
-      </w:r>
-      <w:proofErr w:type="spellStart"/>
-      <w:proofErr w:type="gramStart"/>
-      <w:r>
-        <w:rPr>
-          <w:lang w:val="en-US"/>
-        </w:rPr>
-        <w:t>BoldBlockedError</w:t>
-      </w:r>
-      <w:proofErr w:type="spellEnd"/>
-      <w:r>
-        <w:rPr>
-          <w:lang w:val="en-US"/>
-        </w:rPr>
-        <w:t>) —</w:t>
-      </w:r>
-      <w:proofErr w:type="gramEnd"/>
-      <w:r>
-        <w:rPr>
-          <w:lang w:val="en-US"/>
-        </w:rPr>
-        <w:t xml:space="preserve"> if it's still failing after those retries, the run now stops early instead of burning through all remaining species with instant failures, and it saves whatever partial results it already collected rather than losing the whole run.</w:t>
+        <w:t>Circuit breaker (BoldBlockedError) — if it's still failing after those retries, the run now stops early instead of burning through all remaining species with instant failures, and it saves whatever partial results it already collected rather than losing the whole run.</w:t>
       </w:r>
     </w:p>
     <w:p>
@@ -1690,21 +1198,7 @@
         <w:rPr>
           <w:lang w:val="en-US"/>
         </w:rPr>
-        <w:t xml:space="preserve">Clearer status message — the GUI will now say "BOLD blocked the requests — stopped early. Partial results saved. Try again later..." instead of silently finishing with a </w:t>
-      </w:r>
-      <w:proofErr w:type="gramStart"/>
-      <w:r>
-        <w:rPr>
-          <w:lang w:val="en-US"/>
-        </w:rPr>
-        <w:t>mostly-empty</w:t>
-      </w:r>
-      <w:proofErr w:type="gramEnd"/>
-      <w:r>
-        <w:rPr>
-          <w:lang w:val="en-US"/>
-        </w:rPr>
-        <w:t xml:space="preserve"> CSV.</w:t>
+        <w:t>Clearer status message — the GUI will now say "BOLD blocked the requests — stopped early. Partial results saved. Try again later..." instead of silently finishing with a mostly-empty CSV.</w:t>
       </w:r>
     </w:p>
     <w:p>
@@ -1734,21 +1228,7 @@
         <w:rPr>
           <w:lang w:val="en-US"/>
         </w:rPr>
-        <w:t xml:space="preserve">The bad news: I just tested live, and the block is still active on this network — it hasn't lifted in the ~50 minutes since we first saw it, and </w:t>
-      </w:r>
-      <w:proofErr w:type="gramStart"/>
-      <w:r>
-        <w:rPr>
-          <w:lang w:val="en-US"/>
-        </w:rPr>
-        <w:t>my</w:t>
-      </w:r>
-      <w:proofErr w:type="gramEnd"/>
-      <w:r>
-        <w:rPr>
-          <w:lang w:val="en-US"/>
-        </w:rPr>
-        <w:t xml:space="preserve"> retry test above confirms it's still returning 403 after fresh attempts. This isn't something the script can fix by waiting a </w:t>
+        <w:t xml:space="preserve">The bad news: I just tested live, and the block is still active on this network — it hasn't lifted in the ~50 minutes since we first saw it, and my retry test above confirms it's still returning 403 after fresh attempts. This isn't something the script can fix by waiting a </w:t>
       </w:r>
       <w:r>
         <w:rPr>
@@ -1777,21 +1257,7 @@
         <w:rPr>
           <w:lang w:val="en-US"/>
         </w:rPr>
-        <w:t xml:space="preserve">Wait it out and try again later (maybe check back in an hour or </w:t>
-      </w:r>
-      <w:proofErr w:type="gramStart"/>
-      <w:r>
-        <w:rPr>
-          <w:lang w:val="en-US"/>
-        </w:rPr>
-        <w:t>two) —</w:t>
-      </w:r>
-      <w:proofErr w:type="gramEnd"/>
-      <w:r>
-        <w:rPr>
-          <w:lang w:val="en-US"/>
-        </w:rPr>
-        <w:t xml:space="preserve"> the code changes above mean if it happens again mid-run, you'll get partial results instead of a wasted run.</w:t>
+        <w:t>Wait it out and try again later (maybe check back in an hour or two) — the code changes above mean if it happens again mid-run, you'll get partial results instead of a wasted run.</w:t>
       </w:r>
     </w:p>
     <w:p>
@@ -1841,13 +1307,8 @@
       </w:pPr>
     </w:p>
     <w:p>
-      <w:proofErr w:type="spellStart"/>
-      <w:r>
-        <w:t>Fatser</w:t>
-      </w:r>
-      <w:proofErr w:type="spellEnd"/>
-      <w:r>
-        <w:t xml:space="preserve"> NCBI</w:t>
+      <w:r>
+        <w:t>Fatser NCBI</w:t>
       </w:r>
     </w:p>
     <w:p>
@@ -1863,21 +1324,7 @@
         <w:rPr>
           <w:lang w:val="en-US"/>
         </w:rPr>
-        <w:t>Now update </w:t>
-      </w:r>
-      <w:proofErr w:type="spellStart"/>
-      <w:r>
-        <w:rPr>
-          <w:lang w:val="en-US"/>
-        </w:rPr>
-        <w:t>get_accession</w:t>
-      </w:r>
-      <w:proofErr w:type="spellEnd"/>
-      <w:r>
-        <w:rPr>
-          <w:lang w:val="en-US"/>
-        </w:rPr>
-        <w:t> to use the rate limiter per-call instead of one sleep at the end:</w:t>
+        <w:t>Now update get_accession to use the rate limiter per-call instead of one sleep at the end:</w:t>
       </w:r>
     </w:p>
     <w:p>
@@ -1968,19 +1415,11 @@
           <w:lang w:val="en-US"/>
         </w:rPr>
       </w:pPr>
-      <w:proofErr w:type="spellStart"/>
-      <w:r>
-        <w:rPr>
-          <w:lang w:val="en-US"/>
-        </w:rPr>
-        <w:t>RateLimiter</w:t>
-      </w:r>
-      <w:proofErr w:type="spellEnd"/>
-      <w:r>
-        <w:rPr>
-          <w:lang w:val="en-US"/>
-        </w:rPr>
-        <w:t> class — a lock-protected global rate limiter enforcing a minimum gap between </w:t>
+      <w:r>
+        <w:rPr>
+          <w:lang w:val="en-US"/>
+        </w:rPr>
+        <w:t>RateLimiter class — a lock-protected global rate limiter enforcing a minimum gap between </w:t>
       </w:r>
       <w:r>
         <w:rPr>
@@ -2007,97 +1446,11 @@
           <w:lang w:val="en-US"/>
         </w:rPr>
       </w:pPr>
-      <w:proofErr w:type="spellStart"/>
-      <w:r>
-        <w:rPr>
-          <w:lang w:val="en-US"/>
-        </w:rPr>
-        <w:t>get_accession</w:t>
-      </w:r>
-      <w:proofErr w:type="spellEnd"/>
-      <w:r>
-        <w:rPr>
-          <w:lang w:val="en-US"/>
-        </w:rPr>
-        <w:t> now takes </w:t>
-      </w:r>
-      <w:proofErr w:type="spellStart"/>
-      <w:r>
-        <w:rPr>
-          <w:lang w:val="en-US"/>
-        </w:rPr>
-        <w:t>rate_limiter</w:t>
-      </w:r>
-      <w:proofErr w:type="spellEnd"/>
-      <w:r>
-        <w:rPr>
-          <w:lang w:val="en-US"/>
-        </w:rPr>
-        <w:t> instead of </w:t>
-      </w:r>
-      <w:proofErr w:type="spellStart"/>
-      <w:r>
-        <w:rPr>
-          <w:lang w:val="en-US"/>
-        </w:rPr>
-        <w:t>sleep_time</w:t>
-      </w:r>
-      <w:proofErr w:type="spellEnd"/>
-      <w:r>
-        <w:rPr>
-          <w:lang w:val="en-US"/>
-        </w:rPr>
-        <w:t>, and calls </w:t>
-      </w:r>
-      <w:proofErr w:type="spellStart"/>
-      <w:r>
-        <w:rPr>
-          <w:lang w:val="en-US"/>
-        </w:rPr>
-        <w:t>rate_</w:t>
-      </w:r>
-      <w:proofErr w:type="gramStart"/>
-      <w:r>
-        <w:rPr>
-          <w:lang w:val="en-US"/>
-        </w:rPr>
-        <w:t>limiter.wait</w:t>
-      </w:r>
-      <w:proofErr w:type="spellEnd"/>
-      <w:proofErr w:type="gramEnd"/>
-      <w:r>
-        <w:rPr>
-          <w:lang w:val="en-US"/>
-        </w:rPr>
-        <w:t>() before each </w:t>
-      </w:r>
-      <w:proofErr w:type="spellStart"/>
-      <w:r>
-        <w:rPr>
-          <w:lang w:val="en-US"/>
-        </w:rPr>
-        <w:t>esearch</w:t>
-      </w:r>
-      <w:proofErr w:type="spellEnd"/>
-      <w:r>
-        <w:rPr>
-          <w:lang w:val="en-US"/>
-        </w:rPr>
-        <w:t>/</w:t>
-      </w:r>
-      <w:proofErr w:type="spellStart"/>
-      <w:r>
-        <w:rPr>
-          <w:lang w:val="en-US"/>
-        </w:rPr>
-        <w:t>efetch</w:t>
-      </w:r>
-      <w:proofErr w:type="spellEnd"/>
-      <w:r>
-        <w:rPr>
-          <w:lang w:val="en-US"/>
-        </w:rPr>
-        <w:t> — properly capping the </w:t>
+      <w:r>
+        <w:rPr>
+          <w:lang w:val="en-US"/>
+        </w:rPr>
+        <w:t>get_accession now takes rate_limiter instead of sleep_time, and calls rate_limiter.wait() before each esearch/efetch — properly capping the </w:t>
       </w:r>
       <w:r>
         <w:rPr>
@@ -2124,47 +1477,11 @@
           <w:lang w:val="en-US"/>
         </w:rPr>
       </w:pPr>
-      <w:proofErr w:type="spellStart"/>
-      <w:r>
-        <w:rPr>
-          <w:lang w:val="en-US"/>
-        </w:rPr>
-        <w:t>ThreadPoolExecutor</w:t>
-      </w:r>
-      <w:proofErr w:type="spellEnd"/>
-      <w:r>
-        <w:rPr>
-          <w:lang w:val="en-US"/>
-        </w:rPr>
-        <w:t> replaces the serial species/marker loop — all (species, marker) jobs are submitted concurrently, with </w:t>
-      </w:r>
-      <w:proofErr w:type="spellStart"/>
-      <w:r>
-        <w:rPr>
-          <w:lang w:val="en-US"/>
-        </w:rPr>
-        <w:t>as_</w:t>
-      </w:r>
-      <w:proofErr w:type="gramStart"/>
-      <w:r>
-        <w:rPr>
-          <w:lang w:val="en-US"/>
-        </w:rPr>
-        <w:t>completed</w:t>
-      </w:r>
-      <w:proofErr w:type="spellEnd"/>
-      <w:r>
-        <w:rPr>
-          <w:lang w:val="en-US"/>
-        </w:rPr>
-        <w:t>(</w:t>
-      </w:r>
-      <w:proofErr w:type="gramEnd"/>
-      <w:r>
-        <w:rPr>
-          <w:lang w:val="en-US"/>
-        </w:rPr>
-        <w:t xml:space="preserve">) driving progress </w:t>
+      <w:r>
+        <w:rPr>
+          <w:lang w:val="en-US"/>
+        </w:rPr>
+        <w:t xml:space="preserve">ThreadPoolExecutor replaces the serial species/marker loop — all (species, marker) jobs are submitted concurrently, with as_completed() driving progress </w:t>
       </w:r>
       <w:r>
         <w:rPr>
@@ -2232,13 +1549,8 @@
       </w:r>
     </w:p>
     <w:p>
-      <w:proofErr w:type="spellStart"/>
-      <w:r>
-        <w:t>Main</w:t>
-      </w:r>
-      <w:proofErr w:type="spellEnd"/>
-      <w:r>
-        <w:t xml:space="preserve"> changes</w:t>
+      <w:r>
+        <w:t>Main changes</w:t>
       </w:r>
     </w:p>
     <w:p>
@@ -2255,71 +1567,7 @@
         <w:rPr>
           <w:lang w:val="en-US"/>
         </w:rPr>
-        <w:t>Global </w:t>
-      </w:r>
-      <w:proofErr w:type="spellStart"/>
-      <w:r>
-        <w:rPr>
-          <w:lang w:val="en-US"/>
-        </w:rPr>
-        <w:t>RateLimiter</w:t>
-      </w:r>
-      <w:proofErr w:type="spellEnd"/>
-      <w:r>
-        <w:rPr>
-          <w:lang w:val="en-US"/>
-        </w:rPr>
-        <w:t> class — a lock-protected object shared by all worker threads. Before every single NCBI HTTP call (</w:t>
-      </w:r>
-      <w:proofErr w:type="spellStart"/>
-      <w:r>
-        <w:rPr>
-          <w:lang w:val="en-US"/>
-        </w:rPr>
-        <w:t>esearch</w:t>
-      </w:r>
-      <w:proofErr w:type="spellEnd"/>
-      <w:r>
-        <w:rPr>
-          <w:lang w:val="en-US"/>
-        </w:rPr>
-        <w:t> and each </w:t>
-      </w:r>
-      <w:proofErr w:type="spellStart"/>
-      <w:r>
-        <w:rPr>
-          <w:lang w:val="en-US"/>
-        </w:rPr>
-        <w:t>efetch</w:t>
-      </w:r>
-      <w:proofErr w:type="spellEnd"/>
-      <w:r>
-        <w:rPr>
-          <w:lang w:val="en-US"/>
-        </w:rPr>
-        <w:t>), a thread calls </w:t>
-      </w:r>
-      <w:proofErr w:type="spellStart"/>
-      <w:r>
-        <w:rPr>
-          <w:lang w:val="en-US"/>
-        </w:rPr>
-        <w:t>rate_</w:t>
-      </w:r>
-      <w:proofErr w:type="gramStart"/>
-      <w:r>
-        <w:rPr>
-          <w:lang w:val="en-US"/>
-        </w:rPr>
-        <w:t>limiter.wait</w:t>
-      </w:r>
-      <w:proofErr w:type="spellEnd"/>
-      <w:proofErr w:type="gramEnd"/>
-      <w:r>
-        <w:rPr>
-          <w:lang w:val="en-US"/>
-        </w:rPr>
-        <w:t>(), which blocks just long enough to keep the </w:t>
+        <w:t>Global RateLimiter class — a lock-protected object shared by all worker threads. Before every single NCBI HTTP call (esearch and each efetch), a thread calls rate_limiter.wait(), which blocks just long enough to keep the </w:t>
       </w:r>
       <w:r>
         <w:rPr>
@@ -2333,51 +1581,7 @@
         <w:rPr>
           <w:lang w:val="en-US"/>
         </w:rPr>
-        <w:t> call rate across all threads under the configured interval. This replaced the old </w:t>
-      </w:r>
-      <w:proofErr w:type="spellStart"/>
-      <w:proofErr w:type="gramStart"/>
-      <w:r>
-        <w:rPr>
-          <w:lang w:val="en-US"/>
-        </w:rPr>
-        <w:t>time.sleep</w:t>
-      </w:r>
-      <w:proofErr w:type="spellEnd"/>
-      <w:proofErr w:type="gramEnd"/>
-      <w:r>
-        <w:rPr>
-          <w:lang w:val="en-US"/>
-        </w:rPr>
-        <w:t>(</w:t>
-      </w:r>
-      <w:proofErr w:type="spellStart"/>
-      <w:r>
-        <w:rPr>
-          <w:lang w:val="en-US"/>
-        </w:rPr>
-        <w:t>sleep_time</w:t>
-      </w:r>
-      <w:proofErr w:type="spellEnd"/>
-      <w:r>
-        <w:rPr>
-          <w:lang w:val="en-US"/>
-        </w:rPr>
-        <w:t xml:space="preserve">) that only fired once per </w:t>
-      </w:r>
-      <w:proofErr w:type="spellStart"/>
-      <w:r>
-        <w:rPr>
-          <w:lang w:val="en-US"/>
-        </w:rPr>
-        <w:t>species+marker</w:t>
-      </w:r>
-      <w:proofErr w:type="spellEnd"/>
-      <w:r>
-        <w:rPr>
-          <w:lang w:val="en-US"/>
-        </w:rPr>
-        <w:t>.</w:t>
+        <w:t> call rate across all threads under the configured interval. This replaced the old time.sleep(sleep_time) that only fired once per species+marker.</w:t>
       </w:r>
     </w:p>
     <w:p>
@@ -2390,61 +1594,11 @@
           <w:lang w:val="en-US"/>
         </w:rPr>
       </w:pPr>
-      <w:proofErr w:type="spellStart"/>
-      <w:r>
-        <w:rPr>
-          <w:lang w:val="en-US"/>
-        </w:rPr>
-        <w:t>get_accession</w:t>
-      </w:r>
-      <w:proofErr w:type="spellEnd"/>
-      <w:r>
-        <w:rPr>
-          <w:lang w:val="en-US"/>
-        </w:rPr>
-        <w:t> rewired to take </w:t>
-      </w:r>
-      <w:proofErr w:type="spellStart"/>
-      <w:r>
-        <w:rPr>
-          <w:lang w:val="en-US"/>
-        </w:rPr>
-        <w:t>rate_limiter</w:t>
-      </w:r>
-      <w:proofErr w:type="spellEnd"/>
-      <w:r>
-        <w:rPr>
-          <w:lang w:val="en-US"/>
-        </w:rPr>
-        <w:t> instead of </w:t>
-      </w:r>
-      <w:proofErr w:type="spellStart"/>
-      <w:r>
-        <w:rPr>
-          <w:lang w:val="en-US"/>
-        </w:rPr>
-        <w:t>sleep_time</w:t>
-      </w:r>
-      <w:proofErr w:type="spellEnd"/>
-      <w:r>
-        <w:rPr>
-          <w:lang w:val="en-US"/>
-        </w:rPr>
-        <w:t>, with </w:t>
-      </w:r>
-      <w:proofErr w:type="gramStart"/>
-      <w:r>
-        <w:rPr>
-          <w:lang w:val="en-US"/>
-        </w:rPr>
-        <w:t>wait(</w:t>
-      </w:r>
-      <w:proofErr w:type="gramEnd"/>
-      <w:r>
-        <w:rPr>
-          <w:lang w:val="en-US"/>
-        </w:rPr>
-        <w:t>) calls moved to before each raw request instead of one sleep at the end — this also fixed the earlier burst issue (up to 11 calls firing instantly before any delay).</w:t>
+      <w:r>
+        <w:rPr>
+          <w:lang w:val="en-US"/>
+        </w:rPr>
+        <w:t>get_accession rewired to take rate_limiter instead of sleep_time, with wait() calls moved to before each raw request instead of one sleep at the end — this also fixed the earlier burst issue (up to 11 calls firing instantly before any delay).</w:t>
       </w:r>
     </w:p>
     <w:p>
@@ -2457,47 +1611,11 @@
           <w:lang w:val="en-US"/>
         </w:rPr>
       </w:pPr>
-      <w:proofErr w:type="spellStart"/>
-      <w:r>
-        <w:rPr>
-          <w:lang w:val="en-US"/>
-        </w:rPr>
-        <w:t>ThreadPoolExecutor</w:t>
-      </w:r>
-      <w:proofErr w:type="spellEnd"/>
-      <w:r>
-        <w:rPr>
-          <w:lang w:val="en-US"/>
-        </w:rPr>
-        <w:t> replacing the serial for species in test["Name"] loop. All (species, marker) jobs get submitted up front; </w:t>
-      </w:r>
-      <w:proofErr w:type="spellStart"/>
-      <w:r>
-        <w:rPr>
-          <w:lang w:val="en-US"/>
-        </w:rPr>
-        <w:t>as_</w:t>
-      </w:r>
-      <w:proofErr w:type="gramStart"/>
-      <w:r>
-        <w:rPr>
-          <w:lang w:val="en-US"/>
-        </w:rPr>
-        <w:t>completed</w:t>
-      </w:r>
-      <w:proofErr w:type="spellEnd"/>
-      <w:r>
-        <w:rPr>
-          <w:lang w:val="en-US"/>
-        </w:rPr>
-        <w:t>(</w:t>
-      </w:r>
-      <w:proofErr w:type="gramEnd"/>
-      <w:r>
-        <w:rPr>
-          <w:lang w:val="en-US"/>
-        </w:rPr>
-        <w:t>) drives progress updates as results land, regardless of order.</w:t>
+      <w:r>
+        <w:rPr>
+          <w:lang w:val="en-US"/>
+        </w:rPr>
+        <w:t>ThreadPoolExecutor replacing the serial for species in test["Name"] loop. All (species, marker) jobs get submitted up front; as_completed() drives progress updates as results land, regardless of order.</w:t>
       </w:r>
     </w:p>
     <w:p>
@@ -2514,35 +1632,7 @@
         <w:rPr>
           <w:lang w:val="en-US"/>
         </w:rPr>
-        <w:t>Order-preserving result collection — </w:t>
-      </w:r>
-      <w:proofErr w:type="spellStart"/>
-      <w:r>
-        <w:rPr>
-          <w:lang w:val="en-US"/>
-        </w:rPr>
-        <w:t>results_by_marker</w:t>
-      </w:r>
-      <w:proofErr w:type="spellEnd"/>
-      <w:r>
-        <w:rPr>
-          <w:lang w:val="en-US"/>
-        </w:rPr>
-        <w:t>[marker][</w:t>
-      </w:r>
-      <w:proofErr w:type="spellStart"/>
-      <w:r>
-        <w:rPr>
-          <w:lang w:val="en-US"/>
-        </w:rPr>
-        <w:t>row_idx</w:t>
-      </w:r>
-      <w:proofErr w:type="spellEnd"/>
-      <w:r>
-        <w:rPr>
-          <w:lang w:val="en-US"/>
-        </w:rPr>
-        <w:t>] = result, using a pre-sized list per marker rather than appending, so results always land back in the correct row regardless of which job finished first.</w:t>
+        <w:t>Order-preserving result collection — results_by_marker[marker][row_idx] = result, using a pre-sized list per marker rather than appending, so results always land back in the correct row regardless of which job finished first.</w:t>
       </w:r>
     </w:p>
     <w:p>
@@ -2559,21 +1649,7 @@
         <w:rPr>
           <w:lang w:val="en-US"/>
         </w:rPr>
-        <w:t xml:space="preserve">New GUI </w:t>
-      </w:r>
-      <w:proofErr w:type="gramStart"/>
-      <w:r>
-        <w:rPr>
-          <w:lang w:val="en-US"/>
-        </w:rPr>
-        <w:t>controls — "</w:t>
-      </w:r>
-      <w:proofErr w:type="gramEnd"/>
-      <w:r>
-        <w:rPr>
-          <w:lang w:val="en-US"/>
-        </w:rPr>
-        <w:t>Min. interval between requests" (now correctly enforced globally, defaulted to 0.1s) and "Concurrent workers" (default 5).</w:t>
+        <w:t>New GUI controls — "Min. interval between requests" (now correctly enforced globally, defaulted to 0.1s) and "Concurrent workers" (default 5).</w:t>
       </w:r>
     </w:p>
     <w:p>
@@ -2603,37 +1679,7 @@
         <w:rPr>
           <w:lang w:val="en-US"/>
         </w:rPr>
-        <w:t xml:space="preserve">Rate limiter that doesn't </w:t>
-      </w:r>
-      <w:proofErr w:type="gramStart"/>
-      <w:r>
-        <w:rPr>
-          <w:lang w:val="en-US"/>
-        </w:rPr>
-        <w:t>actually limit</w:t>
-      </w:r>
-      <w:proofErr w:type="gramEnd"/>
-      <w:r>
-        <w:rPr>
-          <w:lang w:val="en-US"/>
-        </w:rPr>
-        <w:t xml:space="preserve"> anything. The natural first instinct is </w:t>
-      </w:r>
-      <w:proofErr w:type="spellStart"/>
-      <w:proofErr w:type="gramStart"/>
-      <w:r>
-        <w:rPr>
-          <w:lang w:val="en-US"/>
-        </w:rPr>
-        <w:t>time.sleep</w:t>
-      </w:r>
-      <w:proofErr w:type="spellEnd"/>
-      <w:proofErr w:type="gramEnd"/>
-      <w:r>
-        <w:rPr>
-          <w:lang w:val="en-US"/>
-        </w:rPr>
-        <w:t>(x) inside each thread — but that only throttles </w:t>
+        <w:t>Rate limiter that doesn't actually limit anything. The natural first instinct is time.sleep(x) inside each thread — but that only throttles </w:t>
       </w:r>
       <w:r>
         <w:rPr>
@@ -2671,49 +1717,7 @@
         <w:rPr>
           <w:lang w:val="en-US"/>
         </w:rPr>
-        <w:t>Result misalignment. </w:t>
-      </w:r>
-      <w:proofErr w:type="spellStart"/>
-      <w:r>
-        <w:rPr>
-          <w:lang w:val="en-US"/>
-        </w:rPr>
-        <w:t>ThreadPoolExecutor</w:t>
-      </w:r>
-      <w:proofErr w:type="spellEnd"/>
-      <w:r>
-        <w:rPr>
-          <w:lang w:val="en-US"/>
-        </w:rPr>
-        <w:t> + </w:t>
-      </w:r>
-      <w:proofErr w:type="spellStart"/>
-      <w:r>
-        <w:rPr>
-          <w:lang w:val="en-US"/>
-        </w:rPr>
-        <w:t>as_</w:t>
-      </w:r>
-      <w:proofErr w:type="gramStart"/>
-      <w:r>
-        <w:rPr>
-          <w:lang w:val="en-US"/>
-        </w:rPr>
-        <w:t>completed</w:t>
-      </w:r>
-      <w:proofErr w:type="spellEnd"/>
-      <w:r>
-        <w:rPr>
-          <w:lang w:val="en-US"/>
-        </w:rPr>
-        <w:t>(</w:t>
-      </w:r>
-      <w:proofErr w:type="gramEnd"/>
-      <w:r>
-        <w:rPr>
-          <w:lang w:val="en-US"/>
-        </w:rPr>
-        <w:t>) returns results in </w:t>
+        <w:t>Result misalignment. ThreadPoolExecutor + as_completed() returns results in </w:t>
       </w:r>
       <w:r>
         <w:rPr>
@@ -2727,49 +1731,7 @@
         <w:rPr>
           <w:lang w:val="en-US"/>
         </w:rPr>
-        <w:t xml:space="preserve"> order, not submission order. If </w:t>
-      </w:r>
-      <w:proofErr w:type="gramStart"/>
-      <w:r>
-        <w:rPr>
-          <w:lang w:val="en-US"/>
-        </w:rPr>
-        <w:t>you</w:t>
-      </w:r>
-      <w:proofErr w:type="gramEnd"/>
-      <w:r>
-        <w:rPr>
-          <w:lang w:val="en-US"/>
-        </w:rPr>
-        <w:t xml:space="preserve"> </w:t>
-      </w:r>
-      <w:proofErr w:type="gramStart"/>
-      <w:r>
-        <w:rPr>
-          <w:lang w:val="en-US"/>
-        </w:rPr>
-        <w:t>just .append()ed</w:t>
-      </w:r>
-      <w:proofErr w:type="gramEnd"/>
-      <w:r>
-        <w:rPr>
-          <w:lang w:val="en-US"/>
-        </w:rPr>
-        <w:t xml:space="preserve"> results to a list like the original serial code did, rows would silently end up matched to the wrong species once merged into the </w:t>
-      </w:r>
-      <w:proofErr w:type="spellStart"/>
-      <w:r>
-        <w:rPr>
-          <w:lang w:val="en-US"/>
-        </w:rPr>
-        <w:t>DataFrame</w:t>
-      </w:r>
-      <w:proofErr w:type="spellEnd"/>
-      <w:r>
-        <w:rPr>
-          <w:lang w:val="en-US"/>
-        </w:rPr>
-        <w:t xml:space="preserve"> — a bug that wouldn't necessarily be obvious until you spot-checked the output against the input CSV.</w:t>
+        <w:t> order, not submission order. If you just .append()ed results to a list like the original serial code did, rows would silently end up matched to the wrong species once merged into the DataFrame — a bug that wouldn't necessarily be obvious until you spot-checked the output against the input CSV.</w:t>
       </w:r>
     </w:p>
     <w:p>
@@ -2786,79 +1748,7 @@
         <w:rPr>
           <w:lang w:val="en-US"/>
         </w:rPr>
-        <w:t xml:space="preserve">Updating </w:t>
-      </w:r>
-      <w:proofErr w:type="spellStart"/>
-      <w:r>
-        <w:rPr>
-          <w:lang w:val="en-US"/>
-        </w:rPr>
-        <w:t>Tkinter</w:t>
-      </w:r>
-      <w:proofErr w:type="spellEnd"/>
-      <w:r>
-        <w:rPr>
-          <w:lang w:val="en-US"/>
-        </w:rPr>
-        <w:t xml:space="preserve"> widgets from worker threads. </w:t>
-      </w:r>
-      <w:proofErr w:type="spellStart"/>
-      <w:r>
-        <w:rPr>
-          <w:lang w:val="en-US"/>
-        </w:rPr>
-        <w:t>Tkinter</w:t>
-      </w:r>
-      <w:proofErr w:type="spellEnd"/>
-      <w:r>
-        <w:rPr>
-          <w:lang w:val="en-US"/>
-        </w:rPr>
-        <w:t xml:space="preserve"> isn't thread-safe — </w:t>
-      </w:r>
-      <w:proofErr w:type="gramStart"/>
-      <w:r>
-        <w:rPr>
-          <w:lang w:val="en-US"/>
-        </w:rPr>
-        <w:t>calling .configure</w:t>
-      </w:r>
-      <w:proofErr w:type="gramEnd"/>
-      <w:r>
-        <w:rPr>
-          <w:lang w:val="en-US"/>
-        </w:rPr>
-        <w:t>() on a label directly from a background thread can crash or corrupt the UI. It's easy to forget this once you're inside </w:t>
-      </w:r>
-      <w:proofErr w:type="spellStart"/>
-      <w:r>
-        <w:rPr>
-          <w:lang w:val="en-US"/>
-        </w:rPr>
-        <w:t>ThreadPoolExecutor</w:t>
-      </w:r>
-      <w:proofErr w:type="spellEnd"/>
-      <w:r>
-        <w:rPr>
-          <w:lang w:val="en-US"/>
-        </w:rPr>
-        <w:t> workers and just update the progress label directly instead of routing everything through </w:t>
-      </w:r>
-      <w:proofErr w:type="spellStart"/>
-      <w:proofErr w:type="gramStart"/>
-      <w:r>
-        <w:rPr>
-          <w:lang w:val="en-US"/>
-        </w:rPr>
-        <w:t>app.after</w:t>
-      </w:r>
-      <w:proofErr w:type="spellEnd"/>
-      <w:proofErr w:type="gramEnd"/>
-      <w:r>
-        <w:rPr>
-          <w:lang w:val="en-US"/>
-        </w:rPr>
-        <w:t>().</w:t>
+        <w:t>Updating Tkinter widgets from worker threads. Tkinter isn't thread-safe — calling .configure() on a label directly from a background thread can crash or corrupt the UI. It's easy to forget this once you're inside ThreadPoolExecutor workers and just update the progress label directly instead of routing everything through app.after().</w:t>
       </w:r>
     </w:p>
     <w:p>
@@ -2875,35 +1765,7 @@
         <w:rPr>
           <w:lang w:val="en-US"/>
         </w:rPr>
-        <w:t xml:space="preserve">Swallowed exceptions. Exceptions raised inside a worker function don't propagate until you </w:t>
-      </w:r>
-      <w:proofErr w:type="gramStart"/>
-      <w:r>
-        <w:rPr>
-          <w:lang w:val="en-US"/>
-        </w:rPr>
-        <w:t>call .result</w:t>
-      </w:r>
-      <w:proofErr w:type="gramEnd"/>
-      <w:r>
-        <w:rPr>
-          <w:lang w:val="en-US"/>
-        </w:rPr>
-        <w:t>() on its future. Forgetting that (or not wrapping it in try/except) means a single bad record could either silently vanish from the output or crash the whole </w:t>
-      </w:r>
-      <w:proofErr w:type="spellStart"/>
-      <w:r>
-        <w:rPr>
-          <w:lang w:val="en-US"/>
-        </w:rPr>
-        <w:t>as_completed</w:t>
-      </w:r>
-      <w:proofErr w:type="spellEnd"/>
-      <w:r>
-        <w:rPr>
-          <w:lang w:val="en-US"/>
-        </w:rPr>
-        <w:t> loop unexpectedly.</w:t>
+        <w:t>Swallowed exceptions. Exceptions raised inside a worker function don't propagate until you call .result() on its future. Forgetting that (or not wrapping it in try/except) means a single bad record could either silently vanish from the output or crash the whole as_completed loop unexpectedly.</w:t>
       </w:r>
     </w:p>
     <w:p>
@@ -2920,21 +1782,7 @@
         <w:rPr>
           <w:lang w:val="en-US"/>
         </w:rPr>
-        <w:t>More workers ≠ more speed once a shared rate limiter exists. Because every thread funnels through the same </w:t>
-      </w:r>
-      <w:proofErr w:type="spellStart"/>
-      <w:r>
-        <w:rPr>
-          <w:lang w:val="en-US"/>
-        </w:rPr>
-        <w:t>RateLimiter</w:t>
-      </w:r>
-      <w:proofErr w:type="spellEnd"/>
-      <w:r>
-        <w:rPr>
-          <w:lang w:val="en-US"/>
-        </w:rPr>
-        <w:t>, cranking up "Concurrent workers" past a certain point just means more threads queued up waiting on the same lock — the real ceiling stays NCBI's rate cap, not thread count.</w:t>
+        <w:t>More workers ≠ more speed once a shared rate limiter exists. Because every thread funnels through the same RateLimiter, cranking up "Concurrent workers" past a certain point just means more threads queued up waiting on the same lock — the real ceiling stays NCBI's rate cap, not thread count.</w:t>
       </w:r>
     </w:p>
     <w:p>
@@ -2976,26 +1824,10 @@
     </w:p>
     <w:p>
       <w:r>
-        <w:t xml:space="preserve">Moet </w:t>
-      </w:r>
-      <w:proofErr w:type="gramStart"/>
-      <w:r>
-        <w:t>er voor</w:t>
-      </w:r>
-      <w:proofErr w:type="gramEnd"/>
-      <w:r>
-        <w:t xml:space="preserve"> zorgen dat d</w:t>
-      </w:r>
-      <w:r>
-        <w:t xml:space="preserve">e Name column nog </w:t>
-      </w:r>
-      <w:proofErr w:type="gramStart"/>
-      <w:r>
-        <w:t>word</w:t>
-      </w:r>
-      <w:proofErr w:type="gramEnd"/>
-      <w:r>
-        <w:t xml:space="preserve"> toegevoegd.</w:t>
+        <w:t>Moet er voor zorgen dat d</w:t>
+      </w:r>
+      <w:r>
+        <w:t>e Name column nog word toegevoegd.</w:t>
       </w:r>
     </w:p>
     <w:p>
@@ -3010,56 +1842,19 @@
         </w:rPr>
         <w:tab/>
       </w:r>
-      <w:proofErr w:type="spellStart"/>
-      <w:r>
-        <w:rPr>
-          <w:lang w:val="en-US"/>
-        </w:rPr>
-        <w:t>df_accessions</w:t>
-      </w:r>
-      <w:proofErr w:type="spellEnd"/>
-      <w:r>
-        <w:rPr>
-          <w:lang w:val="en-US"/>
-        </w:rPr>
-        <w:t xml:space="preserve"> = </w:t>
-      </w:r>
-      <w:proofErr w:type="spellStart"/>
-      <w:proofErr w:type="gramStart"/>
-      <w:r>
-        <w:rPr>
-          <w:lang w:val="en-US"/>
-        </w:rPr>
-        <w:t>df.filter</w:t>
-      </w:r>
-      <w:proofErr w:type="spellEnd"/>
-      <w:proofErr w:type="gramEnd"/>
-      <w:r>
-        <w:rPr>
-          <w:lang w:val="en-US"/>
-        </w:rPr>
-        <w:t>(markers, axis=1)</w:t>
+      <w:r>
+        <w:rPr>
+          <w:lang w:val="en-US"/>
+        </w:rPr>
+        <w:t>df_accessions = df.filter(markers, axis=1)</w:t>
       </w:r>
     </w:p>
     <w:p>
       <w:pPr>
         <w:ind w:firstLine="708"/>
       </w:pPr>
-      <w:proofErr w:type="gramStart"/>
-      <w:r>
-        <w:t>print</w:t>
-      </w:r>
-      <w:proofErr w:type="gramEnd"/>
-      <w:r>
-        <w:t>(</w:t>
-      </w:r>
-      <w:proofErr w:type="spellStart"/>
-      <w:r>
-        <w:t>df_accessions</w:t>
-      </w:r>
-      <w:proofErr w:type="spellEnd"/>
-      <w:r>
-        <w:t>)</w:t>
+      <w:r>
+        <w:t>print(df_accessions)</w:t>
       </w:r>
     </w:p>
     <w:p>
@@ -3081,8 +1876,6 @@
           <w14:ligatures w14:val="none"/>
         </w:rPr>
       </w:pPr>
-      <w:proofErr w:type="spellStart"/>
-      <w:proofErr w:type="gramStart"/>
       <w:r>
         <w:rPr>
           <w:rFonts w:ascii="Consolas" w:eastAsia="Times New Roman" w:hAnsi="Consolas" w:cs="Times New Roman"/>
@@ -3119,8 +1912,6 @@
         </w:rPr>
         <w:t>insert</w:t>
       </w:r>
-      <w:proofErr w:type="spellEnd"/>
-      <w:proofErr w:type="gramEnd"/>
       <w:r>
         <w:rPr>
           <w:rFonts w:ascii="Consolas" w:eastAsia="Times New Roman" w:hAnsi="Consolas" w:cs="Times New Roman"/>
@@ -3201,7 +1992,6 @@
           <w14:ligatures w14:val="none"/>
         </w:rPr>
       </w:pPr>
-      <w:proofErr w:type="spellStart"/>
       <w:r>
         <w:rPr>
           <w:rFonts w:ascii="Consolas" w:eastAsia="Times New Roman" w:hAnsi="Consolas" w:cs="Times New Roman"/>
@@ -3214,7 +2004,6 @@
         </w:rPr>
         <w:t>df_accessions</w:t>
       </w:r>
-      <w:proofErr w:type="spellEnd"/>
       <w:r>
         <w:rPr>
           <w:rFonts w:ascii="Consolas" w:eastAsia="Times New Roman" w:hAnsi="Consolas" w:cs="Times New Roman"/>
@@ -3251,8 +2040,6 @@
         </w:rPr>
         <w:t xml:space="preserve"> </w:t>
       </w:r>
-      <w:proofErr w:type="spellStart"/>
-      <w:proofErr w:type="gramStart"/>
       <w:r>
         <w:rPr>
           <w:rFonts w:ascii="Consolas" w:eastAsia="Times New Roman" w:hAnsi="Consolas" w:cs="Times New Roman"/>
@@ -3289,8 +2076,6 @@
         </w:rPr>
         <w:t>filter</w:t>
       </w:r>
-      <w:proofErr w:type="spellEnd"/>
-      <w:proofErr w:type="gramEnd"/>
       <w:r>
         <w:rPr>
           <w:rFonts w:ascii="Consolas" w:eastAsia="Times New Roman" w:hAnsi="Consolas" w:cs="Times New Roman"/>
@@ -3395,7 +2180,6 @@
           <w14:ligatures w14:val="none"/>
         </w:rPr>
       </w:pPr>
-      <w:proofErr w:type="gramStart"/>
       <w:r>
         <w:rPr>
           <w:rFonts w:ascii="Consolas" w:eastAsia="Times New Roman" w:hAnsi="Consolas" w:cs="Times New Roman"/>
@@ -3408,7 +2192,6 @@
         </w:rPr>
         <w:t>print</w:t>
       </w:r>
-      <w:proofErr w:type="gramEnd"/>
       <w:r>
         <w:rPr>
           <w:rFonts w:ascii="Consolas" w:eastAsia="Times New Roman" w:hAnsi="Consolas" w:cs="Times New Roman"/>
@@ -3421,7 +2204,6 @@
         </w:rPr>
         <w:t>(</w:t>
       </w:r>
-      <w:proofErr w:type="spellStart"/>
       <w:r>
         <w:rPr>
           <w:rFonts w:ascii="Consolas" w:eastAsia="Times New Roman" w:hAnsi="Consolas" w:cs="Times New Roman"/>
@@ -3434,7 +2216,6 @@
         </w:rPr>
         <w:t>df_accessions</w:t>
       </w:r>
-      <w:proofErr w:type="spellEnd"/>
       <w:r>
         <w:rPr>
           <w:rFonts w:ascii="Consolas" w:eastAsia="Times New Roman" w:hAnsi="Consolas" w:cs="Times New Roman"/>
@@ -3450,31 +2231,16 @@
     </w:p>
     <w:p/>
     <w:p>
-      <w:proofErr w:type="gramStart"/>
-      <w:r>
-        <w:t>hier</w:t>
-      </w:r>
-      <w:proofErr w:type="gramEnd"/>
-      <w:r>
-        <w:t xml:space="preserve"> werd de markers lijst ook aan gepast</w:t>
+      <w:r>
+        <w:t>hier werd de markers lijst ook aan gepast</w:t>
       </w:r>
     </w:p>
     <w:p>
       <w:pPr>
         <w:ind w:left="360"/>
       </w:pPr>
-      <w:proofErr w:type="spellStart"/>
-      <w:proofErr w:type="gramStart"/>
-      <w:r>
-        <w:t>name</w:t>
-      </w:r>
-      <w:proofErr w:type="gramEnd"/>
-      <w:r>
-        <w:t>_and_markers</w:t>
-      </w:r>
-      <w:proofErr w:type="spellEnd"/>
-      <w:r>
-        <w:t xml:space="preserve"> = markers</w:t>
+      <w:r>
+        <w:t>name_and_markers = markers</w:t>
       </w:r>
     </w:p>
     <w:p>
@@ -3484,41 +2250,20 @@
           <w:lang w:val="en-US"/>
         </w:rPr>
       </w:pPr>
-      <w:proofErr w:type="spellStart"/>
-      <w:r>
-        <w:rPr>
-          <w:lang w:val="en-US"/>
-        </w:rPr>
-        <w:t>name_and_</w:t>
-      </w:r>
-      <w:proofErr w:type="gramStart"/>
-      <w:r>
-        <w:rPr>
-          <w:lang w:val="en-US"/>
-        </w:rPr>
-        <w:t>markers.insert</w:t>
-      </w:r>
-      <w:proofErr w:type="spellEnd"/>
-      <w:proofErr w:type="gramEnd"/>
-      <w:r>
-        <w:rPr>
-          <w:lang w:val="en-US"/>
-        </w:rPr>
-        <w:t>(0, 'Name')</w:t>
+      <w:r>
+        <w:rPr>
+          <w:lang w:val="en-US"/>
+        </w:rPr>
+        <w:t>name_and_markers.insert(0, 'Name')</w:t>
       </w:r>
     </w:p>
     <w:p>
       <w:pPr>
         <w:ind w:left="360"/>
       </w:pPr>
-      <w:proofErr w:type="gramStart"/>
       <w:r>
         <w:lastRenderedPageBreak/>
-        <w:t>eerst</w:t>
-      </w:r>
-      <w:proofErr w:type="gramEnd"/>
-      <w:r>
-        <w:t xml:space="preserve"> een copy maken v</w:t>
+        <w:t>eerst een copy maken v</w:t>
       </w:r>
       <w:r>
         <w:t>an de lijst lost het probleem op</w:t>
@@ -3531,35 +2276,11 @@
           <w:lang w:val="en-US"/>
         </w:rPr>
       </w:pPr>
-      <w:proofErr w:type="spellStart"/>
-      <w:r>
-        <w:rPr>
-          <w:lang w:val="en-US"/>
-        </w:rPr>
-        <w:t>name_and_markers</w:t>
-      </w:r>
-      <w:proofErr w:type="spellEnd"/>
-      <w:r>
-        <w:rPr>
-          <w:lang w:val="en-US"/>
-        </w:rPr>
-        <w:t xml:space="preserve"> = </w:t>
-      </w:r>
-      <w:proofErr w:type="spellStart"/>
-      <w:proofErr w:type="gramStart"/>
-      <w:r>
-        <w:rPr>
-          <w:lang w:val="en-US"/>
-        </w:rPr>
-        <w:t>markers.copy</w:t>
-      </w:r>
-      <w:proofErr w:type="spellEnd"/>
-      <w:proofErr w:type="gramEnd"/>
-      <w:r>
-        <w:rPr>
-          <w:lang w:val="en-US"/>
-        </w:rPr>
-        <w:t>()</w:t>
+      <w:r>
+        <w:rPr>
+          <w:lang w:val="en-US"/>
+        </w:rPr>
+        <w:t>name_and_markers = markers.copy()</w:t>
       </w:r>
     </w:p>
     <w:p>
@@ -3569,27 +2290,11 @@
           <w:lang w:val="en-US"/>
         </w:rPr>
       </w:pPr>
-      <w:proofErr w:type="spellStart"/>
-      <w:r>
-        <w:rPr>
-          <w:lang w:val="en-US"/>
-        </w:rPr>
-        <w:t>name_and_</w:t>
-      </w:r>
-      <w:proofErr w:type="gramStart"/>
-      <w:r>
-        <w:rPr>
-          <w:lang w:val="en-US"/>
-        </w:rPr>
-        <w:t>markers.insert</w:t>
-      </w:r>
-      <w:proofErr w:type="spellEnd"/>
-      <w:proofErr w:type="gramEnd"/>
-      <w:r>
-        <w:rPr>
-          <w:lang w:val="en-US"/>
-        </w:rPr>
-        <w:t>(0, 'Name')</w:t>
+      <w:r>
+        <w:rPr>
+          <w:lang w:val="en-US"/>
+        </w:rPr>
+        <w:t>name_and_markers.insert(0, 'Name')</w:t>
       </w:r>
     </w:p>
     <w:p>
@@ -3630,23 +2335,7 @@
         <w:rPr>
           <w:lang w:val="en-US"/>
         </w:rPr>
-        <w:t xml:space="preserve">if </w:t>
-      </w:r>
-      <w:proofErr w:type="spellStart"/>
-      <w:proofErr w:type="gramStart"/>
-      <w:r>
-        <w:rPr>
-          <w:lang w:val="en-US"/>
-        </w:rPr>
-        <w:t>pd.notna</w:t>
-      </w:r>
-      <w:proofErr w:type="spellEnd"/>
-      <w:proofErr w:type="gramEnd"/>
-      <w:r>
-        <w:rPr>
-          <w:lang w:val="en-US"/>
-        </w:rPr>
-        <w:t>(row[marker]):</w:t>
+        <w:t>if pd.notna(row[marker]):</w:t>
       </w:r>
     </w:p>
     <w:p>
@@ -3671,21 +2360,54 @@
         </w:rPr>
         <w:t xml:space="preserve">   </w:t>
       </w:r>
-      <w:proofErr w:type="gramStart"/>
-      <w:r>
-        <w:t>print</w:t>
-      </w:r>
-      <w:proofErr w:type="gramEnd"/>
-      <w:r>
-        <w:t>(</w:t>
-      </w:r>
-      <w:proofErr w:type="spellStart"/>
-      <w:r>
-        <w:t>row</w:t>
-      </w:r>
-      <w:proofErr w:type="spellEnd"/>
-      <w:r>
-        <w:t>[marker])</w:t>
+      <w:r>
+        <w:t>print(row[marker])</w:t>
+      </w:r>
+    </w:p>
+    <w:p>
+      <w:pPr>
+        <w:ind w:left="360"/>
+      </w:pPr>
+    </w:p>
+    <w:p>
+      <w:pPr>
+        <w:ind w:left="360"/>
+        <w:rPr>
+          <w:lang w:val="en-US"/>
+        </w:rPr>
+      </w:pPr>
+      <w:r>
+        <w:rPr>
+          <w:lang w:val="en-US"/>
+        </w:rPr>
+        <w:t>df_fasta.loc[len(df_fasta)] = temp</w:t>
+      </w:r>
+    </w:p>
+    <w:p>
+      <w:pPr>
+        <w:ind w:left="360"/>
+      </w:pPr>
+      <w:r>
+        <w:t>heeft een frame van d</w:t>
+      </w:r>
+      <w:r>
+        <w:t>f nodig</w:t>
+      </w:r>
+    </w:p>
+    <w:p>
+      <w:pPr>
+        <w:ind w:left="360"/>
+      </w:pPr>
+    </w:p>
+    <w:p>
+      <w:pPr>
+        <w:ind w:left="360"/>
+      </w:pPr>
+      <w:r>
+        <w:t>“” moest aan de lijst toegevoegd worden indien NAN</w:t>
+      </w:r>
+      <w:r>
+        <w:t xml:space="preserve"> voor accesion num</w:t>
       </w:r>
     </w:p>
     <w:p>

</xml_diff>

<commit_message>
Names and fasta seperate columns and saves output in xlsx , csv
</commit_message>
<xml_diff>
--- a/Stage Meise logbook.docx
+++ b/Stage Meise logbook.docx
@@ -2413,25 +2413,69 @@
     <w:p>
       <w:pPr>
         <w:ind w:left="360"/>
-      </w:pPr>
+        <w:rPr>
+          <w:lang w:val="en-US"/>
+        </w:rPr>
+      </w:pPr>
+      <w:r>
+        <w:rPr>
+          <w:lang w:val="en-US"/>
+        </w:rPr>
+        <w:t>Output in file is a</w:t>
+      </w:r>
+      <w:r>
+        <w:rPr>
+          <w:lang w:val="en-US"/>
+        </w:rPr>
+        <w:t>llemaal in 1 colom</w:t>
+      </w:r>
     </w:p>
     <w:p>
       <w:pPr>
         <w:ind w:left="360"/>
+        <w:rPr>
+          <w:lang w:val="en-US"/>
+        </w:rPr>
       </w:pPr>
     </w:p>
     <w:p>
       <w:pPr>
         <w:ind w:left="360"/>
+        <w:rPr>
+          <w:lang w:val="en-US"/>
+        </w:rPr>
+      </w:pPr>
+    </w:p>
+    <w:p>
+      <w:pPr>
+        <w:ind w:left="360"/>
+        <w:rPr>
+          <w:lang w:val="en-US"/>
+        </w:rPr>
       </w:pPr>
     </w:p>
     <w:p>
       <w:pPr>
         <w:ind w:firstLine="708"/>
-      </w:pPr>
-    </w:p>
-    <w:p/>
-    <w:p/>
+        <w:rPr>
+          <w:lang w:val="en-US"/>
+        </w:rPr>
+      </w:pPr>
+    </w:p>
+    <w:p>
+      <w:pPr>
+        <w:rPr>
+          <w:lang w:val="en-US"/>
+        </w:rPr>
+      </w:pPr>
+    </w:p>
+    <w:p>
+      <w:pPr>
+        <w:rPr>
+          <w:lang w:val="en-US"/>
+        </w:rPr>
+      </w:pPr>
+    </w:p>
     <w:sectPr>
       <w:pgSz w:w="11906" w:h="16838"/>
       <w:pgMar w:top="1440" w:right="1440" w:bottom="1440" w:left="1440" w:header="708" w:footer="708" w:gutter="0"/>

</xml_diff>

<commit_message>
results of a full floralist run for the ncbi accession numbers
</commit_message>
<xml_diff>
--- a/Stage Meise logbook.docx
+++ b/Stage Meise logbook.docx
@@ -835,7 +835,21 @@
         <w:rPr>
           <w:lang w:val="en-BE"/>
         </w:rPr>
-        <w:t>Code system standardizeren.</w:t>
+        <w:t xml:space="preserve">Code system </w:t>
+      </w:r>
+      <w:proofErr w:type="spellStart"/>
+      <w:r>
+        <w:rPr>
+          <w:lang w:val="en-BE"/>
+        </w:rPr>
+        <w:t>standardizeren</w:t>
+      </w:r>
+      <w:proofErr w:type="spellEnd"/>
+      <w:r>
+        <w:rPr>
+          <w:lang w:val="en-BE"/>
+        </w:rPr>
+        <w:t>.</w:t>
       </w:r>
     </w:p>
     <w:p>
@@ -875,7 +889,23 @@
         <w:ind w:left="1416"/>
       </w:pPr>
       <w:r>
-        <w:t>1. API shape is fundamentally different</w:t>
+        <w:t xml:space="preserve">1. API </w:t>
+      </w:r>
+      <w:proofErr w:type="spellStart"/>
+      <w:r>
+        <w:t>shape</w:t>
+      </w:r>
+      <w:proofErr w:type="spellEnd"/>
+      <w:r>
+        <w:t xml:space="preserve"> is </w:t>
+      </w:r>
+      <w:proofErr w:type="spellStart"/>
+      <w:r>
+        <w:t>fundamentally</w:t>
+      </w:r>
+      <w:proofErr w:type="spellEnd"/>
+      <w:r>
+        <w:t xml:space="preserve"> different</w:t>
       </w:r>
     </w:p>
     <w:p>
@@ -892,7 +922,49 @@
         <w:rPr>
           <w:lang w:val="en-US"/>
         </w:rPr>
-        <w:t>NCBI Entrez is a 2-call pattern: esearch (get IDs) → efetch (get GenBank records), keyed by species+marker in one query.</w:t>
+        <w:t>NCBI Entrez is a 2-call pattern: </w:t>
+      </w:r>
+      <w:proofErr w:type="spellStart"/>
+      <w:r>
+        <w:rPr>
+          <w:lang w:val="en-US"/>
+        </w:rPr>
+        <w:t>esearch</w:t>
+      </w:r>
+      <w:proofErr w:type="spellEnd"/>
+      <w:r>
+        <w:rPr>
+          <w:lang w:val="en-US"/>
+        </w:rPr>
+        <w:t> (get IDs) → </w:t>
+      </w:r>
+      <w:proofErr w:type="spellStart"/>
+      <w:r>
+        <w:rPr>
+          <w:lang w:val="en-US"/>
+        </w:rPr>
+        <w:t>efetch</w:t>
+      </w:r>
+      <w:proofErr w:type="spellEnd"/>
+      <w:r>
+        <w:rPr>
+          <w:lang w:val="en-US"/>
+        </w:rPr>
+        <w:t xml:space="preserve"> (get GenBank records), keyed by </w:t>
+      </w:r>
+      <w:proofErr w:type="spellStart"/>
+      <w:r>
+        <w:rPr>
+          <w:lang w:val="en-US"/>
+        </w:rPr>
+        <w:t>species+marker</w:t>
+      </w:r>
+      <w:proofErr w:type="spellEnd"/>
+      <w:r>
+        <w:rPr>
+          <w:lang w:val="en-US"/>
+        </w:rPr>
+        <w:t xml:space="preserve"> in one query.</w:t>
       </w:r>
     </w:p>
     <w:p>
@@ -909,7 +981,63 @@
         <w:rPr>
           <w:lang w:val="en-US"/>
         </w:rPr>
-        <w:t>BOLD v5 is a 3-step token flow: query/preprocessor (validate the term) → query (get a query_id) → documents/&lt;query_id&gt;/download (actually get data). You can't skip straight to fetching — you need that query_id first.</w:t>
+        <w:t>BOLD v5 is a 3-step token flow: query/preprocessor (validate the term) → query (get a </w:t>
+      </w:r>
+      <w:proofErr w:type="spellStart"/>
+      <w:r>
+        <w:rPr>
+          <w:lang w:val="en-US"/>
+        </w:rPr>
+        <w:t>query_id</w:t>
+      </w:r>
+      <w:proofErr w:type="spellEnd"/>
+      <w:r>
+        <w:rPr>
+          <w:lang w:val="en-US"/>
+        </w:rPr>
+        <w:t>) → documents/&lt;</w:t>
+      </w:r>
+      <w:proofErr w:type="spellStart"/>
+      <w:r>
+        <w:rPr>
+          <w:lang w:val="en-US"/>
+        </w:rPr>
+        <w:t>query_id</w:t>
+      </w:r>
+      <w:proofErr w:type="spellEnd"/>
+      <w:r>
+        <w:rPr>
+          <w:lang w:val="en-US"/>
+        </w:rPr>
+        <w:t>&gt;/download (</w:t>
+      </w:r>
+      <w:proofErr w:type="gramStart"/>
+      <w:r>
+        <w:rPr>
+          <w:lang w:val="en-US"/>
+        </w:rPr>
+        <w:t>actually get</w:t>
+      </w:r>
+      <w:proofErr w:type="gramEnd"/>
+      <w:r>
+        <w:rPr>
+          <w:lang w:val="en-US"/>
+        </w:rPr>
+        <w:t xml:space="preserve"> data). You can't skip straight to fetching — you need that </w:t>
+      </w:r>
+      <w:proofErr w:type="spellStart"/>
+      <w:r>
+        <w:rPr>
+          <w:lang w:val="en-US"/>
+        </w:rPr>
+        <w:t>query_id</w:t>
+      </w:r>
+      <w:proofErr w:type="spellEnd"/>
+      <w:r>
+        <w:rPr>
+          <w:lang w:val="en-US"/>
+        </w:rPr>
+        <w:t> first.</w:t>
       </w:r>
     </w:p>
     <w:p>
@@ -930,7 +1058,35 @@
           <w:lang w:val="en-US"/>
         </w:rPr>
         <w:br/>
-        <w:t>NCBI lets you put the marker directly in the search query ("species"[Organism] AND rbcL). BOLD has no marker scope — a species query returns records for </w:t>
+        <w:t xml:space="preserve">NCBI lets you put the marker directly in the search query ("species"[Organism] AND </w:t>
+      </w:r>
+      <w:proofErr w:type="spellStart"/>
+      <w:r>
+        <w:rPr>
+          <w:lang w:val="en-US"/>
+        </w:rPr>
+        <w:t>rbcL</w:t>
+      </w:r>
+      <w:proofErr w:type="spellEnd"/>
+      <w:r>
+        <w:rPr>
+          <w:lang w:val="en-US"/>
+        </w:rPr>
+        <w:t xml:space="preserve">). BOLD has no marker </w:t>
+      </w:r>
+      <w:proofErr w:type="gramStart"/>
+      <w:r>
+        <w:rPr>
+          <w:lang w:val="en-US"/>
+        </w:rPr>
+        <w:t>scope — a</w:t>
+      </w:r>
+      <w:proofErr w:type="gramEnd"/>
+      <w:r>
+        <w:rPr>
+          <w:lang w:val="en-US"/>
+        </w:rPr>
+        <w:t xml:space="preserve"> species query returns records for </w:t>
       </w:r>
       <w:r>
         <w:rPr>
@@ -944,7 +1100,35 @@
         <w:rPr>
           <w:lang w:val="en-US"/>
         </w:rPr>
-        <w:t> marker at once, and you filter by marker_code locally. I turned this into an advantage: fetch once per species, cache it, and reuse across all markers instead of hitting the API once per species-marker pair like the NCBI version does.</w:t>
+        <w:t> marker at once, and you filter by </w:t>
+      </w:r>
+      <w:proofErr w:type="spellStart"/>
+      <w:r>
+        <w:rPr>
+          <w:lang w:val="en-US"/>
+        </w:rPr>
+        <w:t>marker_code</w:t>
+      </w:r>
+      <w:proofErr w:type="spellEnd"/>
+      <w:r>
+        <w:rPr>
+          <w:lang w:val="en-US"/>
+        </w:rPr>
+        <w:t xml:space="preserve"> locally. I turned this into an advantage: fetch once per species, cache it, and </w:t>
+      </w:r>
+      <w:proofErr w:type="gramStart"/>
+      <w:r>
+        <w:rPr>
+          <w:lang w:val="en-US"/>
+        </w:rPr>
+        <w:t>reuse across</w:t>
+      </w:r>
+      <w:proofErr w:type="gramEnd"/>
+      <w:r>
+        <w:rPr>
+          <w:lang w:val="en-US"/>
+        </w:rPr>
+        <w:t xml:space="preserve"> all markers instead of hitting the API once per species-marker pair like the NCBI version does.</w:t>
       </w:r>
     </w:p>
     <w:p>
@@ -965,7 +1149,51 @@
           <w:lang w:val="en-US"/>
         </w:rPr>
         <w:br/>
-        <w:t>BOLD's download endpoint returns newline-delimited JSON, not a JSON array. If you json.loads() the whole response body you get a parse error — you have to split on newlines and parse each line individually. This isn't documented clearly anywhere; I only found it by hitting the live endpoint with curl.</w:t>
+        <w:t>BOLD's download endpoint returns newline-delimited JSON, not a JSON array. If you </w:t>
+      </w:r>
+      <w:proofErr w:type="spellStart"/>
+      <w:proofErr w:type="gramStart"/>
+      <w:r>
+        <w:rPr>
+          <w:lang w:val="en-US"/>
+        </w:rPr>
+        <w:t>json.loads</w:t>
+      </w:r>
+      <w:proofErr w:type="spellEnd"/>
+      <w:proofErr w:type="gramEnd"/>
+      <w:r>
+        <w:rPr>
+          <w:lang w:val="en-US"/>
+        </w:rPr>
+        <w:t xml:space="preserve">() the whole response </w:t>
+      </w:r>
+      <w:proofErr w:type="gramStart"/>
+      <w:r>
+        <w:rPr>
+          <w:lang w:val="en-US"/>
+        </w:rPr>
+        <w:t>body</w:t>
+      </w:r>
+      <w:proofErr w:type="gramEnd"/>
+      <w:r>
+        <w:rPr>
+          <w:lang w:val="en-US"/>
+        </w:rPr>
+        <w:t xml:space="preserve"> you get a parse error — you </w:t>
+      </w:r>
+      <w:proofErr w:type="gramStart"/>
+      <w:r>
+        <w:rPr>
+          <w:lang w:val="en-US"/>
+        </w:rPr>
+        <w:t>have to</w:t>
+      </w:r>
+      <w:proofErr w:type="gramEnd"/>
+      <w:r>
+        <w:rPr>
+          <w:lang w:val="en-US"/>
+        </w:rPr>
+        <w:t xml:space="preserve"> split on newlines and parse each line individually. This isn't documented clearly anywhere; I only found it by hitting the live endpoint with curl.</w:t>
       </w:r>
     </w:p>
     <w:p>
@@ -986,7 +1214,35 @@
           <w:lang w:val="en-US"/>
         </w:rPr>
         <w:br/>
-        <w:t>NCBI's esearch clearly returns an empty IdList when nothing matches. BOLD's preprocessor step </w:t>
+        <w:t>NCBI's </w:t>
+      </w:r>
+      <w:proofErr w:type="spellStart"/>
+      <w:r>
+        <w:rPr>
+          <w:lang w:val="en-US"/>
+        </w:rPr>
+        <w:t>esearch</w:t>
+      </w:r>
+      <w:proofErr w:type="spellEnd"/>
+      <w:r>
+        <w:rPr>
+          <w:lang w:val="en-US"/>
+        </w:rPr>
+        <w:t> clearly returns an empty </w:t>
+      </w:r>
+      <w:proofErr w:type="spellStart"/>
+      <w:r>
+        <w:rPr>
+          <w:lang w:val="en-US"/>
+        </w:rPr>
+        <w:t>IdList</w:t>
+      </w:r>
+      <w:proofErr w:type="spellEnd"/>
+      <w:r>
+        <w:rPr>
+          <w:lang w:val="en-US"/>
+        </w:rPr>
+        <w:t> when nothing matches. BOLD's preprocessor step </w:t>
       </w:r>
       <w:r>
         <w:rPr>
@@ -1000,7 +1256,35 @@
         <w:rPr>
           <w:lang w:val="en-US"/>
         </w:rPr>
-        <w:t> returns a "successful" match — even garbage input like Zzznonexistentplantxyz gets silently reinterpreted as an ID search and produces a valid query_id. The actual "no data" signal only shows up as an empty response body at the final download step. Easy to miss and assume the request worked.</w:t>
+        <w:t> returns a "successful" match — even garbage input like </w:t>
+      </w:r>
+      <w:proofErr w:type="spellStart"/>
+      <w:r>
+        <w:rPr>
+          <w:lang w:val="en-US"/>
+        </w:rPr>
+        <w:t>Zzznonexistentplantxyz</w:t>
+      </w:r>
+      <w:proofErr w:type="spellEnd"/>
+      <w:r>
+        <w:rPr>
+          <w:lang w:val="en-US"/>
+        </w:rPr>
+        <w:t> gets silently reinterpreted as an ID search and produces a valid </w:t>
+      </w:r>
+      <w:proofErr w:type="spellStart"/>
+      <w:r>
+        <w:rPr>
+          <w:lang w:val="en-US"/>
+        </w:rPr>
+        <w:t>query_id</w:t>
+      </w:r>
+      <w:proofErr w:type="spellEnd"/>
+      <w:r>
+        <w:rPr>
+          <w:lang w:val="en-US"/>
+        </w:rPr>
+        <w:t>. The actual "no data" signal only shows up as an empty response body at the final download step. Easy to miss and assume the request worked.</w:t>
       </w:r>
     </w:p>
     <w:p>
@@ -1021,7 +1305,35 @@
           <w:lang w:val="en-US"/>
         </w:rPr>
         <w:br/>
-        <w:t>NCBI/GenBank convention writes psbA-trnH; BOLD stores the same marker as trnH-psbA (genes reversed). A naive string match would silently return zero hits for that marker. I had to write a normalizer that splits on -, lowercases, and sorts the parts before comparing.</w:t>
+        <w:t>NCBI/GenBank convention writes </w:t>
+      </w:r>
+      <w:proofErr w:type="spellStart"/>
+      <w:r>
+        <w:rPr>
+          <w:lang w:val="en-US"/>
+        </w:rPr>
+        <w:t>psbA-trnH</w:t>
+      </w:r>
+      <w:proofErr w:type="spellEnd"/>
+      <w:r>
+        <w:rPr>
+          <w:lang w:val="en-US"/>
+        </w:rPr>
+        <w:t>; BOLD stores the same marker as </w:t>
+      </w:r>
+      <w:proofErr w:type="spellStart"/>
+      <w:r>
+        <w:rPr>
+          <w:lang w:val="en-US"/>
+        </w:rPr>
+        <w:t>trnH-psbA</w:t>
+      </w:r>
+      <w:proofErr w:type="spellEnd"/>
+      <w:r>
+        <w:rPr>
+          <w:lang w:val="en-US"/>
+        </w:rPr>
+        <w:t> (genes reversed). A naive string match would silently return zero hits for that marker. I had to write a normalizer that splits on -, lowercases, and sorts the parts before comparing.</w:t>
       </w:r>
     </w:p>
     <w:p>
@@ -1030,8 +1342,21 @@
       </w:pPr>
       <w:r>
         <w:lastRenderedPageBreak/>
-        <w:t>6. Field mapping quirks</w:t>
-      </w:r>
+        <w:t xml:space="preserve">6. Field </w:t>
+      </w:r>
+      <w:proofErr w:type="spellStart"/>
+      <w:r>
+        <w:t>mapping</w:t>
+      </w:r>
+      <w:proofErr w:type="spellEnd"/>
+      <w:r>
+        <w:t xml:space="preserve"> </w:t>
+      </w:r>
+      <w:proofErr w:type="spellStart"/>
+      <w:r>
+        <w:t>quirks</w:t>
+      </w:r>
+      <w:proofErr w:type="spellEnd"/>
     </w:p>
     <w:p>
       <w:pPr>
@@ -1047,7 +1372,21 @@
         <w:rPr>
           <w:lang w:val="en-US"/>
         </w:rPr>
-        <w:t>country/ocean — the literal JSON key contains a /, which is fine in Python dicts but easy to fumble with typos.</w:t>
+        <w:t xml:space="preserve">country/ocean — the literal JSON key contains a /, which is fine in Python </w:t>
+      </w:r>
+      <w:proofErr w:type="spellStart"/>
+      <w:r>
+        <w:rPr>
+          <w:lang w:val="en-US"/>
+        </w:rPr>
+        <w:t>dicts</w:t>
+      </w:r>
+      <w:proofErr w:type="spellEnd"/>
+      <w:r>
+        <w:rPr>
+          <w:lang w:val="en-US"/>
+        </w:rPr>
+        <w:t xml:space="preserve"> but easy to fumble with typos.</w:t>
       </w:r>
     </w:p>
     <w:p>
@@ -1064,7 +1403,49 @@
         <w:rPr>
           <w:lang w:val="en-US"/>
         </w:rPr>
-        <w:t>Coordinates come back as a [lat, lon] list (or null), not a formatted string like NCBI's lat_lon qualifier — needed manual formatting.</w:t>
+        <w:t>Coordinates come back as a [</w:t>
+      </w:r>
+      <w:proofErr w:type="spellStart"/>
+      <w:r>
+        <w:rPr>
+          <w:lang w:val="en-US"/>
+        </w:rPr>
+        <w:t>lat</w:t>
+      </w:r>
+      <w:proofErr w:type="spellEnd"/>
+      <w:r>
+        <w:rPr>
+          <w:lang w:val="en-US"/>
+        </w:rPr>
+        <w:t xml:space="preserve">, </w:t>
+      </w:r>
+      <w:proofErr w:type="spellStart"/>
+      <w:r>
+        <w:rPr>
+          <w:lang w:val="en-US"/>
+        </w:rPr>
+        <w:t>lon</w:t>
+      </w:r>
+      <w:proofErr w:type="spellEnd"/>
+      <w:r>
+        <w:rPr>
+          <w:lang w:val="en-US"/>
+        </w:rPr>
+        <w:t>] list (or null), not a formatted string like NCBI's </w:t>
+      </w:r>
+      <w:proofErr w:type="spellStart"/>
+      <w:r>
+        <w:rPr>
+          <w:lang w:val="en-US"/>
+        </w:rPr>
+        <w:t>lat_lon</w:t>
+      </w:r>
+      <w:proofErr w:type="spellEnd"/>
+      <w:r>
+        <w:rPr>
+          <w:lang w:val="en-US"/>
+        </w:rPr>
+        <w:t> qualifier — needed manual formatting.</w:t>
       </w:r>
     </w:p>
     <w:p>
@@ -1081,7 +1462,35 @@
         <w:rPr>
           <w:lang w:val="en-US"/>
         </w:rPr>
-        <w:t>No direct "voucher" field — had to fall back through museumid → sampleid.</w:t>
+        <w:t>No direct "voucher" field — had to fall back through </w:t>
+      </w:r>
+      <w:proofErr w:type="spellStart"/>
+      <w:r>
+        <w:rPr>
+          <w:lang w:val="en-US"/>
+        </w:rPr>
+        <w:t>museumid</w:t>
+      </w:r>
+      <w:proofErr w:type="spellEnd"/>
+      <w:r>
+        <w:rPr>
+          <w:lang w:val="en-US"/>
+        </w:rPr>
+        <w:t> → </w:t>
+      </w:r>
+      <w:proofErr w:type="spellStart"/>
+      <w:r>
+        <w:rPr>
+          <w:lang w:val="en-US"/>
+        </w:rPr>
+        <w:t>sampleid</w:t>
+      </w:r>
+      <w:proofErr w:type="spellEnd"/>
+      <w:r>
+        <w:rPr>
+          <w:lang w:val="en-US"/>
+        </w:rPr>
+        <w:t>.</w:t>
       </w:r>
     </w:p>
     <w:p>
@@ -1112,14 +1521,42 @@
         <w:rPr>
           <w:lang w:val="en-US"/>
         </w:rPr>
-        <w:t>7. Documentation was actually the hardest part</w:t>
+        <w:t xml:space="preserve">7. Documentation was </w:t>
+      </w:r>
+      <w:proofErr w:type="gramStart"/>
+      <w:r>
+        <w:rPr>
+          <w:lang w:val="en-US"/>
+        </w:rPr>
+        <w:t>actually the</w:t>
+      </w:r>
+      <w:proofErr w:type="gramEnd"/>
+      <w:r>
+        <w:rPr>
+          <w:lang w:val="en-US"/>
+        </w:rPr>
+        <w:t xml:space="preserve"> hardest part</w:t>
       </w:r>
       <w:r>
         <w:rPr>
           <w:lang w:val="en-US"/>
         </w:rPr>
         <w:br/>
-        <w:t>Both the old (v4.boldsystems.org) and new (portal.boldsystems.org/api/docs) doc pages returned 403s to automated fetches. I ended up reverse-engineering the real behavior by hitting the live endpoints with curl and inspecting raw responses rather than reading a spec — which is also how I caught the JSONL format and the "always succeeds" preprocessor quirk above.</w:t>
+        <w:t>Both the old (v4.boldsystems.org) and new (portal.boldsystems.org/</w:t>
+      </w:r>
+      <w:proofErr w:type="spellStart"/>
+      <w:r>
+        <w:rPr>
+          <w:lang w:val="en-US"/>
+        </w:rPr>
+        <w:t>api</w:t>
+      </w:r>
+      <w:proofErr w:type="spellEnd"/>
+      <w:r>
+        <w:rPr>
+          <w:lang w:val="en-US"/>
+        </w:rPr>
+        <w:t>/docs) doc pages returned 403s to automated fetches. I ended up reverse-engineering the real behavior by hitting the live endpoints with curl and inspecting raw responses rather than reading a spec — which is also how I caught the JSONL format and the "always succeeds" preprocessor quirk above.</w:t>
       </w:r>
     </w:p>
     <w:p>
@@ -1129,8 +1566,13 @@
         </w:rPr>
         <w:tab/>
       </w:r>
-      <w:r>
-        <w:t>Resttime van 0,1 werkt niet moet p</w:t>
+      <w:proofErr w:type="spellStart"/>
+      <w:r>
+        <w:t>Resttime</w:t>
+      </w:r>
+      <w:proofErr w:type="spellEnd"/>
+      <w:r>
+        <w:t xml:space="preserve"> van 0,1 werkt niet moet p</w:t>
       </w:r>
       <w:r>
         <w:t>roberen met een langere rest time</w:t>
@@ -1164,7 +1606,35 @@
         <w:rPr>
           <w:lang w:val="en-US"/>
         </w:rPr>
-        <w:t>Retry with exponential backoff (bold_request()) — on 403/429/5xx, it waits 5s, then 10s, 20s, 40s between attempts instead of failing immediately, in case the block is a short-lived rate-limit window.</w:t>
+        <w:t>Retry with exponential backoff (</w:t>
+      </w:r>
+      <w:proofErr w:type="spellStart"/>
+      <w:r>
+        <w:rPr>
+          <w:lang w:val="en-US"/>
+        </w:rPr>
+        <w:t>bold_</w:t>
+      </w:r>
+      <w:proofErr w:type="gramStart"/>
+      <w:r>
+        <w:rPr>
+          <w:lang w:val="en-US"/>
+        </w:rPr>
+        <w:t>request</w:t>
+      </w:r>
+      <w:proofErr w:type="spellEnd"/>
+      <w:r>
+        <w:rPr>
+          <w:lang w:val="en-US"/>
+        </w:rPr>
+        <w:t>()) —</w:t>
+      </w:r>
+      <w:proofErr w:type="gramEnd"/>
+      <w:r>
+        <w:rPr>
+          <w:lang w:val="en-US"/>
+        </w:rPr>
+        <w:t xml:space="preserve"> on 403/429/5xx, it waits 5s, then 10s, 20s, 40s between attempts instead of failing immediately, in case the block is a short-lived rate-limit window.</w:t>
       </w:r>
     </w:p>
     <w:p>
@@ -1181,7 +1651,29 @@
         <w:rPr>
           <w:lang w:val="en-US"/>
         </w:rPr>
-        <w:t>Circuit breaker (BoldBlockedError) — if it's still failing after those retries, the run now stops early instead of burning through all remaining species with instant failures, and it saves whatever partial results it already collected rather than losing the whole run.</w:t>
+        <w:t>Circuit breaker (</w:t>
+      </w:r>
+      <w:proofErr w:type="spellStart"/>
+      <w:proofErr w:type="gramStart"/>
+      <w:r>
+        <w:rPr>
+          <w:lang w:val="en-US"/>
+        </w:rPr>
+        <w:t>BoldBlockedError</w:t>
+      </w:r>
+      <w:proofErr w:type="spellEnd"/>
+      <w:r>
+        <w:rPr>
+          <w:lang w:val="en-US"/>
+        </w:rPr>
+        <w:t>) —</w:t>
+      </w:r>
+      <w:proofErr w:type="gramEnd"/>
+      <w:r>
+        <w:rPr>
+          <w:lang w:val="en-US"/>
+        </w:rPr>
+        <w:t xml:space="preserve"> if it's still failing after those retries, the run now stops early instead of burning through all remaining species with instant failures, and it saves whatever partial results it already collected rather than losing the whole run.</w:t>
       </w:r>
     </w:p>
     <w:p>
@@ -1198,7 +1690,21 @@
         <w:rPr>
           <w:lang w:val="en-US"/>
         </w:rPr>
-        <w:t>Clearer status message — the GUI will now say "BOLD blocked the requests — stopped early. Partial results saved. Try again later..." instead of silently finishing with a mostly-empty CSV.</w:t>
+        <w:t xml:space="preserve">Clearer status message — the GUI will now say "BOLD blocked the requests — stopped early. Partial results saved. Try again later..." instead of silently finishing with a </w:t>
+      </w:r>
+      <w:proofErr w:type="gramStart"/>
+      <w:r>
+        <w:rPr>
+          <w:lang w:val="en-US"/>
+        </w:rPr>
+        <w:t>mostly-empty</w:t>
+      </w:r>
+      <w:proofErr w:type="gramEnd"/>
+      <w:r>
+        <w:rPr>
+          <w:lang w:val="en-US"/>
+        </w:rPr>
+        <w:t xml:space="preserve"> CSV.</w:t>
       </w:r>
     </w:p>
     <w:p>
@@ -1228,7 +1734,21 @@
         <w:rPr>
           <w:lang w:val="en-US"/>
         </w:rPr>
-        <w:t xml:space="preserve">The bad news: I just tested live, and the block is still active on this network — it hasn't lifted in the ~50 minutes since we first saw it, and my retry test above confirms it's still returning 403 after fresh attempts. This isn't something the script can fix by waiting a </w:t>
+        <w:t xml:space="preserve">The bad news: I just tested live, and the block is still active on this network — it hasn't lifted in the ~50 minutes since we first saw it, and </w:t>
+      </w:r>
+      <w:proofErr w:type="gramStart"/>
+      <w:r>
+        <w:rPr>
+          <w:lang w:val="en-US"/>
+        </w:rPr>
+        <w:t>my</w:t>
+      </w:r>
+      <w:proofErr w:type="gramEnd"/>
+      <w:r>
+        <w:rPr>
+          <w:lang w:val="en-US"/>
+        </w:rPr>
+        <w:t xml:space="preserve"> retry test above confirms it's still returning 403 after fresh attempts. This isn't something the script can fix by waiting a </w:t>
       </w:r>
       <w:r>
         <w:rPr>
@@ -1257,7 +1777,21 @@
         <w:rPr>
           <w:lang w:val="en-US"/>
         </w:rPr>
-        <w:t>Wait it out and try again later (maybe check back in an hour or two) — the code changes above mean if it happens again mid-run, you'll get partial results instead of a wasted run.</w:t>
+        <w:t xml:space="preserve">Wait it out and try again later (maybe check back in an hour or </w:t>
+      </w:r>
+      <w:proofErr w:type="gramStart"/>
+      <w:r>
+        <w:rPr>
+          <w:lang w:val="en-US"/>
+        </w:rPr>
+        <w:t>two) —</w:t>
+      </w:r>
+      <w:proofErr w:type="gramEnd"/>
+      <w:r>
+        <w:rPr>
+          <w:lang w:val="en-US"/>
+        </w:rPr>
+        <w:t xml:space="preserve"> the code changes above mean if it happens again mid-run, you'll get partial results instead of a wasted run.</w:t>
       </w:r>
     </w:p>
     <w:p>
@@ -1307,8 +1841,13 @@
       </w:pPr>
     </w:p>
     <w:p>
-      <w:r>
-        <w:t>Fatser NCBI</w:t>
+      <w:proofErr w:type="spellStart"/>
+      <w:r>
+        <w:t>Fatser</w:t>
+      </w:r>
+      <w:proofErr w:type="spellEnd"/>
+      <w:r>
+        <w:t xml:space="preserve"> NCBI</w:t>
       </w:r>
     </w:p>
     <w:p>
@@ -1324,7 +1863,21 @@
         <w:rPr>
           <w:lang w:val="en-US"/>
         </w:rPr>
-        <w:t>Now update get_accession to use the rate limiter per-call instead of one sleep at the end:</w:t>
+        <w:t>Now update </w:t>
+      </w:r>
+      <w:proofErr w:type="spellStart"/>
+      <w:r>
+        <w:rPr>
+          <w:lang w:val="en-US"/>
+        </w:rPr>
+        <w:t>get_accession</w:t>
+      </w:r>
+      <w:proofErr w:type="spellEnd"/>
+      <w:r>
+        <w:rPr>
+          <w:lang w:val="en-US"/>
+        </w:rPr>
+        <w:t> to use the rate limiter per-call instead of one sleep at the end:</w:t>
       </w:r>
     </w:p>
     <w:p>
@@ -1415,11 +1968,19 @@
           <w:lang w:val="en-US"/>
         </w:rPr>
       </w:pPr>
-      <w:r>
-        <w:rPr>
-          <w:lang w:val="en-US"/>
-        </w:rPr>
-        <w:t>RateLimiter class — a lock-protected global rate limiter enforcing a minimum gap between </w:t>
+      <w:proofErr w:type="spellStart"/>
+      <w:r>
+        <w:rPr>
+          <w:lang w:val="en-US"/>
+        </w:rPr>
+        <w:t>RateLimiter</w:t>
+      </w:r>
+      <w:proofErr w:type="spellEnd"/>
+      <w:r>
+        <w:rPr>
+          <w:lang w:val="en-US"/>
+        </w:rPr>
+        <w:t> class — a lock-protected global rate limiter enforcing a minimum gap between </w:t>
       </w:r>
       <w:r>
         <w:rPr>
@@ -1446,11 +2007,97 @@
           <w:lang w:val="en-US"/>
         </w:rPr>
       </w:pPr>
-      <w:r>
-        <w:rPr>
-          <w:lang w:val="en-US"/>
-        </w:rPr>
-        <w:t>get_accession now takes rate_limiter instead of sleep_time, and calls rate_limiter.wait() before each esearch/efetch — properly capping the </w:t>
+      <w:proofErr w:type="spellStart"/>
+      <w:r>
+        <w:rPr>
+          <w:lang w:val="en-US"/>
+        </w:rPr>
+        <w:t>get_accession</w:t>
+      </w:r>
+      <w:proofErr w:type="spellEnd"/>
+      <w:r>
+        <w:rPr>
+          <w:lang w:val="en-US"/>
+        </w:rPr>
+        <w:t> now takes </w:t>
+      </w:r>
+      <w:proofErr w:type="spellStart"/>
+      <w:r>
+        <w:rPr>
+          <w:lang w:val="en-US"/>
+        </w:rPr>
+        <w:t>rate_limiter</w:t>
+      </w:r>
+      <w:proofErr w:type="spellEnd"/>
+      <w:r>
+        <w:rPr>
+          <w:lang w:val="en-US"/>
+        </w:rPr>
+        <w:t> instead of </w:t>
+      </w:r>
+      <w:proofErr w:type="spellStart"/>
+      <w:r>
+        <w:rPr>
+          <w:lang w:val="en-US"/>
+        </w:rPr>
+        <w:t>sleep_time</w:t>
+      </w:r>
+      <w:proofErr w:type="spellEnd"/>
+      <w:r>
+        <w:rPr>
+          <w:lang w:val="en-US"/>
+        </w:rPr>
+        <w:t>, and calls </w:t>
+      </w:r>
+      <w:proofErr w:type="spellStart"/>
+      <w:r>
+        <w:rPr>
+          <w:lang w:val="en-US"/>
+        </w:rPr>
+        <w:t>rate_</w:t>
+      </w:r>
+      <w:proofErr w:type="gramStart"/>
+      <w:r>
+        <w:rPr>
+          <w:lang w:val="en-US"/>
+        </w:rPr>
+        <w:t>limiter.wait</w:t>
+      </w:r>
+      <w:proofErr w:type="spellEnd"/>
+      <w:proofErr w:type="gramEnd"/>
+      <w:r>
+        <w:rPr>
+          <w:lang w:val="en-US"/>
+        </w:rPr>
+        <w:t>() before each </w:t>
+      </w:r>
+      <w:proofErr w:type="spellStart"/>
+      <w:r>
+        <w:rPr>
+          <w:lang w:val="en-US"/>
+        </w:rPr>
+        <w:t>esearch</w:t>
+      </w:r>
+      <w:proofErr w:type="spellEnd"/>
+      <w:r>
+        <w:rPr>
+          <w:lang w:val="en-US"/>
+        </w:rPr>
+        <w:t>/</w:t>
+      </w:r>
+      <w:proofErr w:type="spellStart"/>
+      <w:r>
+        <w:rPr>
+          <w:lang w:val="en-US"/>
+        </w:rPr>
+        <w:t>efetch</w:t>
+      </w:r>
+      <w:proofErr w:type="spellEnd"/>
+      <w:r>
+        <w:rPr>
+          <w:lang w:val="en-US"/>
+        </w:rPr>
+        <w:t> — properly capping the </w:t>
       </w:r>
       <w:r>
         <w:rPr>
@@ -1477,11 +2124,47 @@
           <w:lang w:val="en-US"/>
         </w:rPr>
       </w:pPr>
-      <w:r>
-        <w:rPr>
-          <w:lang w:val="en-US"/>
-        </w:rPr>
-        <w:t xml:space="preserve">ThreadPoolExecutor replaces the serial species/marker loop — all (species, marker) jobs are submitted concurrently, with as_completed() driving progress </w:t>
+      <w:proofErr w:type="spellStart"/>
+      <w:r>
+        <w:rPr>
+          <w:lang w:val="en-US"/>
+        </w:rPr>
+        <w:t>ThreadPoolExecutor</w:t>
+      </w:r>
+      <w:proofErr w:type="spellEnd"/>
+      <w:r>
+        <w:rPr>
+          <w:lang w:val="en-US"/>
+        </w:rPr>
+        <w:t> replaces the serial species/marker loop — all (species, marker) jobs are submitted concurrently, with </w:t>
+      </w:r>
+      <w:proofErr w:type="spellStart"/>
+      <w:r>
+        <w:rPr>
+          <w:lang w:val="en-US"/>
+        </w:rPr>
+        <w:t>as_</w:t>
+      </w:r>
+      <w:proofErr w:type="gramStart"/>
+      <w:r>
+        <w:rPr>
+          <w:lang w:val="en-US"/>
+        </w:rPr>
+        <w:t>completed</w:t>
+      </w:r>
+      <w:proofErr w:type="spellEnd"/>
+      <w:r>
+        <w:rPr>
+          <w:lang w:val="en-US"/>
+        </w:rPr>
+        <w:t>(</w:t>
+      </w:r>
+      <w:proofErr w:type="gramEnd"/>
+      <w:r>
+        <w:rPr>
+          <w:lang w:val="en-US"/>
+        </w:rPr>
+        <w:t xml:space="preserve">) driving progress </w:t>
       </w:r>
       <w:r>
         <w:rPr>
@@ -1549,8 +2232,13 @@
       </w:r>
     </w:p>
     <w:p>
-      <w:r>
-        <w:t>Main changes</w:t>
+      <w:proofErr w:type="spellStart"/>
+      <w:r>
+        <w:t>Main</w:t>
+      </w:r>
+      <w:proofErr w:type="spellEnd"/>
+      <w:r>
+        <w:t xml:space="preserve"> changes</w:t>
       </w:r>
     </w:p>
     <w:p>
@@ -1567,7 +2255,71 @@
         <w:rPr>
           <w:lang w:val="en-US"/>
         </w:rPr>
-        <w:t>Global RateLimiter class — a lock-protected object shared by all worker threads. Before every single NCBI HTTP call (esearch and each efetch), a thread calls rate_limiter.wait(), which blocks just long enough to keep the </w:t>
+        <w:t>Global </w:t>
+      </w:r>
+      <w:proofErr w:type="spellStart"/>
+      <w:r>
+        <w:rPr>
+          <w:lang w:val="en-US"/>
+        </w:rPr>
+        <w:t>RateLimiter</w:t>
+      </w:r>
+      <w:proofErr w:type="spellEnd"/>
+      <w:r>
+        <w:rPr>
+          <w:lang w:val="en-US"/>
+        </w:rPr>
+        <w:t> class — a lock-protected object shared by all worker threads. Before every single NCBI HTTP call (</w:t>
+      </w:r>
+      <w:proofErr w:type="spellStart"/>
+      <w:r>
+        <w:rPr>
+          <w:lang w:val="en-US"/>
+        </w:rPr>
+        <w:t>esearch</w:t>
+      </w:r>
+      <w:proofErr w:type="spellEnd"/>
+      <w:r>
+        <w:rPr>
+          <w:lang w:val="en-US"/>
+        </w:rPr>
+        <w:t> and each </w:t>
+      </w:r>
+      <w:proofErr w:type="spellStart"/>
+      <w:r>
+        <w:rPr>
+          <w:lang w:val="en-US"/>
+        </w:rPr>
+        <w:t>efetch</w:t>
+      </w:r>
+      <w:proofErr w:type="spellEnd"/>
+      <w:r>
+        <w:rPr>
+          <w:lang w:val="en-US"/>
+        </w:rPr>
+        <w:t>), a thread calls </w:t>
+      </w:r>
+      <w:proofErr w:type="spellStart"/>
+      <w:r>
+        <w:rPr>
+          <w:lang w:val="en-US"/>
+        </w:rPr>
+        <w:t>rate_</w:t>
+      </w:r>
+      <w:proofErr w:type="gramStart"/>
+      <w:r>
+        <w:rPr>
+          <w:lang w:val="en-US"/>
+        </w:rPr>
+        <w:t>limiter.wait</w:t>
+      </w:r>
+      <w:proofErr w:type="spellEnd"/>
+      <w:proofErr w:type="gramEnd"/>
+      <w:r>
+        <w:rPr>
+          <w:lang w:val="en-US"/>
+        </w:rPr>
+        <w:t>(), which blocks just long enough to keep the </w:t>
       </w:r>
       <w:r>
         <w:rPr>
@@ -1581,7 +2333,51 @@
         <w:rPr>
           <w:lang w:val="en-US"/>
         </w:rPr>
-        <w:t> call rate across all threads under the configured interval. This replaced the old time.sleep(sleep_time) that only fired once per species+marker.</w:t>
+        <w:t> call rate across all threads under the configured interval. This replaced the old </w:t>
+      </w:r>
+      <w:proofErr w:type="spellStart"/>
+      <w:proofErr w:type="gramStart"/>
+      <w:r>
+        <w:rPr>
+          <w:lang w:val="en-US"/>
+        </w:rPr>
+        <w:t>time.sleep</w:t>
+      </w:r>
+      <w:proofErr w:type="spellEnd"/>
+      <w:proofErr w:type="gramEnd"/>
+      <w:r>
+        <w:rPr>
+          <w:lang w:val="en-US"/>
+        </w:rPr>
+        <w:t>(</w:t>
+      </w:r>
+      <w:proofErr w:type="spellStart"/>
+      <w:r>
+        <w:rPr>
+          <w:lang w:val="en-US"/>
+        </w:rPr>
+        <w:t>sleep_time</w:t>
+      </w:r>
+      <w:proofErr w:type="spellEnd"/>
+      <w:r>
+        <w:rPr>
+          <w:lang w:val="en-US"/>
+        </w:rPr>
+        <w:t xml:space="preserve">) that only fired once per </w:t>
+      </w:r>
+      <w:proofErr w:type="spellStart"/>
+      <w:r>
+        <w:rPr>
+          <w:lang w:val="en-US"/>
+        </w:rPr>
+        <w:t>species+marker</w:t>
+      </w:r>
+      <w:proofErr w:type="spellEnd"/>
+      <w:r>
+        <w:rPr>
+          <w:lang w:val="en-US"/>
+        </w:rPr>
+        <w:t>.</w:t>
       </w:r>
     </w:p>
     <w:p>
@@ -1594,11 +2390,61 @@
           <w:lang w:val="en-US"/>
         </w:rPr>
       </w:pPr>
-      <w:r>
-        <w:rPr>
-          <w:lang w:val="en-US"/>
-        </w:rPr>
-        <w:t>get_accession rewired to take rate_limiter instead of sleep_time, with wait() calls moved to before each raw request instead of one sleep at the end — this also fixed the earlier burst issue (up to 11 calls firing instantly before any delay).</w:t>
+      <w:proofErr w:type="spellStart"/>
+      <w:r>
+        <w:rPr>
+          <w:lang w:val="en-US"/>
+        </w:rPr>
+        <w:t>get_accession</w:t>
+      </w:r>
+      <w:proofErr w:type="spellEnd"/>
+      <w:r>
+        <w:rPr>
+          <w:lang w:val="en-US"/>
+        </w:rPr>
+        <w:t> rewired to take </w:t>
+      </w:r>
+      <w:proofErr w:type="spellStart"/>
+      <w:r>
+        <w:rPr>
+          <w:lang w:val="en-US"/>
+        </w:rPr>
+        <w:t>rate_limiter</w:t>
+      </w:r>
+      <w:proofErr w:type="spellEnd"/>
+      <w:r>
+        <w:rPr>
+          <w:lang w:val="en-US"/>
+        </w:rPr>
+        <w:t> instead of </w:t>
+      </w:r>
+      <w:proofErr w:type="spellStart"/>
+      <w:r>
+        <w:rPr>
+          <w:lang w:val="en-US"/>
+        </w:rPr>
+        <w:t>sleep_time</w:t>
+      </w:r>
+      <w:proofErr w:type="spellEnd"/>
+      <w:r>
+        <w:rPr>
+          <w:lang w:val="en-US"/>
+        </w:rPr>
+        <w:t>, with </w:t>
+      </w:r>
+      <w:proofErr w:type="gramStart"/>
+      <w:r>
+        <w:rPr>
+          <w:lang w:val="en-US"/>
+        </w:rPr>
+        <w:t>wait(</w:t>
+      </w:r>
+      <w:proofErr w:type="gramEnd"/>
+      <w:r>
+        <w:rPr>
+          <w:lang w:val="en-US"/>
+        </w:rPr>
+        <w:t>) calls moved to before each raw request instead of one sleep at the end — this also fixed the earlier burst issue (up to 11 calls firing instantly before any delay).</w:t>
       </w:r>
     </w:p>
     <w:p>
@@ -1611,11 +2457,47 @@
           <w:lang w:val="en-US"/>
         </w:rPr>
       </w:pPr>
-      <w:r>
-        <w:rPr>
-          <w:lang w:val="en-US"/>
-        </w:rPr>
-        <w:t>ThreadPoolExecutor replacing the serial for species in test["Name"] loop. All (species, marker) jobs get submitted up front; as_completed() drives progress updates as results land, regardless of order.</w:t>
+      <w:proofErr w:type="spellStart"/>
+      <w:r>
+        <w:rPr>
+          <w:lang w:val="en-US"/>
+        </w:rPr>
+        <w:t>ThreadPoolExecutor</w:t>
+      </w:r>
+      <w:proofErr w:type="spellEnd"/>
+      <w:r>
+        <w:rPr>
+          <w:lang w:val="en-US"/>
+        </w:rPr>
+        <w:t> replacing the serial for species in test["Name"] loop. All (species, marker) jobs get submitted up front; </w:t>
+      </w:r>
+      <w:proofErr w:type="spellStart"/>
+      <w:r>
+        <w:rPr>
+          <w:lang w:val="en-US"/>
+        </w:rPr>
+        <w:t>as_</w:t>
+      </w:r>
+      <w:proofErr w:type="gramStart"/>
+      <w:r>
+        <w:rPr>
+          <w:lang w:val="en-US"/>
+        </w:rPr>
+        <w:t>completed</w:t>
+      </w:r>
+      <w:proofErr w:type="spellEnd"/>
+      <w:r>
+        <w:rPr>
+          <w:lang w:val="en-US"/>
+        </w:rPr>
+        <w:t>(</w:t>
+      </w:r>
+      <w:proofErr w:type="gramEnd"/>
+      <w:r>
+        <w:rPr>
+          <w:lang w:val="en-US"/>
+        </w:rPr>
+        <w:t>) drives progress updates as results land, regardless of order.</w:t>
       </w:r>
     </w:p>
     <w:p>
@@ -1632,7 +2514,35 @@
         <w:rPr>
           <w:lang w:val="en-US"/>
         </w:rPr>
-        <w:t>Order-preserving result collection — results_by_marker[marker][row_idx] = result, using a pre-sized list per marker rather than appending, so results always land back in the correct row regardless of which job finished first.</w:t>
+        <w:t>Order-preserving result collection — </w:t>
+      </w:r>
+      <w:proofErr w:type="spellStart"/>
+      <w:r>
+        <w:rPr>
+          <w:lang w:val="en-US"/>
+        </w:rPr>
+        <w:t>results_by_marker</w:t>
+      </w:r>
+      <w:proofErr w:type="spellEnd"/>
+      <w:r>
+        <w:rPr>
+          <w:lang w:val="en-US"/>
+        </w:rPr>
+        <w:t>[marker][</w:t>
+      </w:r>
+      <w:proofErr w:type="spellStart"/>
+      <w:r>
+        <w:rPr>
+          <w:lang w:val="en-US"/>
+        </w:rPr>
+        <w:t>row_idx</w:t>
+      </w:r>
+      <w:proofErr w:type="spellEnd"/>
+      <w:r>
+        <w:rPr>
+          <w:lang w:val="en-US"/>
+        </w:rPr>
+        <w:t>] = result, using a pre-sized list per marker rather than appending, so results always land back in the correct row regardless of which job finished first.</w:t>
       </w:r>
     </w:p>
     <w:p>
@@ -1649,7 +2559,21 @@
         <w:rPr>
           <w:lang w:val="en-US"/>
         </w:rPr>
-        <w:t>New GUI controls — "Min. interval between requests" (now correctly enforced globally, defaulted to 0.1s) and "Concurrent workers" (default 5).</w:t>
+        <w:t xml:space="preserve">New GUI </w:t>
+      </w:r>
+      <w:proofErr w:type="gramStart"/>
+      <w:r>
+        <w:rPr>
+          <w:lang w:val="en-US"/>
+        </w:rPr>
+        <w:t>controls — "</w:t>
+      </w:r>
+      <w:proofErr w:type="gramEnd"/>
+      <w:r>
+        <w:rPr>
+          <w:lang w:val="en-US"/>
+        </w:rPr>
+        <w:t>Min. interval between requests" (now correctly enforced globally, defaulted to 0.1s) and "Concurrent workers" (default 5).</w:t>
       </w:r>
     </w:p>
     <w:p>
@@ -1679,7 +2603,37 @@
         <w:rPr>
           <w:lang w:val="en-US"/>
         </w:rPr>
-        <w:t>Rate limiter that doesn't actually limit anything. The natural first instinct is time.sleep(x) inside each thread — but that only throttles </w:t>
+        <w:t xml:space="preserve">Rate limiter that doesn't </w:t>
+      </w:r>
+      <w:proofErr w:type="gramStart"/>
+      <w:r>
+        <w:rPr>
+          <w:lang w:val="en-US"/>
+        </w:rPr>
+        <w:t>actually limit</w:t>
+      </w:r>
+      <w:proofErr w:type="gramEnd"/>
+      <w:r>
+        <w:rPr>
+          <w:lang w:val="en-US"/>
+        </w:rPr>
+        <w:t xml:space="preserve"> anything. The natural first instinct is </w:t>
+      </w:r>
+      <w:proofErr w:type="spellStart"/>
+      <w:proofErr w:type="gramStart"/>
+      <w:r>
+        <w:rPr>
+          <w:lang w:val="en-US"/>
+        </w:rPr>
+        <w:t>time.sleep</w:t>
+      </w:r>
+      <w:proofErr w:type="spellEnd"/>
+      <w:proofErr w:type="gramEnd"/>
+      <w:r>
+        <w:rPr>
+          <w:lang w:val="en-US"/>
+        </w:rPr>
+        <w:t>(x) inside each thread — but that only throttles </w:t>
       </w:r>
       <w:r>
         <w:rPr>
@@ -1717,7 +2671,49 @@
         <w:rPr>
           <w:lang w:val="en-US"/>
         </w:rPr>
-        <w:t>Result misalignment. ThreadPoolExecutor + as_completed() returns results in </w:t>
+        <w:t>Result misalignment. </w:t>
+      </w:r>
+      <w:proofErr w:type="spellStart"/>
+      <w:r>
+        <w:rPr>
+          <w:lang w:val="en-US"/>
+        </w:rPr>
+        <w:t>ThreadPoolExecutor</w:t>
+      </w:r>
+      <w:proofErr w:type="spellEnd"/>
+      <w:r>
+        <w:rPr>
+          <w:lang w:val="en-US"/>
+        </w:rPr>
+        <w:t> + </w:t>
+      </w:r>
+      <w:proofErr w:type="spellStart"/>
+      <w:r>
+        <w:rPr>
+          <w:lang w:val="en-US"/>
+        </w:rPr>
+        <w:t>as_</w:t>
+      </w:r>
+      <w:proofErr w:type="gramStart"/>
+      <w:r>
+        <w:rPr>
+          <w:lang w:val="en-US"/>
+        </w:rPr>
+        <w:t>completed</w:t>
+      </w:r>
+      <w:proofErr w:type="spellEnd"/>
+      <w:r>
+        <w:rPr>
+          <w:lang w:val="en-US"/>
+        </w:rPr>
+        <w:t>(</w:t>
+      </w:r>
+      <w:proofErr w:type="gramEnd"/>
+      <w:r>
+        <w:rPr>
+          <w:lang w:val="en-US"/>
+        </w:rPr>
+        <w:t>) returns results in </w:t>
       </w:r>
       <w:r>
         <w:rPr>
@@ -1731,7 +2727,49 @@
         <w:rPr>
           <w:lang w:val="en-US"/>
         </w:rPr>
-        <w:t> order, not submission order. If you just .append()ed results to a list like the original serial code did, rows would silently end up matched to the wrong species once merged into the DataFrame — a bug that wouldn't necessarily be obvious until you spot-checked the output against the input CSV.</w:t>
+        <w:t xml:space="preserve"> order, not submission order. If </w:t>
+      </w:r>
+      <w:proofErr w:type="gramStart"/>
+      <w:r>
+        <w:rPr>
+          <w:lang w:val="en-US"/>
+        </w:rPr>
+        <w:t>you</w:t>
+      </w:r>
+      <w:proofErr w:type="gramEnd"/>
+      <w:r>
+        <w:rPr>
+          <w:lang w:val="en-US"/>
+        </w:rPr>
+        <w:t xml:space="preserve"> </w:t>
+      </w:r>
+      <w:proofErr w:type="gramStart"/>
+      <w:r>
+        <w:rPr>
+          <w:lang w:val="en-US"/>
+        </w:rPr>
+        <w:t>just .append()ed</w:t>
+      </w:r>
+      <w:proofErr w:type="gramEnd"/>
+      <w:r>
+        <w:rPr>
+          <w:lang w:val="en-US"/>
+        </w:rPr>
+        <w:t xml:space="preserve"> results to a list like the original serial code did, rows would silently end up matched to the wrong species once merged into the </w:t>
+      </w:r>
+      <w:proofErr w:type="spellStart"/>
+      <w:r>
+        <w:rPr>
+          <w:lang w:val="en-US"/>
+        </w:rPr>
+        <w:t>DataFrame</w:t>
+      </w:r>
+      <w:proofErr w:type="spellEnd"/>
+      <w:r>
+        <w:rPr>
+          <w:lang w:val="en-US"/>
+        </w:rPr>
+        <w:t xml:space="preserve"> — a bug that wouldn't necessarily be obvious until you spot-checked the output against the input CSV.</w:t>
       </w:r>
     </w:p>
     <w:p>
@@ -1748,7 +2786,79 @@
         <w:rPr>
           <w:lang w:val="en-US"/>
         </w:rPr>
-        <w:t>Updating Tkinter widgets from worker threads. Tkinter isn't thread-safe — calling .configure() on a label directly from a background thread can crash or corrupt the UI. It's easy to forget this once you're inside ThreadPoolExecutor workers and just update the progress label directly instead of routing everything through app.after().</w:t>
+        <w:t xml:space="preserve">Updating </w:t>
+      </w:r>
+      <w:proofErr w:type="spellStart"/>
+      <w:r>
+        <w:rPr>
+          <w:lang w:val="en-US"/>
+        </w:rPr>
+        <w:t>Tkinter</w:t>
+      </w:r>
+      <w:proofErr w:type="spellEnd"/>
+      <w:r>
+        <w:rPr>
+          <w:lang w:val="en-US"/>
+        </w:rPr>
+        <w:t xml:space="preserve"> widgets from worker threads. </w:t>
+      </w:r>
+      <w:proofErr w:type="spellStart"/>
+      <w:r>
+        <w:rPr>
+          <w:lang w:val="en-US"/>
+        </w:rPr>
+        <w:t>Tkinter</w:t>
+      </w:r>
+      <w:proofErr w:type="spellEnd"/>
+      <w:r>
+        <w:rPr>
+          <w:lang w:val="en-US"/>
+        </w:rPr>
+        <w:t xml:space="preserve"> isn't thread-safe — </w:t>
+      </w:r>
+      <w:proofErr w:type="gramStart"/>
+      <w:r>
+        <w:rPr>
+          <w:lang w:val="en-US"/>
+        </w:rPr>
+        <w:t>calling .configure</w:t>
+      </w:r>
+      <w:proofErr w:type="gramEnd"/>
+      <w:r>
+        <w:rPr>
+          <w:lang w:val="en-US"/>
+        </w:rPr>
+        <w:t>() on a label directly from a background thread can crash or corrupt the UI. It's easy to forget this once you're inside </w:t>
+      </w:r>
+      <w:proofErr w:type="spellStart"/>
+      <w:r>
+        <w:rPr>
+          <w:lang w:val="en-US"/>
+        </w:rPr>
+        <w:t>ThreadPoolExecutor</w:t>
+      </w:r>
+      <w:proofErr w:type="spellEnd"/>
+      <w:r>
+        <w:rPr>
+          <w:lang w:val="en-US"/>
+        </w:rPr>
+        <w:t> workers and just update the progress label directly instead of routing everything through </w:t>
+      </w:r>
+      <w:proofErr w:type="spellStart"/>
+      <w:proofErr w:type="gramStart"/>
+      <w:r>
+        <w:rPr>
+          <w:lang w:val="en-US"/>
+        </w:rPr>
+        <w:t>app.after</w:t>
+      </w:r>
+      <w:proofErr w:type="spellEnd"/>
+      <w:proofErr w:type="gramEnd"/>
+      <w:r>
+        <w:rPr>
+          <w:lang w:val="en-US"/>
+        </w:rPr>
+        <w:t>().</w:t>
       </w:r>
     </w:p>
     <w:p>
@@ -1765,7 +2875,35 @@
         <w:rPr>
           <w:lang w:val="en-US"/>
         </w:rPr>
-        <w:t>Swallowed exceptions. Exceptions raised inside a worker function don't propagate until you call .result() on its future. Forgetting that (or not wrapping it in try/except) means a single bad record could either silently vanish from the output or crash the whole as_completed loop unexpectedly.</w:t>
+        <w:t xml:space="preserve">Swallowed exceptions. Exceptions raised inside a worker function don't propagate until you </w:t>
+      </w:r>
+      <w:proofErr w:type="gramStart"/>
+      <w:r>
+        <w:rPr>
+          <w:lang w:val="en-US"/>
+        </w:rPr>
+        <w:t>call .result</w:t>
+      </w:r>
+      <w:proofErr w:type="gramEnd"/>
+      <w:r>
+        <w:rPr>
+          <w:lang w:val="en-US"/>
+        </w:rPr>
+        <w:t>() on its future. Forgetting that (or not wrapping it in try/except) means a single bad record could either silently vanish from the output or crash the whole </w:t>
+      </w:r>
+      <w:proofErr w:type="spellStart"/>
+      <w:r>
+        <w:rPr>
+          <w:lang w:val="en-US"/>
+        </w:rPr>
+        <w:t>as_completed</w:t>
+      </w:r>
+      <w:proofErr w:type="spellEnd"/>
+      <w:r>
+        <w:rPr>
+          <w:lang w:val="en-US"/>
+        </w:rPr>
+        <w:t> loop unexpectedly.</w:t>
       </w:r>
     </w:p>
     <w:p>
@@ -1782,7 +2920,21 @@
         <w:rPr>
           <w:lang w:val="en-US"/>
         </w:rPr>
-        <w:t>More workers ≠ more speed once a shared rate limiter exists. Because every thread funnels through the same RateLimiter, cranking up "Concurrent workers" past a certain point just means more threads queued up waiting on the same lock — the real ceiling stays NCBI's rate cap, not thread count.</w:t>
+        <w:t>More workers ≠ more speed once a shared rate limiter exists. Because every thread funnels through the same </w:t>
+      </w:r>
+      <w:proofErr w:type="spellStart"/>
+      <w:r>
+        <w:rPr>
+          <w:lang w:val="en-US"/>
+        </w:rPr>
+        <w:t>RateLimiter</w:t>
+      </w:r>
+      <w:proofErr w:type="spellEnd"/>
+      <w:r>
+        <w:rPr>
+          <w:lang w:val="en-US"/>
+        </w:rPr>
+        <w:t>, cranking up "Concurrent workers" past a certain point just means more threads queued up waiting on the same lock — the real ceiling stays NCBI's rate cap, not thread count.</w:t>
       </w:r>
     </w:p>
     <w:p>
@@ -1824,10 +2976,26 @@
     </w:p>
     <w:p>
       <w:r>
-        <w:t>Moet er voor zorgen dat d</w:t>
-      </w:r>
-      <w:r>
-        <w:t>e Name column nog word toegevoegd.</w:t>
+        <w:t xml:space="preserve">Moet </w:t>
+      </w:r>
+      <w:proofErr w:type="gramStart"/>
+      <w:r>
+        <w:t>er voor</w:t>
+      </w:r>
+      <w:proofErr w:type="gramEnd"/>
+      <w:r>
+        <w:t xml:space="preserve"> zorgen dat d</w:t>
+      </w:r>
+      <w:r>
+        <w:t xml:space="preserve">e Name column nog </w:t>
+      </w:r>
+      <w:proofErr w:type="gramStart"/>
+      <w:r>
+        <w:t>word</w:t>
+      </w:r>
+      <w:proofErr w:type="gramEnd"/>
+      <w:r>
+        <w:t xml:space="preserve"> toegevoegd.</w:t>
       </w:r>
     </w:p>
     <w:p>
@@ -1842,19 +3010,56 @@
         </w:rPr>
         <w:tab/>
       </w:r>
-      <w:r>
-        <w:rPr>
-          <w:lang w:val="en-US"/>
-        </w:rPr>
-        <w:t>df_accessions = df.filter(markers, axis=1)</w:t>
+      <w:proofErr w:type="spellStart"/>
+      <w:r>
+        <w:rPr>
+          <w:lang w:val="en-US"/>
+        </w:rPr>
+        <w:t>df_accessions</w:t>
+      </w:r>
+      <w:proofErr w:type="spellEnd"/>
+      <w:r>
+        <w:rPr>
+          <w:lang w:val="en-US"/>
+        </w:rPr>
+        <w:t xml:space="preserve"> = </w:t>
+      </w:r>
+      <w:proofErr w:type="spellStart"/>
+      <w:proofErr w:type="gramStart"/>
+      <w:r>
+        <w:rPr>
+          <w:lang w:val="en-US"/>
+        </w:rPr>
+        <w:t>df.filter</w:t>
+      </w:r>
+      <w:proofErr w:type="spellEnd"/>
+      <w:proofErr w:type="gramEnd"/>
+      <w:r>
+        <w:rPr>
+          <w:lang w:val="en-US"/>
+        </w:rPr>
+        <w:t>(markers, axis=1)</w:t>
       </w:r>
     </w:p>
     <w:p>
       <w:pPr>
         <w:ind w:firstLine="708"/>
       </w:pPr>
-      <w:r>
-        <w:t>print(df_accessions)</w:t>
+      <w:proofErr w:type="gramStart"/>
+      <w:r>
+        <w:t>print</w:t>
+      </w:r>
+      <w:proofErr w:type="gramEnd"/>
+      <w:r>
+        <w:t>(</w:t>
+      </w:r>
+      <w:proofErr w:type="spellStart"/>
+      <w:r>
+        <w:t>df_accessions</w:t>
+      </w:r>
+      <w:proofErr w:type="spellEnd"/>
+      <w:r>
+        <w:t>)</w:t>
       </w:r>
     </w:p>
     <w:p>
@@ -1876,6 +3081,8 @@
           <w14:ligatures w14:val="none"/>
         </w:rPr>
       </w:pPr>
+      <w:proofErr w:type="spellStart"/>
+      <w:proofErr w:type="gramStart"/>
       <w:r>
         <w:rPr>
           <w:rFonts w:ascii="Consolas" w:eastAsia="Times New Roman" w:hAnsi="Consolas" w:cs="Times New Roman"/>
@@ -1912,6 +3119,8 @@
         </w:rPr>
         <w:t>insert</w:t>
       </w:r>
+      <w:proofErr w:type="spellEnd"/>
+      <w:proofErr w:type="gramEnd"/>
       <w:r>
         <w:rPr>
           <w:rFonts w:ascii="Consolas" w:eastAsia="Times New Roman" w:hAnsi="Consolas" w:cs="Times New Roman"/>
@@ -1992,6 +3201,7 @@
           <w14:ligatures w14:val="none"/>
         </w:rPr>
       </w:pPr>
+      <w:proofErr w:type="spellStart"/>
       <w:r>
         <w:rPr>
           <w:rFonts w:ascii="Consolas" w:eastAsia="Times New Roman" w:hAnsi="Consolas" w:cs="Times New Roman"/>
@@ -2004,6 +3214,7 @@
         </w:rPr>
         <w:t>df_accessions</w:t>
       </w:r>
+      <w:proofErr w:type="spellEnd"/>
       <w:r>
         <w:rPr>
           <w:rFonts w:ascii="Consolas" w:eastAsia="Times New Roman" w:hAnsi="Consolas" w:cs="Times New Roman"/>
@@ -2040,6 +3251,8 @@
         </w:rPr>
         <w:t xml:space="preserve"> </w:t>
       </w:r>
+      <w:proofErr w:type="spellStart"/>
+      <w:proofErr w:type="gramStart"/>
       <w:r>
         <w:rPr>
           <w:rFonts w:ascii="Consolas" w:eastAsia="Times New Roman" w:hAnsi="Consolas" w:cs="Times New Roman"/>
@@ -2076,6 +3289,8 @@
         </w:rPr>
         <w:t>filter</w:t>
       </w:r>
+      <w:proofErr w:type="spellEnd"/>
+      <w:proofErr w:type="gramEnd"/>
       <w:r>
         <w:rPr>
           <w:rFonts w:ascii="Consolas" w:eastAsia="Times New Roman" w:hAnsi="Consolas" w:cs="Times New Roman"/>
@@ -2180,6 +3395,7 @@
           <w14:ligatures w14:val="none"/>
         </w:rPr>
       </w:pPr>
+      <w:proofErr w:type="gramStart"/>
       <w:r>
         <w:rPr>
           <w:rFonts w:ascii="Consolas" w:eastAsia="Times New Roman" w:hAnsi="Consolas" w:cs="Times New Roman"/>
@@ -2192,6 +3408,7 @@
         </w:rPr>
         <w:t>print</w:t>
       </w:r>
+      <w:proofErr w:type="gramEnd"/>
       <w:r>
         <w:rPr>
           <w:rFonts w:ascii="Consolas" w:eastAsia="Times New Roman" w:hAnsi="Consolas" w:cs="Times New Roman"/>
@@ -2204,6 +3421,7 @@
         </w:rPr>
         <w:t>(</w:t>
       </w:r>
+      <w:proofErr w:type="spellStart"/>
       <w:r>
         <w:rPr>
           <w:rFonts w:ascii="Consolas" w:eastAsia="Times New Roman" w:hAnsi="Consolas" w:cs="Times New Roman"/>
@@ -2216,6 +3434,7 @@
         </w:rPr>
         <w:t>df_accessions</w:t>
       </w:r>
+      <w:proofErr w:type="spellEnd"/>
       <w:r>
         <w:rPr>
           <w:rFonts w:ascii="Consolas" w:eastAsia="Times New Roman" w:hAnsi="Consolas" w:cs="Times New Roman"/>
@@ -2231,16 +3450,31 @@
     </w:p>
     <w:p/>
     <w:p>
-      <w:r>
-        <w:t>hier werd de markers lijst ook aan gepast</w:t>
+      <w:proofErr w:type="gramStart"/>
+      <w:r>
+        <w:t>hier</w:t>
+      </w:r>
+      <w:proofErr w:type="gramEnd"/>
+      <w:r>
+        <w:t xml:space="preserve"> werd de markers lijst ook aan gepast</w:t>
       </w:r>
     </w:p>
     <w:p>
       <w:pPr>
         <w:ind w:left="360"/>
       </w:pPr>
-      <w:r>
-        <w:t>name_and_markers = markers</w:t>
+      <w:proofErr w:type="spellStart"/>
+      <w:proofErr w:type="gramStart"/>
+      <w:r>
+        <w:t>name</w:t>
+      </w:r>
+      <w:proofErr w:type="gramEnd"/>
+      <w:r>
+        <w:t>_and_markers</w:t>
+      </w:r>
+      <w:proofErr w:type="spellEnd"/>
+      <w:r>
+        <w:t xml:space="preserve"> = markers</w:t>
       </w:r>
     </w:p>
     <w:p>
@@ -2250,20 +3484,41 @@
           <w:lang w:val="en-US"/>
         </w:rPr>
       </w:pPr>
-      <w:r>
-        <w:rPr>
-          <w:lang w:val="en-US"/>
-        </w:rPr>
-        <w:t>name_and_markers.insert(0, 'Name')</w:t>
+      <w:proofErr w:type="spellStart"/>
+      <w:r>
+        <w:rPr>
+          <w:lang w:val="en-US"/>
+        </w:rPr>
+        <w:t>name_and_</w:t>
+      </w:r>
+      <w:proofErr w:type="gramStart"/>
+      <w:r>
+        <w:rPr>
+          <w:lang w:val="en-US"/>
+        </w:rPr>
+        <w:t>markers.insert</w:t>
+      </w:r>
+      <w:proofErr w:type="spellEnd"/>
+      <w:proofErr w:type="gramEnd"/>
+      <w:r>
+        <w:rPr>
+          <w:lang w:val="en-US"/>
+        </w:rPr>
+        <w:t>(0, 'Name')</w:t>
       </w:r>
     </w:p>
     <w:p>
       <w:pPr>
         <w:ind w:left="360"/>
       </w:pPr>
+      <w:proofErr w:type="gramStart"/>
       <w:r>
         <w:lastRenderedPageBreak/>
-        <w:t>eerst een copy maken v</w:t>
+        <w:t>eerst</w:t>
+      </w:r>
+      <w:proofErr w:type="gramEnd"/>
+      <w:r>
+        <w:t xml:space="preserve"> een copy maken v</w:t>
       </w:r>
       <w:r>
         <w:t>an de lijst lost het probleem op</w:t>
@@ -2276,11 +3531,35 @@
           <w:lang w:val="en-US"/>
         </w:rPr>
       </w:pPr>
-      <w:r>
-        <w:rPr>
-          <w:lang w:val="en-US"/>
-        </w:rPr>
-        <w:t>name_and_markers = markers.copy()</w:t>
+      <w:proofErr w:type="spellStart"/>
+      <w:r>
+        <w:rPr>
+          <w:lang w:val="en-US"/>
+        </w:rPr>
+        <w:t>name_and_markers</w:t>
+      </w:r>
+      <w:proofErr w:type="spellEnd"/>
+      <w:r>
+        <w:rPr>
+          <w:lang w:val="en-US"/>
+        </w:rPr>
+        <w:t xml:space="preserve"> = </w:t>
+      </w:r>
+      <w:proofErr w:type="spellStart"/>
+      <w:proofErr w:type="gramStart"/>
+      <w:r>
+        <w:rPr>
+          <w:lang w:val="en-US"/>
+        </w:rPr>
+        <w:t>markers.copy</w:t>
+      </w:r>
+      <w:proofErr w:type="spellEnd"/>
+      <w:proofErr w:type="gramEnd"/>
+      <w:r>
+        <w:rPr>
+          <w:lang w:val="en-US"/>
+        </w:rPr>
+        <w:t>()</w:t>
       </w:r>
     </w:p>
     <w:p>
@@ -2290,11 +3569,27 @@
           <w:lang w:val="en-US"/>
         </w:rPr>
       </w:pPr>
-      <w:r>
-        <w:rPr>
-          <w:lang w:val="en-US"/>
-        </w:rPr>
-        <w:t>name_and_markers.insert(0, 'Name')</w:t>
+      <w:proofErr w:type="spellStart"/>
+      <w:r>
+        <w:rPr>
+          <w:lang w:val="en-US"/>
+        </w:rPr>
+        <w:t>name_and_</w:t>
+      </w:r>
+      <w:proofErr w:type="gramStart"/>
+      <w:r>
+        <w:rPr>
+          <w:lang w:val="en-US"/>
+        </w:rPr>
+        <w:t>markers.insert</w:t>
+      </w:r>
+      <w:proofErr w:type="spellEnd"/>
+      <w:proofErr w:type="gramEnd"/>
+      <w:r>
+        <w:rPr>
+          <w:lang w:val="en-US"/>
+        </w:rPr>
+        <w:t>(0, 'Name')</w:t>
       </w:r>
     </w:p>
     <w:p>
@@ -2335,7 +3630,23 @@
         <w:rPr>
           <w:lang w:val="en-US"/>
         </w:rPr>
-        <w:t>if pd.notna(row[marker]):</w:t>
+        <w:t xml:space="preserve">if </w:t>
+      </w:r>
+      <w:proofErr w:type="spellStart"/>
+      <w:proofErr w:type="gramStart"/>
+      <w:r>
+        <w:rPr>
+          <w:lang w:val="en-US"/>
+        </w:rPr>
+        <w:t>pd.notna</w:t>
+      </w:r>
+      <w:proofErr w:type="spellEnd"/>
+      <w:proofErr w:type="gramEnd"/>
+      <w:r>
+        <w:rPr>
+          <w:lang w:val="en-US"/>
+        </w:rPr>
+        <w:t>(row[marker]):</w:t>
       </w:r>
     </w:p>
     <w:p>
@@ -2360,8 +3671,21 @@
         </w:rPr>
         <w:t xml:space="preserve">   </w:t>
       </w:r>
-      <w:r>
-        <w:t>print(row[marker])</w:t>
+      <w:proofErr w:type="gramStart"/>
+      <w:r>
+        <w:t>print</w:t>
+      </w:r>
+      <w:proofErr w:type="gramEnd"/>
+      <w:r>
+        <w:t>(</w:t>
+      </w:r>
+      <w:proofErr w:type="spellStart"/>
+      <w:r>
+        <w:t>row</w:t>
+      </w:r>
+      <w:proofErr w:type="spellEnd"/>
+      <w:r>
+        <w:t>[marker])</w:t>
       </w:r>
     </w:p>
     <w:p>
@@ -2376,22 +3700,71 @@
           <w:lang w:val="en-US"/>
         </w:rPr>
       </w:pPr>
-      <w:r>
-        <w:rPr>
-          <w:lang w:val="en-US"/>
-        </w:rPr>
-        <w:t>df_fasta.loc[len(df_fasta)] = temp</w:t>
+      <w:proofErr w:type="spellStart"/>
+      <w:r>
+        <w:rPr>
+          <w:lang w:val="en-US"/>
+        </w:rPr>
+        <w:t>df_fasta.loc</w:t>
+      </w:r>
+      <w:proofErr w:type="spellEnd"/>
+      <w:r>
+        <w:rPr>
+          <w:lang w:val="en-US"/>
+        </w:rPr>
+        <w:t>[</w:t>
+      </w:r>
+      <w:proofErr w:type="spellStart"/>
+      <w:r>
+        <w:rPr>
+          <w:lang w:val="en-US"/>
+        </w:rPr>
+        <w:t>len</w:t>
+      </w:r>
+      <w:proofErr w:type="spellEnd"/>
+      <w:r>
+        <w:rPr>
+          <w:lang w:val="en-US"/>
+        </w:rPr>
+        <w:t>(</w:t>
+      </w:r>
+      <w:proofErr w:type="spellStart"/>
+      <w:r>
+        <w:rPr>
+          <w:lang w:val="en-US"/>
+        </w:rPr>
+        <w:t>df_fasta</w:t>
+      </w:r>
+      <w:proofErr w:type="spellEnd"/>
+      <w:r>
+        <w:rPr>
+          <w:lang w:val="en-US"/>
+        </w:rPr>
+        <w:t>)] = temp</w:t>
       </w:r>
     </w:p>
     <w:p>
       <w:pPr>
         <w:ind w:left="360"/>
       </w:pPr>
-      <w:r>
-        <w:t>heeft een frame van d</w:t>
-      </w:r>
-      <w:r>
-        <w:t>f nodig</w:t>
+      <w:proofErr w:type="gramStart"/>
+      <w:r>
+        <w:t>heeft</w:t>
+      </w:r>
+      <w:proofErr w:type="gramEnd"/>
+      <w:r>
+        <w:t xml:space="preserve"> een frame van </w:t>
+      </w:r>
+      <w:proofErr w:type="spellStart"/>
+      <w:r>
+        <w:t>d</w:t>
+      </w:r>
+      <w:r>
+        <w:t>f</w:t>
+      </w:r>
+      <w:proofErr w:type="spellEnd"/>
+      <w:r>
+        <w:t xml:space="preserve"> nodig</w:t>
       </w:r>
     </w:p>
     <w:p>
@@ -2404,11 +3777,32 @@
         <w:ind w:left="360"/>
       </w:pPr>
       <w:r>
-        <w:t>“” moest aan de lijst toegevoegd worden indien NAN</w:t>
-      </w:r>
-      <w:r>
-        <w:t xml:space="preserve"> voor accesion num</w:t>
-      </w:r>
+        <w:t xml:space="preserve">“” moest aan de lijst toegevoegd worden </w:t>
+      </w:r>
+      <w:proofErr w:type="gramStart"/>
+      <w:r>
+        <w:t>indien</w:t>
+      </w:r>
+      <w:proofErr w:type="gramEnd"/>
+      <w:r>
+        <w:t xml:space="preserve"> NAN</w:t>
+      </w:r>
+      <w:r>
+        <w:t xml:space="preserve"> voor </w:t>
+      </w:r>
+      <w:proofErr w:type="spellStart"/>
+      <w:r>
+        <w:t>accesion</w:t>
+      </w:r>
+      <w:proofErr w:type="spellEnd"/>
+      <w:r>
+        <w:t xml:space="preserve"> </w:t>
+      </w:r>
+      <w:proofErr w:type="spellStart"/>
+      <w:r>
+        <w:t>num</w:t>
+      </w:r>
+      <w:proofErr w:type="spellEnd"/>
     </w:p>
     <w:p>
       <w:pPr>
@@ -2421,13 +3815,155 @@
         <w:rPr>
           <w:lang w:val="en-US"/>
         </w:rPr>
-        <w:t>Output in file is a</w:t>
-      </w:r>
-      <w:r>
-        <w:rPr>
-          <w:lang w:val="en-US"/>
-        </w:rPr>
-        <w:t>llemaal in 1 colom</w:t>
+        <w:t xml:space="preserve">Output in file is </w:t>
+      </w:r>
+      <w:proofErr w:type="spellStart"/>
+      <w:r>
+        <w:rPr>
+          <w:lang w:val="en-US"/>
+        </w:rPr>
+        <w:t>a</w:t>
+      </w:r>
+      <w:r>
+        <w:rPr>
+          <w:lang w:val="en-US"/>
+        </w:rPr>
+        <w:t>llemaal</w:t>
+      </w:r>
+      <w:proofErr w:type="spellEnd"/>
+      <w:r>
+        <w:rPr>
+          <w:lang w:val="en-US"/>
+        </w:rPr>
+        <w:t xml:space="preserve"> in 1 </w:t>
+      </w:r>
+      <w:proofErr w:type="spellStart"/>
+      <w:r>
+        <w:rPr>
+          <w:lang w:val="en-US"/>
+        </w:rPr>
+        <w:t>colom</w:t>
+      </w:r>
+      <w:proofErr w:type="spellEnd"/>
+    </w:p>
+    <w:p>
+      <w:pPr>
+        <w:ind w:left="360"/>
+        <w:rPr>
+          <w:lang w:val="en-US"/>
+        </w:rPr>
+      </w:pPr>
+      <w:r>
+        <w:rPr>
+          <w:lang w:val="en-US"/>
+        </w:rPr>
+        <w:t xml:space="preserve">Fixed. The old code flattened Name, marker names, and </w:t>
+      </w:r>
+      <w:proofErr w:type="spellStart"/>
+      <w:r>
+        <w:rPr>
+          <w:lang w:val="en-US"/>
+        </w:rPr>
+        <w:t>fasta</w:t>
+      </w:r>
+      <w:proofErr w:type="spellEnd"/>
+      <w:r>
+        <w:rPr>
+          <w:lang w:val="en-US"/>
+        </w:rPr>
+        <w:t xml:space="preserve"> text into one list per row, then stacked them all into a single column. Now each row is built as a </w:t>
+      </w:r>
+      <w:proofErr w:type="spellStart"/>
+      <w:proofErr w:type="gramStart"/>
+      <w:r>
+        <w:rPr>
+          <w:lang w:val="en-US"/>
+        </w:rPr>
+        <w:t>dict</w:t>
+      </w:r>
+      <w:proofErr w:type="spellEnd"/>
+      <w:r>
+        <w:rPr>
+          <w:lang w:val="en-US"/>
+        </w:rPr>
+        <w:t xml:space="preserve"> ({</w:t>
+      </w:r>
+      <w:proofErr w:type="gramEnd"/>
+      <w:r>
+        <w:rPr>
+          <w:lang w:val="en-US"/>
+        </w:rPr>
+        <w:t xml:space="preserve">'Name': ..., marker1: fasta1, marker2: fasta2, </w:t>
+      </w:r>
+      <w:proofErr w:type="gramStart"/>
+      <w:r>
+        <w:rPr>
+          <w:lang w:val="en-US"/>
+        </w:rPr>
+        <w:t>...})</w:t>
+      </w:r>
+      <w:proofErr w:type="gramEnd"/>
+      <w:r>
+        <w:rPr>
+          <w:lang w:val="en-US"/>
+        </w:rPr>
+        <w:t xml:space="preserve">, and </w:t>
+      </w:r>
+      <w:proofErr w:type="spellStart"/>
+      <w:r>
+        <w:rPr>
+          <w:lang w:val="en-US"/>
+        </w:rPr>
+        <w:t>df_fasta</w:t>
+      </w:r>
+      <w:proofErr w:type="spellEnd"/>
+      <w:r>
+        <w:rPr>
+          <w:lang w:val="en-US"/>
+        </w:rPr>
+        <w:t xml:space="preserve"> is created with columns=</w:t>
+      </w:r>
+      <w:proofErr w:type="spellStart"/>
+      <w:r>
+        <w:rPr>
+          <w:lang w:val="en-US"/>
+        </w:rPr>
+        <w:t>name_and_markers</w:t>
+      </w:r>
+      <w:proofErr w:type="spellEnd"/>
+      <w:r>
+        <w:rPr>
+          <w:lang w:val="en-US"/>
+        </w:rPr>
+        <w:t xml:space="preserve"> so you get one column per marker (holding its </w:t>
+      </w:r>
+      <w:proofErr w:type="spellStart"/>
+      <w:r>
+        <w:rPr>
+          <w:lang w:val="en-US"/>
+        </w:rPr>
+        <w:t>fasta</w:t>
+      </w:r>
+      <w:proofErr w:type="spellEnd"/>
+      <w:r>
+        <w:rPr>
+          <w:lang w:val="en-US"/>
+        </w:rPr>
+        <w:t xml:space="preserve"> sequence) plus a Name column, matching your original </w:t>
+      </w:r>
+      <w:proofErr w:type="spellStart"/>
+      <w:r>
+        <w:rPr>
+          <w:lang w:val="en-US"/>
+        </w:rPr>
+        <w:t>df_accessions</w:t>
+      </w:r>
+      <w:proofErr w:type="spellEnd"/>
+      <w:r>
+        <w:rPr>
+          <w:lang w:val="en-US"/>
+        </w:rPr>
+        <w:t xml:space="preserve"> layout.</w:t>
       </w:r>
     </w:p>
     <w:p>

</xml_diff>